<commit_message>
Decks: add section 00 (ns-3/VMware setup, first 4-node experiment) at start, related-mechanisms and references slides; add refs 10-15 to report and workbook
Co-Authored-By: Claude Opus 5.5 <noreply@anthropic.com>
Claude-Session: https://claude.ai/code/session_019rZdtfEbJpAbmcB9G79J6K
</commit_message>
<xml_diff>
--- a/thesis-final/SOTA_Report_v8-Chain.docx
+++ b/thesis-final/SOTA_Report_v8-Chain.docx
@@ -1597,6 +1597,405 @@
                 <w:sz w:val="16"/>
                 <w:szCs w:val="16"/>
               </w:rPr>
+              <w:t xml:space="preserve">FTEC (2019) [10]</w:t>
+            </w:r>
+          </w:p>
+        </w:tc>
+        <w:tc>
+          <w:tcPr>
+            <w:tcW w:type="dxa" w:w="2900"/>
+            <w:tcBorders>
+              <w:top w:val="single" w:color="D0CFC6" w:sz="4"/>
+              <w:left w:val="single" w:color="D0CFC6" w:sz="4"/>
+              <w:bottom w:val="single" w:color="D0CFC6" w:sz="4"/>
+              <w:right w:val="single" w:color="D0CFC6" w:sz="4"/>
+            </w:tcBorders>
+            <w:shd w:fill="EDEDE5" w:color="auto" w:val="clear"/>
+            <w:tcMar>
+              <w:top w:type="dxa" w:w="50"/>
+              <w:left w:type="dxa" w:w="90"/>
+              <w:bottom w:type="dxa" w:w="50"/>
+              <w:right w:type="dxa" w:w="90"/>
+            </w:tcMar>
+          </w:tcPr>
+          <w:p>
+            <w:pPr>
+              <w:jc w:val="left"/>
+            </w:pPr>
+            <w:r>
+              <w:rPr>
+                <w:rFonts w:ascii="Arial" w:cs="Arial" w:eastAsia="Arial" w:hAnsi="Arial"/>
+                <w:color w:val="323232"/>
+                <w:sz w:val="16"/>
+                <w:szCs w:val="16"/>
+              </w:rPr>
+              <w:t xml:space="preserve">HEED-based clustering with a backup CH for fault tolerance</w:t>
+            </w:r>
+          </w:p>
+        </w:tc>
+        <w:tc>
+          <w:tcPr>
+            <w:tcW w:type="dxa" w:w="1900"/>
+            <w:tcBorders>
+              <w:top w:val="single" w:color="D0CFC6" w:sz="4"/>
+              <w:left w:val="single" w:color="D0CFC6" w:sz="4"/>
+              <w:bottom w:val="single" w:color="D0CFC6" w:sz="4"/>
+              <w:right w:val="single" w:color="D0CFC6" w:sz="4"/>
+            </w:tcBorders>
+            <w:shd w:fill="EDEDE5" w:color="auto" w:val="clear"/>
+            <w:tcMar>
+              <w:top w:type="dxa" w:w="50"/>
+              <w:left w:type="dxa" w:w="90"/>
+              <w:bottom w:type="dxa" w:w="50"/>
+              <w:right w:type="dxa" w:w="90"/>
+            </w:tcMar>
+          </w:tcPr>
+          <w:p>
+            <w:pPr>
+              <w:jc w:val="left"/>
+            </w:pPr>
+            <w:r>
+              <w:rPr>
+                <w:rFonts w:ascii="Arial" w:cs="Arial" w:eastAsia="Arial" w:hAnsi="Arial"/>
+                <w:color w:val="323232"/>
+                <w:sz w:val="16"/>
+                <w:szCs w:val="16"/>
+              </w:rPr>
+              <w:t xml:space="preserve">CH failure is tolerated</w:t>
+            </w:r>
+          </w:p>
+        </w:tc>
+        <w:tc>
+          <w:tcPr>
+            <w:tcW w:type="dxa" w:w="2938"/>
+            <w:tcBorders>
+              <w:top w:val="single" w:color="D0CFC6" w:sz="4"/>
+              <w:left w:val="single" w:color="D0CFC6" w:sz="4"/>
+              <w:bottom w:val="single" w:color="D0CFC6" w:sz="4"/>
+              <w:right w:val="single" w:color="D0CFC6" w:sz="4"/>
+            </w:tcBorders>
+            <w:shd w:fill="EDEDE5" w:color="auto" w:val="clear"/>
+            <w:tcMar>
+              <w:top w:type="dxa" w:w="50"/>
+              <w:left w:type="dxa" w:w="90"/>
+              <w:bottom w:type="dxa" w:w="50"/>
+              <w:right w:type="dxa" w:w="90"/>
+            </w:tcMar>
+          </w:tcPr>
+          <w:p>
+            <w:pPr>
+              <w:jc w:val="left"/>
+            </w:pPr>
+            <w:r>
+              <w:rPr>
+                <w:rFonts w:ascii="Arial" w:cs="Arial" w:eastAsia="Arial" w:hAnsi="Arial"/>
+                <w:color w:val="323232"/>
+                <w:sz w:val="16"/>
+                <w:szCs w:val="16"/>
+              </w:rPr>
+              <w:t xml:space="preserve">No cluster reuse and no energy-based relay</w:t>
+            </w:r>
+          </w:p>
+        </w:tc>
+      </w:tr>
+      <w:tr>
+        <w:trPr>
+          <w:cantSplit/>
+        </w:trPr>
+        <w:tc>
+          <w:tcPr>
+            <w:tcW w:type="dxa" w:w="1900"/>
+            <w:tcBorders>
+              <w:top w:val="single" w:color="D0CFC6" w:sz="4"/>
+              <w:left w:val="single" w:color="D0CFC6" w:sz="4"/>
+              <w:bottom w:val="single" w:color="D0CFC6" w:sz="4"/>
+              <w:right w:val="single" w:color="D0CFC6" w:sz="4"/>
+            </w:tcBorders>
+            <w:shd w:fill="FFFFFF" w:color="auto" w:val="clear"/>
+            <w:tcMar>
+              <w:top w:type="dxa" w:w="50"/>
+              <w:left w:type="dxa" w:w="90"/>
+              <w:bottom w:type="dxa" w:w="50"/>
+              <w:right w:type="dxa" w:w="90"/>
+            </w:tcMar>
+          </w:tcPr>
+          <w:p>
+            <w:pPr>
+              <w:jc w:val="left"/>
+            </w:pPr>
+            <w:r>
+              <w:rPr>
+                <w:rFonts w:ascii="Arial" w:cs="Arial" w:eastAsia="Arial" w:hAnsi="Arial"/>
+                <w:color w:val="323232"/>
+                <w:sz w:val="16"/>
+                <w:szCs w:val="16"/>
+              </w:rPr>
+              <w:t xml:space="preserve">CH rotation review (2022) [11]</w:t>
+            </w:r>
+          </w:p>
+        </w:tc>
+        <w:tc>
+          <w:tcPr>
+            <w:tcW w:type="dxa" w:w="2900"/>
+            <w:tcBorders>
+              <w:top w:val="single" w:color="D0CFC6" w:sz="4"/>
+              <w:left w:val="single" w:color="D0CFC6" w:sz="4"/>
+              <w:bottom w:val="single" w:color="D0CFC6" w:sz="4"/>
+              <w:right w:val="single" w:color="D0CFC6" w:sz="4"/>
+            </w:tcBorders>
+            <w:shd w:fill="FFFFFF" w:color="auto" w:val="clear"/>
+            <w:tcMar>
+              <w:top w:type="dxa" w:w="50"/>
+              <w:left w:type="dxa" w:w="90"/>
+              <w:bottom w:type="dxa" w:w="50"/>
+              <w:right w:type="dxa" w:w="90"/>
+            </w:tcMar>
+          </w:tcPr>
+          <w:p>
+            <w:pPr>
+              <w:jc w:val="left"/>
+            </w:pPr>
+            <w:r>
+              <w:rPr>
+                <w:rFonts w:ascii="Arial" w:cs="Arial" w:eastAsia="Arial" w:hAnsi="Arial"/>
+                <w:color w:val="323232"/>
+                <w:sz w:val="16"/>
+                <w:szCs w:val="16"/>
+              </w:rPr>
+              <w:t xml:space="preserve">Survey of threshold-based and periodic CH rotation</w:t>
+            </w:r>
+          </w:p>
+        </w:tc>
+        <w:tc>
+          <w:tcPr>
+            <w:tcW w:type="dxa" w:w="1900"/>
+            <w:tcBorders>
+              <w:top w:val="single" w:color="D0CFC6" w:sz="4"/>
+              <w:left w:val="single" w:color="D0CFC6" w:sz="4"/>
+              <w:bottom w:val="single" w:color="D0CFC6" w:sz="4"/>
+              <w:right w:val="single" w:color="D0CFC6" w:sz="4"/>
+            </w:tcBorders>
+            <w:shd w:fill="FFFFFF" w:color="auto" w:val="clear"/>
+            <w:tcMar>
+              <w:top w:type="dxa" w:w="50"/>
+              <w:left w:type="dxa" w:w="90"/>
+              <w:bottom w:type="dxa" w:w="50"/>
+              <w:right w:type="dxa" w:w="90"/>
+            </w:tcMar>
+          </w:tcPr>
+          <w:p>
+            <w:pPr>
+              <w:jc w:val="left"/>
+            </w:pPr>
+            <w:r>
+              <w:rPr>
+                <w:rFonts w:ascii="Arial" w:cs="Arial" w:eastAsia="Arial" w:hAnsi="Arial"/>
+                <w:color w:val="323232"/>
+                <w:sz w:val="16"/>
+                <w:szCs w:val="16"/>
+              </w:rPr>
+              <w:t xml:space="preserve">Shows handover before depletion is known</w:t>
+            </w:r>
+          </w:p>
+        </w:tc>
+        <w:tc>
+          <w:tcPr>
+            <w:tcW w:type="dxa" w:w="2938"/>
+            <w:tcBorders>
+              <w:top w:val="single" w:color="D0CFC6" w:sz="4"/>
+              <w:left w:val="single" w:color="D0CFC6" w:sz="4"/>
+              <w:bottom w:val="single" w:color="D0CFC6" w:sz="4"/>
+              <w:right w:val="single" w:color="D0CFC6" w:sz="4"/>
+            </w:tcBorders>
+            <w:shd w:fill="FFFFFF" w:color="auto" w:val="clear"/>
+            <w:tcMar>
+              <w:top w:type="dxa" w:w="50"/>
+              <w:left w:type="dxa" w:w="90"/>
+              <w:bottom w:type="dxa" w:w="50"/>
+              <w:right w:type="dxa" w:w="90"/>
+            </w:tcMar>
+          </w:tcPr>
+          <w:p>
+            <w:pPr>
+              <w:jc w:val="left"/>
+            </w:pPr>
+            <w:r>
+              <w:rPr>
+                <w:rFonts w:ascii="Arial" w:cs="Arial" w:eastAsia="Arial" w:hAnsi="Arial"/>
+                <w:color w:val="323232"/>
+                <w:sz w:val="16"/>
+                <w:szCs w:val="16"/>
+              </w:rPr>
+              <w:t xml:space="preserve">Survey: no single integrated protocol</w:t>
+            </w:r>
+          </w:p>
+        </w:tc>
+      </w:tr>
+      <w:tr>
+        <w:trPr>
+          <w:cantSplit/>
+        </w:trPr>
+        <w:tc>
+          <w:tcPr>
+            <w:tcW w:type="dxa" w:w="1900"/>
+            <w:tcBorders>
+              <w:top w:val="single" w:color="D0CFC6" w:sz="4"/>
+              <w:left w:val="single" w:color="D0CFC6" w:sz="4"/>
+              <w:bottom w:val="single" w:color="D0CFC6" w:sz="4"/>
+              <w:right w:val="single" w:color="D0CFC6" w:sz="4"/>
+            </w:tcBorders>
+            <w:shd w:fill="EDEDE5" w:color="auto" w:val="clear"/>
+            <w:tcMar>
+              <w:top w:type="dxa" w:w="50"/>
+              <w:left w:type="dxa" w:w="90"/>
+              <w:bottom w:type="dxa" w:w="50"/>
+              <w:right w:type="dxa" w:w="90"/>
+            </w:tcMar>
+          </w:tcPr>
+          <w:p>
+            <w:pPr>
+              <w:jc w:val="left"/>
+            </w:pPr>
+            <w:r>
+              <w:rPr>
+                <w:rFonts w:ascii="Arial" w:cs="Arial" w:eastAsia="Arial" w:hAnsi="Arial"/>
+                <w:color w:val="323232"/>
+                <w:sz w:val="16"/>
+                <w:szCs w:val="16"/>
+              </w:rPr>
+              <w:t xml:space="preserve">EEUC (2005) [12], EAUCA (2021) [13]</w:t>
+            </w:r>
+          </w:p>
+        </w:tc>
+        <w:tc>
+          <w:tcPr>
+            <w:tcW w:type="dxa" w:w="2900"/>
+            <w:tcBorders>
+              <w:top w:val="single" w:color="D0CFC6" w:sz="4"/>
+              <w:left w:val="single" w:color="D0CFC6" w:sz="4"/>
+              <w:bottom w:val="single" w:color="D0CFC6" w:sz="4"/>
+              <w:right w:val="single" w:color="D0CFC6" w:sz="4"/>
+            </w:tcBorders>
+            <w:shd w:fill="EDEDE5" w:color="auto" w:val="clear"/>
+            <w:tcMar>
+              <w:top w:type="dxa" w:w="50"/>
+              <w:left w:type="dxa" w:w="90"/>
+              <w:bottom w:type="dxa" w:w="50"/>
+              <w:right w:type="dxa" w:w="90"/>
+            </w:tcMar>
+          </w:tcPr>
+          <w:p>
+            <w:pPr>
+              <w:jc w:val="left"/>
+            </w:pPr>
+            <w:r>
+              <w:rPr>
+                <w:rFonts w:ascii="Arial" w:cs="Arial" w:eastAsia="Arial" w:hAnsi="Arial"/>
+                <w:color w:val="323232"/>
+                <w:sz w:val="16"/>
+                <w:szCs w:val="16"/>
+              </w:rPr>
+              <w:t xml:space="preserve">Unequal clusters and multi-hop CH-to-CH relaying toward the sink</w:t>
+            </w:r>
+          </w:p>
+        </w:tc>
+        <w:tc>
+          <w:tcPr>
+            <w:tcW w:type="dxa" w:w="1900"/>
+            <w:tcBorders>
+              <w:top w:val="single" w:color="D0CFC6" w:sz="4"/>
+              <w:left w:val="single" w:color="D0CFC6" w:sz="4"/>
+              <w:bottom w:val="single" w:color="D0CFC6" w:sz="4"/>
+              <w:right w:val="single" w:color="D0CFC6" w:sz="4"/>
+            </w:tcBorders>
+            <w:shd w:fill="EDEDE5" w:color="auto" w:val="clear"/>
+            <w:tcMar>
+              <w:top w:type="dxa" w:w="50"/>
+              <w:left w:type="dxa" w:w="90"/>
+              <w:bottom w:type="dxa" w:w="50"/>
+              <w:right w:type="dxa" w:w="90"/>
+            </w:tcMar>
+          </w:tcPr>
+          <w:p>
+            <w:pPr>
+              <w:jc w:val="left"/>
+            </w:pPr>
+            <w:r>
+              <w:rPr>
+                <w:rFonts w:ascii="Arial" w:cs="Arial" w:eastAsia="Arial" w:hAnsi="Arial"/>
+                <w:color w:val="323232"/>
+                <w:sz w:val="16"/>
+                <w:szCs w:val="16"/>
+              </w:rPr>
+              <w:t xml:space="preserve">Balances the load near the sink</w:t>
+            </w:r>
+          </w:p>
+        </w:tc>
+        <w:tc>
+          <w:tcPr>
+            <w:tcW w:type="dxa" w:w="2938"/>
+            <w:tcBorders>
+              <w:top w:val="single" w:color="D0CFC6" w:sz="4"/>
+              <w:left w:val="single" w:color="D0CFC6" w:sz="4"/>
+              <w:bottom w:val="single" w:color="D0CFC6" w:sz="4"/>
+              <w:right w:val="single" w:color="D0CFC6" w:sz="4"/>
+            </w:tcBorders>
+            <w:shd w:fill="EDEDE5" w:color="auto" w:val="clear"/>
+            <w:tcMar>
+              <w:top w:type="dxa" w:w="50"/>
+              <w:left w:type="dxa" w:w="90"/>
+              <w:bottom w:type="dxa" w:w="50"/>
+              <w:right w:type="dxa" w:w="90"/>
+            </w:tcMar>
+          </w:tcPr>
+          <w:p>
+            <w:pPr>
+              <w:jc w:val="left"/>
+            </w:pPr>
+            <w:r>
+              <w:rPr>
+                <w:rFonts w:ascii="Arial" w:cs="Arial" w:eastAsia="Arial" w:hAnsi="Arial"/>
+                <w:color w:val="323232"/>
+                <w:sz w:val="16"/>
+                <w:szCs w:val="16"/>
+              </w:rPr>
+              <w:t xml:space="preserve">No failure recovery; relay is not decided by an energy test per round</w:t>
+            </w:r>
+          </w:p>
+        </w:tc>
+      </w:tr>
+      <w:tr>
+        <w:trPr>
+          <w:cantSplit/>
+        </w:trPr>
+        <w:tc>
+          <w:tcPr>
+            <w:tcW w:type="dxa" w:w="1900"/>
+            <w:tcBorders>
+              <w:top w:val="single" w:color="D0CFC6" w:sz="4"/>
+              <w:left w:val="single" w:color="D0CFC6" w:sz="4"/>
+              <w:bottom w:val="single" w:color="D0CFC6" w:sz="4"/>
+              <w:right w:val="single" w:color="D0CFC6" w:sz="4"/>
+            </w:tcBorders>
+            <w:shd w:fill="FFFFFF" w:color="auto" w:val="clear"/>
+            <w:tcMar>
+              <w:top w:type="dxa" w:w="50"/>
+              <w:left w:type="dxa" w:w="90"/>
+              <w:bottom w:type="dxa" w:w="50"/>
+              <w:right w:type="dxa" w:w="90"/>
+            </w:tcMar>
+          </w:tcPr>
+          <w:p>
+            <w:pPr>
+              <w:jc w:val="left"/>
+            </w:pPr>
+            <w:r>
+              <w:rPr>
+                <w:rFonts w:ascii="Arial" w:cs="Arial" w:eastAsia="Arial" w:hAnsi="Arial"/>
+                <w:color w:val="323232"/>
+                <w:sz w:val="16"/>
+                <w:szCs w:val="16"/>
+              </w:rPr>
               <w:t xml:space="preserve">TLC-LEACH (2024) [7], DL-HEED (2025) [8], RL-ILEACH (2026) [9]</w:t>
             </w:r>
           </w:p>
@@ -1610,7 +2009,7 @@
               <w:bottom w:val="single" w:color="D0CFC6" w:sz="4"/>
               <w:right w:val="single" w:color="D0CFC6" w:sz="4"/>
             </w:tcBorders>
-            <w:shd w:fill="EDEDE5" w:color="auto" w:val="clear"/>
+            <w:shd w:fill="FFFFFF" w:color="auto" w:val="clear"/>
             <w:tcMar>
               <w:top w:type="dxa" w:w="50"/>
               <w:left w:type="dxa" w:w="90"/>
@@ -1642,7 +2041,7 @@
               <w:bottom w:val="single" w:color="D0CFC6" w:sz="4"/>
               <w:right w:val="single" w:color="D0CFC6" w:sz="4"/>
             </w:tcBorders>
-            <w:shd w:fill="EDEDE5" w:color="auto" w:val="clear"/>
+            <w:shd w:fill="FFFFFF" w:color="auto" w:val="clear"/>
             <w:tcMar>
               <w:top w:type="dxa" w:w="50"/>
               <w:left w:type="dxa" w:w="90"/>
@@ -1674,7 +2073,7 @@
               <w:bottom w:val="single" w:color="D0CFC6" w:sz="4"/>
               <w:right w:val="single" w:color="D0CFC6" w:sz="4"/>
             </w:tcBorders>
-            <w:shd w:fill="EDEDE5" w:color="auto" w:val="clear"/>
+            <w:shd w:fill="FFFFFF" w:color="auto" w:val="clear"/>
             <w:tcMar>
               <w:top w:type="dxa" w:w="50"/>
               <w:left w:type="dxa" w:w="90"/>
@@ -1735,7 +2134,7 @@
           <w:sz w:val="21"/>
           <w:szCs w:val="21"/>
         </w:rPr>
-        <w:t xml:space="preserve">Each approach improves one part of the problem. None combines (1) energy- and connectivity-aware CH selection, (2) low-overhead multi-round cluster reuse, (3) cluster-head failure recovery and (4) an inter-cluster relay that adapts to where the sink is. The proposed protocol integrates all four.</w:t>
+        <w:t xml:space="preserve">Each approach improves one part of the problem. None combines (1) energy- and connectivity-aware CH selection, (2) low-overhead multi-round cluster reuse, (3) cluster-head failure recovery and (4) an inter-cluster relay that adapts to where the sink is. The proposed protocol integrates all four. Each mechanism exists individually in the literature (backup CH [10], threshold-based handover [11], multi-hop relay [12,13]); the contribution is their integration, the per-round energy test that decides every relay hop, and the controlled step-by-step evaluation under one two-slope radio model [14].</w:t>
       </w:r>
     </w:p>
     <w:p>
@@ -14512,6 +14911,156 @@
         <w:t xml:space="preserve">El-Sayed, Abd-Elgaber and Refaay, “An Intelligent RL Enhanced Improved LEACH Protocol for Prolonging WSN Lifetime,” Scientific Reports, 2026.</w:t>
       </w:r>
     </w:p>
+    <w:p>
+      <w:pPr>
+        <w:spacing w:after="80" w:before="0" w:line="276" w:lineRule="auto"/>
+      </w:pPr>
+      <w:r>
+        <w:rPr>
+          <w:rFonts w:ascii="Arial" w:cs="Arial" w:eastAsia="Arial" w:hAnsi="Arial"/>
+          <w:b/>
+          <w:bCs/>
+          <w:color w:val="323232"/>
+          <w:sz w:val="19"/>
+          <w:szCs w:val="19"/>
+        </w:rPr>
+        <w:t xml:space="preserve">[10] </w:t>
+      </w:r>
+      <w:r>
+        <w:rPr>
+          <w:rFonts w:ascii="Arial" w:cs="Arial" w:eastAsia="Arial" w:hAnsi="Arial"/>
+          <w:color w:val="323232"/>
+          <w:sz w:val="19"/>
+          <w:szCs w:val="19"/>
+        </w:rPr>
+        <w:t xml:space="preserve">J. Jassbi and S. Moridi, “Fault Tolerance and Energy Efficient Clustering Algorithm in Wireless Sensor Networks: FTEC,” Wireless Personal Communications, 2019. doi:10.1007/s11277-019-06281-6</w:t>
+      </w:r>
+    </w:p>
+    <w:p>
+      <w:pPr>
+        <w:spacing w:after="80" w:before="0" w:line="276" w:lineRule="auto"/>
+      </w:pPr>
+      <w:r>
+        <w:rPr>
+          <w:rFonts w:ascii="Arial" w:cs="Arial" w:eastAsia="Arial" w:hAnsi="Arial"/>
+          <w:b/>
+          <w:bCs/>
+          <w:color w:val="323232"/>
+          <w:sz w:val="19"/>
+          <w:szCs w:val="19"/>
+        </w:rPr>
+        <w:t xml:space="preserve">[11] </w:t>
+      </w:r>
+      <w:r>
+        <w:rPr>
+          <w:rFonts w:ascii="Arial" w:cs="Arial" w:eastAsia="Arial" w:hAnsi="Arial"/>
+          <w:color w:val="323232"/>
+          <w:sz w:val="19"/>
+          <w:szCs w:val="19"/>
+        </w:rPr>
+        <w:t xml:space="preserve">R. Pachlor, D. Shrimankar, K. K. Nagwanshi and M. Paliwal, “Cluster-Head Rotation Approaches in Sensor Networks: A Review,” arXiv:2206.08892, 2022.</w:t>
+      </w:r>
+    </w:p>
+    <w:p>
+      <w:pPr>
+        <w:spacing w:after="80" w:before="0" w:line="276" w:lineRule="auto"/>
+      </w:pPr>
+      <w:r>
+        <w:rPr>
+          <w:rFonts w:ascii="Arial" w:cs="Arial" w:eastAsia="Arial" w:hAnsi="Arial"/>
+          <w:b/>
+          <w:bCs/>
+          <w:color w:val="323232"/>
+          <w:sz w:val="19"/>
+          <w:szCs w:val="19"/>
+        </w:rPr>
+        <w:t xml:space="preserve">[12] </w:t>
+      </w:r>
+      <w:r>
+        <w:rPr>
+          <w:rFonts w:ascii="Arial" w:cs="Arial" w:eastAsia="Arial" w:hAnsi="Arial"/>
+          <w:color w:val="323232"/>
+          <w:sz w:val="19"/>
+          <w:szCs w:val="19"/>
+        </w:rPr>
+        <w:t xml:space="preserve">C. Li, M. Ye, G. Chen and J. Wu, “An Energy-Efficient Unequal Clustering Mechanism for Wireless Sensor Networks,” Proc. IEEE MASS, 2005.</w:t>
+      </w:r>
+    </w:p>
+    <w:p>
+      <w:pPr>
+        <w:spacing w:after="80" w:before="0" w:line="276" w:lineRule="auto"/>
+      </w:pPr>
+      <w:r>
+        <w:rPr>
+          <w:rFonts w:ascii="Arial" w:cs="Arial" w:eastAsia="Arial" w:hAnsi="Arial"/>
+          <w:b/>
+          <w:bCs/>
+          <w:color w:val="323232"/>
+          <w:sz w:val="19"/>
+          <w:szCs w:val="19"/>
+        </w:rPr>
+        <w:t xml:space="preserve">[13] </w:t>
+      </w:r>
+      <w:r>
+        <w:rPr>
+          <w:rFonts w:ascii="Arial" w:cs="Arial" w:eastAsia="Arial" w:hAnsi="Arial"/>
+          <w:color w:val="323232"/>
+          <w:sz w:val="19"/>
+          <w:szCs w:val="19"/>
+        </w:rPr>
+        <w:t xml:space="preserve">V. Chauhan and S. Soni, “Energy Aware Unequal Clustering Algorithm with Multi-hop Routing via Low Degree Relay Nodes for Wireless Sensor Networks,” J. Ambient Intelligence and Humanized Computing, vol. 12, pp. 2469–2482, 2021. doi:10.1007/s12652-020-02385-1</w:t>
+      </w:r>
+    </w:p>
+    <w:p>
+      <w:pPr>
+        <w:spacing w:after="80" w:before="0" w:line="276" w:lineRule="auto"/>
+      </w:pPr>
+      <w:r>
+        <w:rPr>
+          <w:rFonts w:ascii="Arial" w:cs="Arial" w:eastAsia="Arial" w:hAnsi="Arial"/>
+          <w:b/>
+          <w:bCs/>
+          <w:color w:val="323232"/>
+          <w:sz w:val="19"/>
+          <w:szCs w:val="19"/>
+        </w:rPr>
+        <w:t xml:space="preserve">[14] </w:t>
+      </w:r>
+      <w:r>
+        <w:rPr>
+          <w:rFonts w:ascii="Arial" w:cs="Arial" w:eastAsia="Arial" w:hAnsi="Arial"/>
+          <w:color w:val="323232"/>
+          <w:sz w:val="19"/>
+          <w:szCs w:val="19"/>
+        </w:rPr>
+        <w:t xml:space="preserve">W. B. Heinzelman, A. P. Chandrakasan and H. Balakrishnan, “An Application-Specific Protocol Architecture for Wireless Microsensor Networks,” IEEE Trans. Wireless Communications, 2002.</w:t>
+      </w:r>
+    </w:p>
+    <w:p>
+      <w:pPr>
+        <w:spacing w:after="80" w:before="0" w:line="276" w:lineRule="auto"/>
+      </w:pPr>
+      <w:r>
+        <w:rPr>
+          <w:rFonts w:ascii="Arial" w:cs="Arial" w:eastAsia="Arial" w:hAnsi="Arial"/>
+          <w:b/>
+          <w:bCs/>
+          <w:color w:val="323232"/>
+          <w:sz w:val="19"/>
+          <w:szCs w:val="19"/>
+        </w:rPr>
+        <w:t xml:space="preserve">[15] </w:t>
+      </w:r>
+      <w:r>
+        <w:rPr>
+          <w:rFonts w:ascii="Arial" w:cs="Arial" w:eastAsia="Arial" w:hAnsi="Arial"/>
+          <w:color w:val="323232"/>
+          <w:sz w:val="19"/>
+          <w:szCs w:val="19"/>
+        </w:rPr>
+        <w:t xml:space="preserve">ns-3 Network Simulator, release 3.41, https://www.nsnam.org</w:t>
+      </w:r>
+    </w:p>
     <w:sectPr>
       <w:footerReference w:type="default" r:id="rId7"/>
       <w:pgSz w:w="11906" w:h="16838" w:orient="portrait"/>

</xml_diff>

<commit_message>
Propagate paper-fidelity fixes to LEACH/HEED/PEGASIS EDITED codes and update all thesis files
- EDITED codes now share the corrected ORIGINAL algorithms (only the
  environment differs); new heed_fairness_EDITED_unified.cc.
- Unified results: LEACH 1383/1586/1842/99.40%, HEED 634/1216/1883/99.68%,
  HEED (fairness) 743/1154/1960/99.74%, PEGASIS 1324/2352/3504/99.42%.
- Paper-exact: LEACH 1035/1152/1327, HEED (N=500) 734/1384/2259,
  PEGASIS 1616/2017/2186.
- PDR claim reworded: v8-Chain has the highest PDR among protocols whose
  first node survives past round 2000 (not the highest overall).

Co-Authored-By: Claude Opus 5.5 <noreply@anthropic.com>
Claude-Session: https://claude.ai/code/session_019rZdtfEbJpAbmcB9G79J6K
</commit_message>
<xml_diff>
--- a/thesis-final/SOTA_Report_v8-Chain.docx
+++ b/thesis-final/SOTA_Report_v8-Chain.docx
@@ -171,7 +171,7 @@
                 <w:sz w:val="20"/>
                 <w:szCs w:val="20"/>
               </w:rPr>
-              <w:t xml:space="preserve">FND 2621 / HND 2711 / LND 2756 rounds, PDR 99.27% — the latest first-node death of every protocol reproduced, and a higher PDR than any protocol with a comparable lifetime (H-LEACH Improved: FND 2347, PDR 97.33%; v7: FND 1551, PDR 98.43%). Only HEED and SH-LEACH deliver slightly more (99.7–99.8%), but their first node dies 1,200–2,300 rounds earlier.</w:t>
+              <w:t xml:space="preserve">FND 2621 / HND 2711 / LND 2756 rounds, PDR 99.27% — the latest first-node death of every protocol reproduced, and the highest PDR of every protocol whose first node survives past round 2000 (H-LEACH Improved: FND 2347, PDR 97.33%; EECH-HEED with sensing: FND 2502, PDR 92.14%). LEACH, PEGASIS, HEED and SH-LEACH Improved deliver 0.1–0.5 pp more (99.40–99.79%), but their first node dies 1,200–2,000 rounds earlier.</w:t>
             </w:r>
           </w:p>
           <w:p>
@@ -3654,7 +3654,7 @@
                 <w:sz w:val="17"/>
                 <w:szCs w:val="17"/>
               </w:rPr>
-              <w:t xml:space="preserve">1321</w:t>
+              <w:t xml:space="preserve">1327</w:t>
             </w:r>
           </w:p>
         </w:tc>
@@ -3688,7 +3688,7 @@
                 <w:sz w:val="17"/>
                 <w:szCs w:val="17"/>
               </w:rPr>
-              <w:t xml:space="preserve">1409</w:t>
+              <w:t xml:space="preserve">1383</w:t>
             </w:r>
           </w:p>
         </w:tc>
@@ -3722,7 +3722,7 @@
                 <w:sz w:val="17"/>
                 <w:szCs w:val="17"/>
               </w:rPr>
-              <w:t xml:space="preserve">1626</w:t>
+              <w:t xml:space="preserve">1586</w:t>
             </w:r>
           </w:p>
         </w:tc>
@@ -3756,7 +3756,7 @@
                 <w:sz w:val="17"/>
                 <w:szCs w:val="17"/>
               </w:rPr>
-              <w:t xml:space="preserve">1962</w:t>
+              <w:t xml:space="preserve">1842</w:t>
             </w:r>
           </w:p>
         </w:tc>
@@ -3790,7 +3790,7 @@
                 <w:sz w:val="17"/>
                 <w:szCs w:val="17"/>
               </w:rPr>
-              <w:t xml:space="preserve">98.37%</w:t>
+              <w:t xml:space="preserve">99.40%</w:t>
             </w:r>
           </w:p>
         </w:tc>
@@ -3897,7 +3897,7 @@
                 <w:sz w:val="17"/>
                 <w:szCs w:val="17"/>
               </w:rPr>
-              <w:t xml:space="preserve">1996</w:t>
+              <w:t xml:space="preserve">2259</w:t>
             </w:r>
           </w:p>
         </w:tc>
@@ -3931,7 +3931,7 @@
                 <w:sz w:val="17"/>
                 <w:szCs w:val="17"/>
               </w:rPr>
-              <w:t xml:space="preserve">323</w:t>
+              <w:t xml:space="preserve">634</w:t>
             </w:r>
           </w:p>
         </w:tc>
@@ -3965,7 +3965,7 @@
                 <w:sz w:val="17"/>
                 <w:szCs w:val="17"/>
               </w:rPr>
-              <w:t xml:space="preserve">570</w:t>
+              <w:t xml:space="preserve">1216</w:t>
             </w:r>
           </w:p>
         </w:tc>
@@ -3999,7 +3999,7 @@
                 <w:sz w:val="17"/>
                 <w:szCs w:val="17"/>
               </w:rPr>
-              <w:t xml:space="preserve">1362</w:t>
+              <w:t xml:space="preserve">1883</w:t>
             </w:r>
           </w:p>
         </w:tc>
@@ -4033,7 +4033,7 @@
                 <w:sz w:val="17"/>
                 <w:szCs w:val="17"/>
               </w:rPr>
-              <w:t xml:space="preserve">99.69%</w:t>
+              <w:t xml:space="preserve">99.68%</w:t>
             </w:r>
           </w:p>
         </w:tc>
@@ -4140,7 +4140,7 @@
                 <w:sz w:val="17"/>
                 <w:szCs w:val="17"/>
               </w:rPr>
-              <w:t xml:space="preserve">2167</w:t>
+              <w:t xml:space="preserve">2186</w:t>
             </w:r>
           </w:p>
         </w:tc>
@@ -4208,7 +4208,7 @@
                 <w:sz w:val="17"/>
                 <w:szCs w:val="17"/>
               </w:rPr>
-              <w:t xml:space="preserve">2353</w:t>
+              <w:t xml:space="preserve">2352</w:t>
             </w:r>
           </w:p>
         </w:tc>
@@ -4242,7 +4242,7 @@
                 <w:sz w:val="17"/>
                 <w:szCs w:val="17"/>
               </w:rPr>
-              <w:t xml:space="preserve">2887</w:t>
+              <w:t xml:space="preserve">3504</w:t>
             </w:r>
           </w:p>
         </w:tc>
@@ -4276,7 +4276,7 @@
                 <w:sz w:val="17"/>
                 <w:szCs w:val="17"/>
               </w:rPr>
-              <w:t xml:space="preserve">98.67%</w:t>
+              <w:t xml:space="preserve">99.42%</w:t>
             </w:r>
           </w:p>
         </w:tc>
@@ -5776,7 +5776,7 @@
           <w:sz w:val="21"/>
           <w:szCs w:val="21"/>
         </w:rPr>
-        <w:t xml:space="preserve">PEGASIS matched its paper within 2.3% on all three lifetime metrics. H-LEACH, as literally written, never elects a CH: with equal initial energy no node is strictly above the average, so a fallback was required just to run it; relaxing the gate to 0.8× the average let the energy-weighted rule actually decide, improving FND/HND/LND by 7.8–8.6% at no PDR cost. SH-LEACH applied a single probability doubling instead of HEED's iterative doubling; correcting it improved HND, LND and PDR but lowered FND (fewer, larger clusters). HEED gave the highest reliability (PDR 99.69%) but the shortest lifetime, because its iterative CH negotiation is paid every round. EECH-HEED reaches the longest raw lifetime only because its adaptive sensing transmits less often, so it is kept as context.</w:t>
+        <w:t xml:space="preserve">PEGASIS matched its paper within 0.3% on LND and within 3.1% on FND and HND; LEACH matched the paper's LND within 1.1%. HEED was run with 500 nodes as in the paper, which reports graphs only. While checking the codes against the papers, a reporting bug was found and fixed: a run that hit the round limit used to report its last death as LND; all protocols now run until the last node really dies. H-LEACH, as literally written, never elects a CH: with equal initial energy no node is strictly above the average, so a fallback was required just to run it; relaxing the gate to 0.8× the average let the energy-weighted rule actually decide, improving FND/HND/LND by 7.8–8.6% at no PDR cost. SH-LEACH applied a single probability doubling instead of HEED's iterative doubling; correcting it improved HND, LND and PDR but lowered FND (fewer, larger clusters). HEED kept a high PDR (99.68%) but the earliest first-node death (FND 634), because its iterative CH negotiation is paid every round. EECH-HEED reaches the longest raw lifetime only because its adaptive sensing transmits less often, so it is kept as context.</w:t>
       </w:r>
     </w:p>
     <w:p>

</xml_diff>

<commit_message>
Update thesis files with paper-faithful hybrid results (SH-LEACH, H-LEACH, EECH-HEED) and redraw the family comparison figure
Co-Authored-By: Claude Opus 5.5 <noreply@anthropic.com>
Claude-Session: https://claude.ai/code/session_019rZdtfEbJpAbmcB9G79J6K
</commit_message>
<xml_diff>
--- a/thesis-final/SOTA_Report_v8-Chain.docx
+++ b/thesis-final/SOTA_Report_v8-Chain.docx
@@ -171,7 +171,7 @@
                 <w:sz w:val="20"/>
                 <w:szCs w:val="20"/>
               </w:rPr>
-              <w:t xml:space="preserve">FND 2621 / HND 2711 / LND 2756 rounds, PDR 99.27% — the latest first-node death of every protocol reproduced, and the highest PDR of every protocol whose first node survives past round 2000 (H-LEACH Improved: FND 2347, PDR 97.33%; EECH-HEED with sensing: FND 2502, PDR 92.14%). LEACH, PEGASIS, HEED and SH-LEACH Improved deliver 0.1–0.5 pp more (99.40–99.79%), but their first node dies 1,200–2,000 rounds earlier.</w:t>
+              <w:t xml:space="preserve">FND 2621 / HND 2711 / LND 2756 rounds, PDR 99.27% — the latest first-node death of every protocol (best reproduced protocol: SH-LEACH Improved, FND 1480), and the highest PDR of every protocol whose first node survives past round 2000. Several reproduced protocols (LEACH, PEGASIS, HEED, H-LEACH, EECH-HEED) deliver up to 0.5 pp more (99.30–99.74%), but their first node dies 1,100–2,000 rounds earlier.</w:t>
             </w:r>
           </w:p>
           <w:p>
@@ -353,7 +353,7 @@
           <w:sz w:val="21"/>
           <w:szCs w:val="21"/>
         </w:rPr>
-        <w:t xml:space="preserve">Targeted corrections of two literature hybrids whose published algorithms could not work as described (H-LEACH deadlock, SH-LEACH single doubling).</w:t>
+        <w:t xml:space="preserve">Targeted corrections of two literature hybrids whose published algorithms could not work as described (H-LEACH deadlock, SH-LEACH ever-growing CH probability), plus a rotation fix for EECH-HEED.</w:t>
       </w:r>
     </w:p>
     <w:p>
@@ -1230,7 +1230,7 @@
                 <w:sz w:val="16"/>
                 <w:szCs w:val="16"/>
               </w:rPr>
-              <w:t xml:space="preserve">LEACH + HEED-style probability doubling</w:t>
+              <w:t xml:space="preserve">LEACH threshold × energy ratio with a CH-selection counter (Eq. 3)</w:t>
             </w:r>
           </w:p>
         </w:tc>
@@ -1262,7 +1262,7 @@
                 <w:sz w:val="16"/>
                 <w:szCs w:val="16"/>
               </w:rPr>
-              <w:t xml:space="preserve">Delays first node death</w:t>
+              <w:t xml:space="preserve">Energy-balanced CH choice</w:t>
             </w:r>
           </w:p>
         </w:tc>
@@ -1294,7 +1294,7 @@
                 <w:sz w:val="16"/>
                 <w:szCs w:val="16"/>
               </w:rPr>
-              <w:t xml:space="preserve">Formula applies one doubling only; no failure recovery</w:t>
+              <w:t xml:space="preserve">Round factor never resets → ~29 CHs per round; no failure recovery</w:t>
             </w:r>
           </w:p>
         </w:tc>
@@ -1528,7 +1528,7 @@
                 <w:sz w:val="16"/>
                 <w:szCs w:val="16"/>
               </w:rPr>
-              <w:t xml:space="preserve">Longest raw lifetime (fewer transmissions)</w:t>
+              <w:t xml:space="preserve">Zone-aware election; sends only on significant change</w:t>
             </w:r>
           </w:p>
         </w:tc>
@@ -4383,7 +4383,7 @@
                 <w:sz w:val="17"/>
                 <w:szCs w:val="17"/>
               </w:rPr>
-              <w:t xml:space="preserve">884</w:t>
+              <w:t xml:space="preserve">689</w:t>
             </w:r>
           </w:p>
         </w:tc>
@@ -4417,7 +4417,7 @@
                 <w:sz w:val="17"/>
                 <w:szCs w:val="17"/>
               </w:rPr>
-              <w:t xml:space="preserve">1440</w:t>
+              <w:t xml:space="preserve">647</w:t>
             </w:r>
           </w:p>
         </w:tc>
@@ -4451,7 +4451,7 @@
                 <w:sz w:val="17"/>
                 <w:szCs w:val="17"/>
               </w:rPr>
-              <w:t xml:space="preserve">1584</w:t>
+              <w:t xml:space="preserve">702</w:t>
             </w:r>
           </w:p>
         </w:tc>
@@ -4485,7 +4485,7 @@
                 <w:sz w:val="17"/>
                 <w:szCs w:val="17"/>
               </w:rPr>
-              <w:t xml:space="preserve">1604</w:t>
+              <w:t xml:space="preserve">721</w:t>
             </w:r>
           </w:p>
         </w:tc>
@@ -4519,7 +4519,7 @@
                 <w:sz w:val="17"/>
                 <w:szCs w:val="17"/>
               </w:rPr>
-              <w:t xml:space="preserve">99.17%</w:t>
+              <w:t xml:space="preserve">98.58%</w:t>
             </w:r>
           </w:p>
         </w:tc>
@@ -4660,7 +4660,7 @@
                 <w:sz w:val="17"/>
                 <w:szCs w:val="17"/>
               </w:rPr>
-              <w:t xml:space="preserve">1247</w:t>
+              <w:t xml:space="preserve">1480</w:t>
             </w:r>
           </w:p>
         </w:tc>
@@ -4694,7 +4694,7 @@
                 <w:sz w:val="17"/>
                 <w:szCs w:val="17"/>
               </w:rPr>
-              <w:t xml:space="preserve">1600</w:t>
+              <w:t xml:space="preserve">1542</w:t>
             </w:r>
           </w:p>
         </w:tc>
@@ -4728,7 +4728,7 @@
                 <w:sz w:val="17"/>
                 <w:szCs w:val="17"/>
               </w:rPr>
-              <w:t xml:space="preserve">1649</w:t>
+              <w:t xml:space="preserve">1558</w:t>
             </w:r>
           </w:p>
         </w:tc>
@@ -4762,7 +4762,7 @@
                 <w:sz w:val="17"/>
                 <w:szCs w:val="17"/>
               </w:rPr>
-              <w:t xml:space="preserve">99.79%</w:t>
+              <w:t xml:space="preserve">99.21%</w:t>
             </w:r>
           </w:p>
         </w:tc>
@@ -4869,7 +4869,7 @@
                 <w:sz w:val="17"/>
                 <w:szCs w:val="17"/>
               </w:rPr>
-              <w:t xml:space="preserve">1210</w:t>
+              <w:t xml:space="preserve">1207</w:t>
             </w:r>
           </w:p>
         </w:tc>
@@ -4903,7 +4903,7 @@
                 <w:sz w:val="17"/>
                 <w:szCs w:val="17"/>
               </w:rPr>
-              <w:t xml:space="preserve">2177</w:t>
+              <w:t xml:space="preserve">1384</w:t>
             </w:r>
           </w:p>
         </w:tc>
@@ -4937,7 +4937,7 @@
                 <w:sz w:val="17"/>
                 <w:szCs w:val="17"/>
               </w:rPr>
-              <w:t xml:space="preserve">2255</w:t>
+              <w:t xml:space="preserve">1419</w:t>
             </w:r>
           </w:p>
         </w:tc>
@@ -4971,7 +4971,7 @@
                 <w:sz w:val="17"/>
                 <w:szCs w:val="17"/>
               </w:rPr>
-              <w:t xml:space="preserve">2305</w:t>
+              <w:t xml:space="preserve">1434</w:t>
             </w:r>
           </w:p>
         </w:tc>
@@ -5005,7 +5005,7 @@
                 <w:sz w:val="17"/>
                 <w:szCs w:val="17"/>
               </w:rPr>
-              <w:t xml:space="preserve">97.33%</w:t>
+              <w:t xml:space="preserve">99.30%</w:t>
             </w:r>
           </w:p>
         </w:tc>
@@ -5146,7 +5146,7 @@
                 <w:sz w:val="17"/>
                 <w:szCs w:val="17"/>
               </w:rPr>
-              <w:t xml:space="preserve">2347</w:t>
+              <w:t xml:space="preserve">1473</w:t>
             </w:r>
           </w:p>
         </w:tc>
@@ -5180,7 +5180,7 @@
                 <w:sz w:val="17"/>
                 <w:szCs w:val="17"/>
               </w:rPr>
-              <w:t xml:space="preserve">2449</w:t>
+              <w:t xml:space="preserve">1509</w:t>
             </w:r>
           </w:p>
         </w:tc>
@@ -5214,7 +5214,7 @@
                 <w:sz w:val="17"/>
                 <w:szCs w:val="17"/>
               </w:rPr>
-              <w:t xml:space="preserve">2499</w:t>
+              <w:t xml:space="preserve">1525</w:t>
             </w:r>
           </w:p>
         </w:tc>
@@ -5248,7 +5248,7 @@
                 <w:sz w:val="17"/>
                 <w:szCs w:val="17"/>
               </w:rPr>
-              <w:t xml:space="preserve">97.33%</w:t>
+              <w:t xml:space="preserve">99.36%</w:t>
             </w:r>
           </w:p>
         </w:tc>
@@ -5355,7 +5355,7 @@
                 <w:sz w:val="17"/>
                 <w:szCs w:val="17"/>
               </w:rPr>
-              <w:t xml:space="preserve">1129</w:t>
+              <w:t xml:space="preserve">3783</w:t>
             </w:r>
           </w:p>
         </w:tc>
@@ -5389,7 +5389,7 @@
                 <w:sz w:val="17"/>
                 <w:szCs w:val="17"/>
               </w:rPr>
-              <w:t xml:space="preserve">1653</w:t>
+              <w:t xml:space="preserve">1311</w:t>
             </w:r>
           </w:p>
         </w:tc>
@@ -5423,7 +5423,7 @@
                 <w:sz w:val="17"/>
                 <w:szCs w:val="17"/>
               </w:rPr>
-              <w:t xml:space="preserve">2134</w:t>
+              <w:t xml:space="preserve">1382</w:t>
             </w:r>
           </w:p>
         </w:tc>
@@ -5457,7 +5457,7 @@
                 <w:sz w:val="17"/>
                 <w:szCs w:val="17"/>
               </w:rPr>
-              <w:t xml:space="preserve">2184</w:t>
+              <w:t xml:space="preserve">1545</w:t>
             </w:r>
           </w:p>
         </w:tc>
@@ -5491,7 +5491,7 @@
                 <w:sz w:val="17"/>
                 <w:szCs w:val="17"/>
               </w:rPr>
-              <w:t xml:space="preserve">91.68%</w:t>
+              <w:t xml:space="preserve">99.74%</w:t>
             </w:r>
           </w:p>
         </w:tc>
@@ -5632,7 +5632,7 @@
                 <w:sz w:val="17"/>
                 <w:szCs w:val="17"/>
               </w:rPr>
-              <w:t xml:space="preserve">2502</w:t>
+              <w:t xml:space="preserve">1368</w:t>
             </w:r>
           </w:p>
         </w:tc>
@@ -5666,7 +5666,7 @@
                 <w:sz w:val="17"/>
                 <w:szCs w:val="17"/>
               </w:rPr>
-              <w:t xml:space="preserve">3758</w:t>
+              <w:t xml:space="preserve">1385</w:t>
             </w:r>
           </w:p>
         </w:tc>
@@ -5700,7 +5700,7 @@
                 <w:sz w:val="17"/>
                 <w:szCs w:val="17"/>
               </w:rPr>
-              <w:t xml:space="preserve">3808</w:t>
+              <w:t xml:space="preserve">1767</w:t>
             </w:r>
           </w:p>
         </w:tc>
@@ -5734,7 +5734,7 @@
                 <w:sz w:val="17"/>
                 <w:szCs w:val="17"/>
               </w:rPr>
-              <w:t xml:space="preserve">92.14%</w:t>
+              <w:t xml:space="preserve">99.51%</w:t>
             </w:r>
           </w:p>
         </w:tc>
@@ -5776,7 +5776,7 @@
           <w:sz w:val="21"/>
           <w:szCs w:val="21"/>
         </w:rPr>
-        <w:t xml:space="preserve">PEGASIS matched its paper within 0.3% on LND and within 3.1% on FND and HND; LEACH matched the paper's LND within 1.1%. HEED was run with 500 nodes as in the paper, which reports graphs only. While checking the codes against the papers, a reporting bug was found and fixed: a run that hit the round limit used to report its last death as LND; all protocols now run until the last node really dies. H-LEACH, as literally written, never elects a CH: with equal initial energy no node is strictly above the average, so a fallback was required just to run it; relaxing the gate to 0.8× the average let the energy-weighted rule actually decide, improving FND/HND/LND by 7.8–8.6% at no PDR cost. SH-LEACH applied a single probability doubling instead of HEED's iterative doubling; correcting it improved HND, LND and PDR but lowered FND (fewer, larger clusters). HEED kept a high PDR (99.68%) but the earliest first-node death (FND 634), because its iterative CH negotiation is paid every round. EECH-HEED reaches the longest raw lifetime only because its adaptive sensing transmits less often, so it is kept as context.</w:t>
+        <w:t xml:space="preserve">PEGASIS matched its paper within 0.3% on LND and within 3.1% on FND and HND; LEACH matched the paper's LND within 1.1%. HEED was run with 500 nodes as in the paper, which reports graphs only. While checking the codes against the papers, a reporting bug was found and fixed: a run that hit the round limit used to report its last death as LND; all protocols now run until the last node really dies. H-LEACH, as literally written, never elects a CH: with equal initial energy no node is strictly above the average, so a fallback was required just to run it; changing the gate to ‘≥ average’ and adding LEACH's G-set (each node is CH at most once per 10-round epoch) improved FND/HND/LND by 6.3–6.4%. SH-LEACH's Eq. 3 multiplies the probability by the round number, which is never reset, so about 29 nodes become CH every round; making that factor periodic (r mod 1/Cprob), as in LEACH, raised FND from 647 to 1480 (+129%) and LND from 721 to 1558. HEED kept a high PDR (99.68%) but the earliest first-node death (FND 634), because its iterative CH negotiation is paid every round. EECH-HEED was rebuilt from its equations (node degree in Zone 2, the Eq. 6 dynamic threshold with its G set, relays that pay for forwarding, Eq. 7 sensing): in its own scenario its FND is within 10% of the paper. In the unified environment its sensing is switched off, because it only makes nodes send less; there, Eq. 5 gives Zone-2 nodes a probability near 1, so the 1/P rotation stops working. Rotating Zone 2 at the paper's own 10% CH target raised FND by 4.3% and LND by 14.4%. It is kept as context.</w:t>
       </w:r>
     </w:p>
     <w:p>
@@ -5788,7 +5788,7 @@
       <w:r>
         <w:drawing>
           <wp:inline distT="0" distB="0" distL="0" distR="0">
-            <wp:extent cx="5943600" cy="3350029"/>
+            <wp:extent cx="5943600" cy="3355258"/>
             <wp:effectExtent t="0" r="0" b="0" l="0"/>
             <wp:docPr id="1" name="fig/families.png" descr="fig/families.png" title="fig/families.png"/>
             <wp:cNvGraphicFramePr>
@@ -5813,7 +5813,7 @@
                   <pic:spPr bwMode="auto">
                     <a:xfrm>
                       <a:off x="0" y="0"/>
-                      <a:ext cx="5943600" cy="3350029"/>
+                      <a:ext cx="5943600" cy="3355258"/>
                     </a:xfrm>
                     <a:prstGeom prst="rect">
                       <a:avLst/>

</xml_diff>

<commit_message>
Security: ECC / RSA only on CH-to-sink packets (-DSEC_PK_BS_MJ); v8-Chain relay and direct-to-BS rule count that cost
Co-Authored-By: Claude Opus 5.5 <noreply@anthropic.com>
Claude-Session: https://claude.ai/code/session_019rZdtfEbJpAbmcB9G79J6K
</commit_message>
<xml_diff>
--- a/thesis-final/SOTA_Report_v8-Chain.docx
+++ b/thesis-final/SOTA_Report_v8-Chain.docx
@@ -22950,7 +22950,7 @@
                 <w:sz w:val="18"/>
                 <w:szCs w:val="18"/>
               </w:rPr>
-              <w:t xml:space="preserve">Full ECC</w:t>
+              <w:t xml:space="preserve">ECC / RSA on CH → sink</w:t>
             </w:r>
           </w:p>
         </w:tc>
@@ -22981,7 +22981,7 @@
                 <w:sz w:val="18"/>
                 <w:szCs w:val="18"/>
               </w:rPr>
-              <w:t xml:space="preserve">ECIES</w:t>
+              <w:t xml:space="preserve">AES + MIC</w:t>
             </w:r>
           </w:p>
         </w:tc>
@@ -23012,7 +23012,7 @@
                 <w:sz w:val="18"/>
                 <w:szCs w:val="18"/>
               </w:rPr>
-              <w:t xml:space="preserve">every packet</w:t>
+              <w:t xml:space="preserve">every packet to the sink</w:t>
             </w:r>
           </w:p>
         </w:tc>
@@ -23043,7 +23043,7 @@
                 <w:sz w:val="18"/>
                 <w:szCs w:val="18"/>
               </w:rPr>
-              <w:t xml:space="preserve">22.3 mJ send + 22.3 mJ receive</w:t>
+              <w:t xml:space="preserve">+22.3 mJ (ECC) / 35.7 mJ (RSA) per packet</w:t>
             </w:r>
           </w:p>
         </w:tc>
@@ -23079,6 +23079,135 @@
                 <w:sz w:val="18"/>
                 <w:szCs w:val="18"/>
               </w:rPr>
+              <w:t xml:space="preserve">Full ECC</w:t>
+            </w:r>
+          </w:p>
+        </w:tc>
+        <w:tc>
+          <w:tcPr>
+            <w:tcW w:type="dxa" w:w="1900"/>
+            <w:tcBorders>
+              <w:top w:val="single" w:color="D9D8D2" w:sz="4"/>
+              <w:left w:val="single" w:color="D9D8D2" w:sz="4"/>
+              <w:bottom w:val="single" w:color="D9D8D2" w:sz="4"/>
+              <w:right w:val="single" w:color="D9D8D2" w:sz="4"/>
+            </w:tcBorders>
+            <w:shd w:fill="F3F6FB" w:color="auto" w:val="clear"/>
+            <w:tcMar>
+              <w:top w:type="dxa" w:w="60"/>
+              <w:left w:type="dxa" w:w="100"/>
+              <w:bottom w:type="dxa" w:w="60"/>
+              <w:right w:type="dxa" w:w="100"/>
+            </w:tcMar>
+          </w:tcPr>
+          <w:p>
+            <w:pPr>
+              <w:jc w:val="left"/>
+            </w:pPr>
+            <w:r>
+              <w:rPr>
+                <w:color w:val="1F1F1D"/>
+                <w:sz w:val="18"/>
+                <w:szCs w:val="18"/>
+              </w:rPr>
+              <w:t xml:space="preserve">ECIES</w:t>
+            </w:r>
+          </w:p>
+        </w:tc>
+        <w:tc>
+          <w:tcPr>
+            <w:tcW w:type="dxa" w:w="2200"/>
+            <w:tcBorders>
+              <w:top w:val="single" w:color="D9D8D2" w:sz="4"/>
+              <w:left w:val="single" w:color="D9D8D2" w:sz="4"/>
+              <w:bottom w:val="single" w:color="D9D8D2" w:sz="4"/>
+              <w:right w:val="single" w:color="D9D8D2" w:sz="4"/>
+            </w:tcBorders>
+            <w:shd w:fill="F3F6FB" w:color="auto" w:val="clear"/>
+            <w:tcMar>
+              <w:top w:type="dxa" w:w="60"/>
+              <w:left w:type="dxa" w:w="100"/>
+              <w:bottom w:type="dxa" w:w="60"/>
+              <w:right w:type="dxa" w:w="100"/>
+            </w:tcMar>
+          </w:tcPr>
+          <w:p>
+            <w:pPr>
+              <w:jc w:val="left"/>
+            </w:pPr>
+            <w:r>
+              <w:rPr>
+                <w:color w:val="1F1F1D"/>
+                <w:sz w:val="18"/>
+                <w:szCs w:val="18"/>
+              </w:rPr>
+              <w:t xml:space="preserve">every packet</w:t>
+            </w:r>
+          </w:p>
+        </w:tc>
+        <w:tc>
+          <w:tcPr>
+            <w:tcW w:type="dxa" w:w="3238"/>
+            <w:tcBorders>
+              <w:top w:val="single" w:color="D9D8D2" w:sz="4"/>
+              <w:left w:val="single" w:color="D9D8D2" w:sz="4"/>
+              <w:bottom w:val="single" w:color="D9D8D2" w:sz="4"/>
+              <w:right w:val="single" w:color="D9D8D2" w:sz="4"/>
+            </w:tcBorders>
+            <w:shd w:fill="F3F6FB" w:color="auto" w:val="clear"/>
+            <w:tcMar>
+              <w:top w:type="dxa" w:w="60"/>
+              <w:left w:type="dxa" w:w="100"/>
+              <w:bottom w:type="dxa" w:w="60"/>
+              <w:right w:type="dxa" w:w="100"/>
+            </w:tcMar>
+          </w:tcPr>
+          <w:p>
+            <w:pPr>
+              <w:jc w:val="left"/>
+            </w:pPr>
+            <w:r>
+              <w:rPr>
+                <w:color w:val="1F1F1D"/>
+                <w:sz w:val="18"/>
+                <w:szCs w:val="18"/>
+              </w:rPr>
+              <w:t xml:space="preserve">22.3 mJ send + 22.3 mJ receive</w:t>
+            </w:r>
+          </w:p>
+        </w:tc>
+      </w:tr>
+      <w:tr>
+        <w:trPr>
+          <w:cantSplit/>
+        </w:trPr>
+        <w:tc>
+          <w:tcPr>
+            <w:tcW w:type="dxa" w:w="2300"/>
+            <w:tcBorders>
+              <w:top w:val="single" w:color="D9D8D2" w:sz="4"/>
+              <w:left w:val="single" w:color="D9D8D2" w:sz="4"/>
+              <w:bottom w:val="single" w:color="D9D8D2" w:sz="4"/>
+              <w:right w:val="single" w:color="D9D8D2" w:sz="4"/>
+            </w:tcBorders>
+            <w:shd w:fill="FFFFFF" w:color="auto" w:val="clear"/>
+            <w:tcMar>
+              <w:top w:type="dxa" w:w="60"/>
+              <w:left w:type="dxa" w:w="100"/>
+              <w:bottom w:type="dxa" w:w="60"/>
+              <w:right w:type="dxa" w:w="100"/>
+            </w:tcMar>
+          </w:tcPr>
+          <w:p>
+            <w:pPr>
+              <w:jc w:val="left"/>
+            </w:pPr>
+            <w:r>
+              <w:rPr>
+                <w:color w:val="1F1F1D"/>
+                <w:sz w:val="18"/>
+                <w:szCs w:val="18"/>
+              </w:rPr>
               <w:t xml:space="preserve">Full RSA</w:t>
             </w:r>
           </w:p>
@@ -23092,7 +23221,7 @@
               <w:bottom w:val="single" w:color="D9D8D2" w:sz="4"/>
               <w:right w:val="single" w:color="D9D8D2" w:sz="4"/>
             </w:tcBorders>
-            <w:shd w:fill="F3F6FB" w:color="auto" w:val="clear"/>
+            <w:shd w:fill="FFFFFF" w:color="auto" w:val="clear"/>
             <w:tcMar>
               <w:top w:type="dxa" w:w="60"/>
               <w:left w:type="dxa" w:w="100"/>
@@ -23123,7 +23252,7 @@
               <w:bottom w:val="single" w:color="D9D8D2" w:sz="4"/>
               <w:right w:val="single" w:color="D9D8D2" w:sz="4"/>
             </w:tcBorders>
-            <w:shd w:fill="F3F6FB" w:color="auto" w:val="clear"/>
+            <w:shd w:fill="FFFFFF" w:color="auto" w:val="clear"/>
             <w:tcMar>
               <w:top w:type="dxa" w:w="60"/>
               <w:left w:type="dxa" w:w="100"/>
@@ -23154,7 +23283,7 @@
               <w:bottom w:val="single" w:color="D9D8D2" w:sz="4"/>
               <w:right w:val="single" w:color="D9D8D2" w:sz="4"/>
             </w:tcBorders>
-            <w:shd w:fill="F3F6FB" w:color="auto" w:val="clear"/>
+            <w:shd w:fill="FFFFFF" w:color="auto" w:val="clear"/>
             <w:tcMar>
               <w:top w:type="dxa" w:w="60"/>
               <w:left w:type="dxa" w:w="100"/>
@@ -24893,6 +25022,478 @@
                 <w:sz w:val="18"/>
                 <w:szCs w:val="18"/>
               </w:rPr>
+              <w:t xml:space="preserve">ECC on CH → sink</w:t>
+            </w:r>
+          </w:p>
+        </w:tc>
+        <w:tc>
+          <w:tcPr>
+            <w:tcW w:type="dxa" w:w="1180"/>
+            <w:tcBorders>
+              <w:top w:val="single" w:color="D9D8D2" w:sz="4"/>
+              <w:left w:val="single" w:color="D9D8D2" w:sz="4"/>
+              <w:bottom w:val="single" w:color="D9D8D2" w:sz="4"/>
+              <w:right w:val="single" w:color="D9D8D2" w:sz="4"/>
+            </w:tcBorders>
+            <w:shd w:fill="FFFFFF" w:color="auto" w:val="clear"/>
+            <w:tcMar>
+              <w:top w:type="dxa" w:w="60"/>
+              <w:left w:type="dxa" w:w="100"/>
+              <w:bottom w:type="dxa" w:w="60"/>
+              <w:right w:type="dxa" w:w="100"/>
+            </w:tcMar>
+          </w:tcPr>
+          <w:p>
+            <w:pPr>
+              <w:jc w:val="center"/>
+            </w:pPr>
+            <w:r>
+              <w:rPr>
+                <w:b w:val="false"/>
+                <w:bCs w:val="false"/>
+                <w:color w:val="1F1F1D"/>
+                <w:sz w:val="18"/>
+                <w:szCs w:val="18"/>
+              </w:rPr>
+              <w:t xml:space="preserve">284 (96.98%)</w:t>
+            </w:r>
+          </w:p>
+        </w:tc>
+        <w:tc>
+          <w:tcPr>
+            <w:tcW w:type="dxa" w:w="1180"/>
+            <w:tcBorders>
+              <w:top w:val="single" w:color="D9D8D2" w:sz="4"/>
+              <w:left w:val="single" w:color="D9D8D2" w:sz="4"/>
+              <w:bottom w:val="single" w:color="D9D8D2" w:sz="4"/>
+              <w:right w:val="single" w:color="D9D8D2" w:sz="4"/>
+            </w:tcBorders>
+            <w:shd w:fill="FFFFFF" w:color="auto" w:val="clear"/>
+            <w:tcMar>
+              <w:top w:type="dxa" w:w="60"/>
+              <w:left w:type="dxa" w:w="100"/>
+              <w:bottom w:type="dxa" w:w="60"/>
+              <w:right w:type="dxa" w:w="100"/>
+            </w:tcMar>
+          </w:tcPr>
+          <w:p>
+            <w:pPr>
+              <w:jc w:val="center"/>
+            </w:pPr>
+            <w:r>
+              <w:rPr>
+                <w:b w:val="false"/>
+                <w:bCs w:val="false"/>
+                <w:color w:val="1F1F1D"/>
+                <w:sz w:val="18"/>
+                <w:szCs w:val="18"/>
+              </w:rPr>
+              <w:t xml:space="preserve">774 (97.68%)</w:t>
+            </w:r>
+          </w:p>
+        </w:tc>
+        <w:tc>
+          <w:tcPr>
+            <w:tcW w:type="dxa" w:w="1180"/>
+            <w:tcBorders>
+              <w:top w:val="single" w:color="D9D8D2" w:sz="4"/>
+              <w:left w:val="single" w:color="D9D8D2" w:sz="4"/>
+              <w:bottom w:val="single" w:color="D9D8D2" w:sz="4"/>
+              <w:right w:val="single" w:color="D9D8D2" w:sz="4"/>
+            </w:tcBorders>
+            <w:shd w:fill="FFFFFF" w:color="auto" w:val="clear"/>
+            <w:tcMar>
+              <w:top w:type="dxa" w:w="60"/>
+              <w:left w:type="dxa" w:w="100"/>
+              <w:bottom w:type="dxa" w:w="60"/>
+              <w:right w:type="dxa" w:w="100"/>
+            </w:tcMar>
+          </w:tcPr>
+          <w:p>
+            <w:pPr>
+              <w:jc w:val="center"/>
+            </w:pPr>
+            <w:r>
+              <w:rPr>
+                <w:b w:val="false"/>
+                <w:bCs w:val="false"/>
+                <w:color w:val="1F1F1D"/>
+                <w:sz w:val="18"/>
+                <w:szCs w:val="18"/>
+              </w:rPr>
+              <w:t xml:space="preserve">736 (96.26%)</w:t>
+            </w:r>
+          </w:p>
+        </w:tc>
+        <w:tc>
+          <w:tcPr>
+            <w:tcW w:type="dxa" w:w="1180"/>
+            <w:tcBorders>
+              <w:top w:val="single" w:color="D9D8D2" w:sz="4"/>
+              <w:left w:val="single" w:color="D9D8D2" w:sz="4"/>
+              <w:bottom w:val="single" w:color="D9D8D2" w:sz="4"/>
+              <w:right w:val="single" w:color="D9D8D2" w:sz="4"/>
+            </w:tcBorders>
+            <w:shd w:fill="FFFFFF" w:color="auto" w:val="clear"/>
+            <w:tcMar>
+              <w:top w:type="dxa" w:w="60"/>
+              <w:left w:type="dxa" w:w="100"/>
+              <w:bottom w:type="dxa" w:w="60"/>
+              <w:right w:type="dxa" w:w="100"/>
+            </w:tcMar>
+          </w:tcPr>
+          <w:p>
+            <w:pPr>
+              <w:jc w:val="center"/>
+            </w:pPr>
+            <w:r>
+              <w:rPr>
+                <w:b w:val="false"/>
+                <w:bCs w:val="false"/>
+                <w:color w:val="1F1F1D"/>
+                <w:sz w:val="18"/>
+                <w:szCs w:val="18"/>
+              </w:rPr>
+              <w:t xml:space="preserve">264 (95.84%)</w:t>
+            </w:r>
+          </w:p>
+        </w:tc>
+        <w:tc>
+          <w:tcPr>
+            <w:tcW w:type="dxa" w:w="1190"/>
+            <w:tcBorders>
+              <w:top w:val="single" w:color="D9D8D2" w:sz="4"/>
+              <w:left w:val="single" w:color="D9D8D2" w:sz="4"/>
+              <w:bottom w:val="single" w:color="D9D8D2" w:sz="4"/>
+              <w:right w:val="single" w:color="D9D8D2" w:sz="4"/>
+            </w:tcBorders>
+            <w:shd w:fill="FFFFFF" w:color="auto" w:val="clear"/>
+            <w:tcMar>
+              <w:top w:type="dxa" w:w="60"/>
+              <w:left w:type="dxa" w:w="100"/>
+              <w:bottom w:type="dxa" w:w="60"/>
+              <w:right w:type="dxa" w:w="100"/>
+            </w:tcMar>
+          </w:tcPr>
+          <w:p>
+            <w:pPr>
+              <w:jc w:val="center"/>
+            </w:pPr>
+            <w:r>
+              <w:rPr>
+                <w:b w:val="false"/>
+                <w:bCs w:val="false"/>
+                <w:color w:val="1F1F1D"/>
+                <w:sz w:val="18"/>
+                <w:szCs w:val="18"/>
+              </w:rPr>
+              <w:t xml:space="preserve">796 (96.81%)</w:t>
+            </w:r>
+          </w:p>
+        </w:tc>
+        <w:tc>
+          <w:tcPr>
+            <w:tcW w:type="dxa" w:w="1828"/>
+            <w:tcBorders>
+              <w:top w:val="single" w:color="D9D8D2" w:sz="4"/>
+              <w:left w:val="single" w:color="D9D8D2" w:sz="4"/>
+              <w:bottom w:val="single" w:color="D9D8D2" w:sz="4"/>
+              <w:right w:val="single" w:color="D9D8D2" w:sz="4"/>
+            </w:tcBorders>
+            <w:shd w:fill="FFFFFF" w:color="auto" w:val="clear"/>
+            <w:tcMar>
+              <w:top w:type="dxa" w:w="60"/>
+              <w:left w:type="dxa" w:w="100"/>
+              <w:bottom w:type="dxa" w:w="60"/>
+              <w:right w:type="dxa" w:w="100"/>
+            </w:tcMar>
+          </w:tcPr>
+          <w:p>
+            <w:pPr>
+              <w:jc w:val="center"/>
+            </w:pPr>
+            <w:r>
+              <w:rPr>
+                <w:b w:val="false"/>
+                <w:bCs w:val="false"/>
+                <w:color w:val="1F1F1D"/>
+                <w:sz w:val="18"/>
+                <w:szCs w:val="18"/>
+              </w:rPr>
+              <w:t xml:space="preserve">716 (96.01%)</w:t>
+            </w:r>
+          </w:p>
+        </w:tc>
+      </w:tr>
+      <w:tr>
+        <w:trPr>
+          <w:cantSplit/>
+        </w:trPr>
+        <w:tc>
+          <w:tcPr>
+            <w:tcW w:type="dxa" w:w="1900"/>
+            <w:tcBorders>
+              <w:top w:val="single" w:color="D9D8D2" w:sz="4"/>
+              <w:left w:val="single" w:color="D9D8D2" w:sz="4"/>
+              <w:bottom w:val="single" w:color="D9D8D2" w:sz="4"/>
+              <w:right w:val="single" w:color="D9D8D2" w:sz="4"/>
+            </w:tcBorders>
+            <w:shd w:fill="F3F6FB" w:color="auto" w:val="clear"/>
+            <w:tcMar>
+              <w:top w:type="dxa" w:w="60"/>
+              <w:left w:type="dxa" w:w="100"/>
+              <w:bottom w:type="dxa" w:w="60"/>
+              <w:right w:type="dxa" w:w="100"/>
+            </w:tcMar>
+          </w:tcPr>
+          <w:p>
+            <w:pPr>
+              <w:jc w:val="left"/>
+            </w:pPr>
+            <w:r>
+              <w:rPr>
+                <w:b w:val="false"/>
+                <w:bCs w:val="false"/>
+                <w:color w:val="1F1F1D"/>
+                <w:sz w:val="18"/>
+                <w:szCs w:val="18"/>
+              </w:rPr>
+              <w:t xml:space="preserve">RSA on CH → sink</w:t>
+            </w:r>
+          </w:p>
+        </w:tc>
+        <w:tc>
+          <w:tcPr>
+            <w:tcW w:type="dxa" w:w="1180"/>
+            <w:tcBorders>
+              <w:top w:val="single" w:color="D9D8D2" w:sz="4"/>
+              <w:left w:val="single" w:color="D9D8D2" w:sz="4"/>
+              <w:bottom w:val="single" w:color="D9D8D2" w:sz="4"/>
+              <w:right w:val="single" w:color="D9D8D2" w:sz="4"/>
+            </w:tcBorders>
+            <w:shd w:fill="F3F6FB" w:color="auto" w:val="clear"/>
+            <w:tcMar>
+              <w:top w:type="dxa" w:w="60"/>
+              <w:left w:type="dxa" w:w="100"/>
+              <w:bottom w:type="dxa" w:w="60"/>
+              <w:right w:type="dxa" w:w="100"/>
+            </w:tcMar>
+          </w:tcPr>
+          <w:p>
+            <w:pPr>
+              <w:jc w:val="center"/>
+            </w:pPr>
+            <w:r>
+              <w:rPr>
+                <w:b w:val="false"/>
+                <w:bCs w:val="false"/>
+                <w:color w:val="1F1F1D"/>
+                <w:sz w:val="18"/>
+                <w:szCs w:val="18"/>
+              </w:rPr>
+              <w:t xml:space="preserve">201 (95.32%)</w:t>
+            </w:r>
+          </w:p>
+        </w:tc>
+        <w:tc>
+          <w:tcPr>
+            <w:tcW w:type="dxa" w:w="1180"/>
+            <w:tcBorders>
+              <w:top w:val="single" w:color="D9D8D2" w:sz="4"/>
+              <w:left w:val="single" w:color="D9D8D2" w:sz="4"/>
+              <w:bottom w:val="single" w:color="D9D8D2" w:sz="4"/>
+              <w:right w:val="single" w:color="D9D8D2" w:sz="4"/>
+            </w:tcBorders>
+            <w:shd w:fill="F3F6FB" w:color="auto" w:val="clear"/>
+            <w:tcMar>
+              <w:top w:type="dxa" w:w="60"/>
+              <w:left w:type="dxa" w:w="100"/>
+              <w:bottom w:type="dxa" w:w="60"/>
+              <w:right w:type="dxa" w:w="100"/>
+            </w:tcMar>
+          </w:tcPr>
+          <w:p>
+            <w:pPr>
+              <w:jc w:val="center"/>
+            </w:pPr>
+            <w:r>
+              <w:rPr>
+                <w:b w:val="false"/>
+                <w:bCs w:val="false"/>
+                <w:color w:val="1F1F1D"/>
+                <w:sz w:val="18"/>
+                <w:szCs w:val="18"/>
+              </w:rPr>
+              <w:t xml:space="preserve">674 (94.46%)</w:t>
+            </w:r>
+          </w:p>
+        </w:tc>
+        <w:tc>
+          <w:tcPr>
+            <w:tcW w:type="dxa" w:w="1180"/>
+            <w:tcBorders>
+              <w:top w:val="single" w:color="D9D8D2" w:sz="4"/>
+              <w:left w:val="single" w:color="D9D8D2" w:sz="4"/>
+              <w:bottom w:val="single" w:color="D9D8D2" w:sz="4"/>
+              <w:right w:val="single" w:color="D9D8D2" w:sz="4"/>
+            </w:tcBorders>
+            <w:shd w:fill="F3F6FB" w:color="auto" w:val="clear"/>
+            <w:tcMar>
+              <w:top w:type="dxa" w:w="60"/>
+              <w:left w:type="dxa" w:w="100"/>
+              <w:bottom w:type="dxa" w:w="60"/>
+              <w:right w:type="dxa" w:w="100"/>
+            </w:tcMar>
+          </w:tcPr>
+          <w:p>
+            <w:pPr>
+              <w:jc w:val="center"/>
+            </w:pPr>
+            <w:r>
+              <w:rPr>
+                <w:b w:val="false"/>
+                <w:bCs w:val="false"/>
+                <w:color w:val="1F1F1D"/>
+                <w:sz w:val="18"/>
+                <w:szCs w:val="18"/>
+              </w:rPr>
+              <w:t xml:space="preserve">371 (96.25%)</w:t>
+            </w:r>
+          </w:p>
+        </w:tc>
+        <w:tc>
+          <w:tcPr>
+            <w:tcW w:type="dxa" w:w="1180"/>
+            <w:tcBorders>
+              <w:top w:val="single" w:color="D9D8D2" w:sz="4"/>
+              <w:left w:val="single" w:color="D9D8D2" w:sz="4"/>
+              <w:bottom w:val="single" w:color="D9D8D2" w:sz="4"/>
+              <w:right w:val="single" w:color="D9D8D2" w:sz="4"/>
+            </w:tcBorders>
+            <w:shd w:fill="F3F6FB" w:color="auto" w:val="clear"/>
+            <w:tcMar>
+              <w:top w:type="dxa" w:w="60"/>
+              <w:left w:type="dxa" w:w="100"/>
+              <w:bottom w:type="dxa" w:w="60"/>
+              <w:right w:type="dxa" w:w="100"/>
+            </w:tcMar>
+          </w:tcPr>
+          <w:p>
+            <w:pPr>
+              <w:jc w:val="center"/>
+            </w:pPr>
+            <w:r>
+              <w:rPr>
+                <w:b w:val="false"/>
+                <w:bCs w:val="false"/>
+                <w:color w:val="1F1F1D"/>
+                <w:sz w:val="18"/>
+                <w:szCs w:val="18"/>
+              </w:rPr>
+              <w:t xml:space="preserve">181 (94.15%)</w:t>
+            </w:r>
+          </w:p>
+        </w:tc>
+        <w:tc>
+          <w:tcPr>
+            <w:tcW w:type="dxa" w:w="1190"/>
+            <w:tcBorders>
+              <w:top w:val="single" w:color="D9D8D2" w:sz="4"/>
+              <w:left w:val="single" w:color="D9D8D2" w:sz="4"/>
+              <w:bottom w:val="single" w:color="D9D8D2" w:sz="4"/>
+              <w:right w:val="single" w:color="D9D8D2" w:sz="4"/>
+            </w:tcBorders>
+            <w:shd w:fill="F3F6FB" w:color="auto" w:val="clear"/>
+            <w:tcMar>
+              <w:top w:type="dxa" w:w="60"/>
+              <w:left w:type="dxa" w:w="100"/>
+              <w:bottom w:type="dxa" w:w="60"/>
+              <w:right w:type="dxa" w:w="100"/>
+            </w:tcMar>
+          </w:tcPr>
+          <w:p>
+            <w:pPr>
+              <w:jc w:val="center"/>
+            </w:pPr>
+            <w:r>
+              <w:rPr>
+                <w:b w:val="false"/>
+                <w:bCs w:val="false"/>
+                <w:color w:val="1F1F1D"/>
+                <w:sz w:val="18"/>
+                <w:szCs w:val="18"/>
+              </w:rPr>
+              <w:t xml:space="preserve">674 (95.94%)</w:t>
+            </w:r>
+          </w:p>
+        </w:tc>
+        <w:tc>
+          <w:tcPr>
+            <w:tcW w:type="dxa" w:w="1828"/>
+            <w:tcBorders>
+              <w:top w:val="single" w:color="D9D8D2" w:sz="4"/>
+              <w:left w:val="single" w:color="D9D8D2" w:sz="4"/>
+              <w:bottom w:val="single" w:color="D9D8D2" w:sz="4"/>
+              <w:right w:val="single" w:color="D9D8D2" w:sz="4"/>
+            </w:tcBorders>
+            <w:shd w:fill="F3F6FB" w:color="auto" w:val="clear"/>
+            <w:tcMar>
+              <w:top w:type="dxa" w:w="60"/>
+              <w:left w:type="dxa" w:w="100"/>
+              <w:bottom w:type="dxa" w:w="60"/>
+              <w:right w:type="dxa" w:w="100"/>
+            </w:tcMar>
+          </w:tcPr>
+          <w:p>
+            <w:pPr>
+              <w:jc w:val="center"/>
+            </w:pPr>
+            <w:r>
+              <w:rPr>
+                <w:b w:val="false"/>
+                <w:bCs w:val="false"/>
+                <w:color w:val="1F1F1D"/>
+                <w:sz w:val="18"/>
+                <w:szCs w:val="18"/>
+              </w:rPr>
+              <w:t xml:space="preserve">336 (95.34%)</w:t>
+            </w:r>
+          </w:p>
+        </w:tc>
+      </w:tr>
+      <w:tr>
+        <w:trPr>
+          <w:cantSplit/>
+        </w:trPr>
+        <w:tc>
+          <w:tcPr>
+            <w:tcW w:type="dxa" w:w="1900"/>
+            <w:tcBorders>
+              <w:top w:val="single" w:color="D9D8D2" w:sz="4"/>
+              <w:left w:val="single" w:color="D9D8D2" w:sz="4"/>
+              <w:bottom w:val="single" w:color="D9D8D2" w:sz="4"/>
+              <w:right w:val="single" w:color="D9D8D2" w:sz="4"/>
+            </w:tcBorders>
+            <w:shd w:fill="FFFFFF" w:color="auto" w:val="clear"/>
+            <w:tcMar>
+              <w:top w:type="dxa" w:w="60"/>
+              <w:left w:type="dxa" w:w="100"/>
+              <w:bottom w:type="dxa" w:w="60"/>
+              <w:right w:type="dxa" w:w="100"/>
+            </w:tcMar>
+          </w:tcPr>
+          <w:p>
+            <w:pPr>
+              <w:jc w:val="left"/>
+            </w:pPr>
+            <w:r>
+              <w:rPr>
+                <w:b w:val="false"/>
+                <w:bCs w:val="false"/>
+                <w:color w:val="1F1F1D"/>
+                <w:sz w:val="18"/>
+                <w:szCs w:val="18"/>
+              </w:rPr>
               <w:t xml:space="preserve">Full ECC</w:t>
             </w:r>
           </w:p>
@@ -25338,7 +25939,7 @@
         <w:spacing w:after="120"/>
       </w:pPr>
       <w:r>
-        <w:t xml:space="preserve">FND in rounds, PDR in brackets.</w:t>
+        <w:t xml:space="preserve">FND in rounds, PDR in brackets. The v8 column uses the v8-Chain code: at the centre it equals v8 unless the packets to the sink carry a public-key cost; then the energy-aware relay counts that cost and CHs relay to save it.</w:t>
       </w:r>
     </w:p>
     <w:p>
@@ -25350,7 +25951,7 @@
       <w:r>
         <w:drawing>
           <wp:inline distT="0" distB="0" distL="0" distR="0">
-            <wp:extent cx="5943600" cy="2524125"/>
+            <wp:extent cx="5943600" cy="2247900"/>
             <wp:effectExtent t="0" r="0" b="0" l="0"/>
             <wp:docPr id="1" name="s2_sec_center.png" descr="Figure 33 — FND with each security scheme, BS at the centre." title="Figure 33 — FND with each security scheme, BS at the centre."/>
             <wp:cNvGraphicFramePr>
@@ -25375,7 +25976,7 @@
                   <pic:spPr bwMode="auto">
                     <a:xfrm>
                       <a:off x="0" y="0"/>
-                      <a:ext cx="5943600" cy="2524125"/>
+                      <a:ext cx="5943600" cy="2247900"/>
                     </a:xfrm>
                     <a:prstGeom prst="rect">
                       <a:avLst/>
@@ -25413,7 +26014,7 @@
       <w:r>
         <w:drawing>
           <wp:inline distT="0" distB="0" distL="0" distR="0">
-            <wp:extent cx="5943600" cy="2524125"/>
+            <wp:extent cx="5943600" cy="2247900"/>
             <wp:effectExtent t="0" r="0" b="0" l="0"/>
             <wp:docPr id="1" name="s2_sec_far.png" descr="Figure 34 — FND with each security scheme, BS far away." title="Figure 34 — FND with each security scheme, BS far away."/>
             <wp:cNvGraphicFramePr>
@@ -25438,7 +26039,7 @@
                   <pic:spPr bwMode="auto">
                     <a:xfrm>
                       <a:off x="0" y="0"/>
-                      <a:ext cx="5943600" cy="2524125"/>
+                      <a:ext cx="5943600" cy="2247900"/>
                     </a:xfrm>
                     <a:prstGeom prst="rect">
                       <a:avLst/>
@@ -25476,7 +26077,7 @@
       <w:r>
         <w:drawing>
           <wp:inline distT="0" distB="0" distL="0" distR="0">
-            <wp:extent cx="5943600" cy="2324100"/>
+            <wp:extent cx="5943600" cy="2066925"/>
             <wp:effectExtent t="0" r="0" b="0" l="0"/>
             <wp:docPr id="1" name="s3_sec_pdr.png" descr="Figure 35 — PDR with each security scheme, BS at the centre." title="Figure 35 — PDR with each security scheme, BS at the centre."/>
             <wp:cNvGraphicFramePr>
@@ -25501,7 +26102,7 @@
                   <pic:spPr bwMode="auto">
                     <a:xfrm>
                       <a:off x="0" y="0"/>
-                      <a:ext cx="5943600" cy="2324100"/>
+                      <a:ext cx="5943600" cy="2066925"/>
                     </a:xfrm>
                     <a:prstGeom prst="rect">
                       <a:avLst/>
@@ -25562,6 +26163,19 @@
       </w:pPr>
       <w:r>
         <w:t xml:space="preserve">Use the public key once, not at every CH election: authenticating every new CH with RSA/ECC cuts FND by 47 – 71 %; once per node (then symmetric credentials from the sink) costs v8 only 18 %.</w:t>
+      </w:r>
+    </w:p>
+    <w:p>
+      <w:pPr>
+        <w:pStyle w:val="ListParagraph"/>
+        <w:numPr>
+          <w:ilvl w:val="0"/>
+          <w:numId w:val="3"/>
+        </w:numPr>
+        <w:spacing w:after="60" w:line="290"/>
+      </w:pPr>
+      <w:r>
+        <w:t xml:space="preserve">Lighter than full RSA — ECC only on the packets to the sink (members keep AES): the sender only encrypts and the sink decrypts, so the network works again (PDR ≈ 96 %), but 22.3 mJ on every packet to the sink still cuts FND by about 70 % (v8 736). Protocols that send fewer packets to the sink suffer less: PEGASIS (one leader) 774; v8 lets its CHs relay to a CH nearer the sink to save ECC operations; LEACH 284. ECC is best used once per node for the key agreement.</w:t>
       </w:r>
     </w:p>
     <w:p>

</xml_diff>

<commit_message>
ECC + AES security scenarios kept in code/results; security removed from deck and report until the routing protocol is approved
Co-Authored-By: Claude Opus 5.5 <noreply@anthropic.com>
Claude-Session: https://claude.ai/code/session_019rZdtfEbJpAbmcB9G79J6K
</commit_message>
<xml_diff>
--- a/thesis-final/SOTA_Report_v8-Chain.docx
+++ b/thesis-final/SOTA_Report_v8-Chain.docx
@@ -231,7 +231,7 @@
           <w:sz w:val="23"/>
           <w:szCs w:val="23"/>
         </w:rPr>
-        <w:t xml:space="preserve">9. Security — the hybrid scheme of the proposal</w:t>
+        <w:t xml:space="preserve">9. Limitations</w:t>
       </w:r>
     </w:p>
     <w:p>
@@ -247,23 +247,7 @@
           <w:sz w:val="23"/>
           <w:szCs w:val="23"/>
         </w:rPr>
-        <w:t xml:space="preserve">10. Limitations</w:t>
-      </w:r>
-    </w:p>
-    <w:p>
-      <w:pPr>
-        <w:spacing w:after="90"/>
-        <w:ind w:left="0"/>
-      </w:pPr>
-      <w:r>
-        <w:rPr>
-          <w:b/>
-          <w:bCs/>
-          <w:color w:val="14213D"/>
-          <w:sz w:val="23"/>
-          <w:szCs w:val="23"/>
-        </w:rPr>
-        <w:t xml:space="preserve">11. Conclusion</w:t>
+        <w:t xml:space="preserve">10. Conclusion</w:t>
       </w:r>
     </w:p>
     <w:p>
@@ -370,7 +354,7 @@
         <w:spacing w:after="60" w:line="290"/>
       </w:pPr>
       <w:r>
-        <w:t xml:space="preserve">Tested every protocol with the BS at the centre and far away, and tested the hybrid cryptography of the proposal (AES + RSA / ECC) against no security and full RSA.</w:t>
+        <w:t xml:space="preserve">Tested every protocol with the BS at the centre and far away.</w:t>
       </w:r>
     </w:p>
     <w:tbl>
@@ -22008,4265 +21992,7 @@
         <w:pStyle w:val="Heading1"/>
       </w:pPr>
       <w:r>
-        <w:t xml:space="preserve">9. Security — the hybrid scheme of the proposal</w:t>
-      </w:r>
-    </w:p>
-    <w:p>
-      <w:pPr>
-        <w:spacing w:after="120" w:line="300"/>
-      </w:pPr>
-      <w:r>
-        <w:t xml:space="preserve">The thesis proposal: symmetric cryptography inside the cluster, public-key cryptography only between the CH and the sink, the sink authenticates the CHs and gives them credentials; compare with no security and with full RSA. We added these costs to LEACH, PEGASIS and v8 / v8-Chain with compiler flags (all 0 by default, so every other result is unchanged).</w:t>
-      </w:r>
-    </w:p>
-    <w:p>
-      <w:pPr>
-        <w:keepNext/>
-        <w:spacing w:after="40" w:before="120"/>
-        <w:jc w:val="center"/>
-      </w:pPr>
-      <w:r>
-        <w:drawing>
-          <wp:inline distT="0" distB="0" distL="0" distR="0">
-            <wp:extent cx="5486400" cy="2438400"/>
-            <wp:effectExtent t="0" r="0" b="0" l="0"/>
-            <wp:docPr id="1" name="s4_sec_scheme.png" descr="Figure 31 — The hybrid scheme: AES + MIC in the cluster, public key only for CH authentication with the sink." title="Figure 31 — The hybrid scheme: AES + MIC in the cluster, public key only for CH authentication with the sink."/>
-            <wp:cNvGraphicFramePr>
-              <a:graphicFrameLocks xmlns:a="http://schemas.openxmlformats.org/drawingml/2006/main" noChangeAspect="1"/>
-            </wp:cNvGraphicFramePr>
-            <a:graphic xmlns:a="http://schemas.openxmlformats.org/drawingml/2006/main">
-              <a:graphicData uri="http://schemas.openxmlformats.org/drawingml/2006/picture">
-                <pic:pic xmlns:pic="http://schemas.openxmlformats.org/drawingml/2006/picture">
-                  <pic:nvPicPr>
-                    <pic:cNvPr id="0" name="" descr=""/>
-                    <pic:cNvPicPr>
-                      <a:picLocks noChangeAspect="1" noChangeArrowheads="1"/>
-                    </pic:cNvPicPr>
-                  </pic:nvPicPr>
-                  <pic:blipFill>
-                    <a:blip r:embed="rId49" cstate="none"/>
-                    <a:srcRect/>
-                    <a:stretch>
-                      <a:fillRect/>
-                    </a:stretch>
-                  </pic:blipFill>
-                  <pic:spPr bwMode="auto">
-                    <a:xfrm>
-                      <a:off x="0" y="0"/>
-                      <a:ext cx="5486400" cy="2438400"/>
-                    </a:xfrm>
-                    <a:prstGeom prst="rect">
-                      <a:avLst/>
-                    </a:prstGeom>
-                  </pic:spPr>
-                </pic:pic>
-              </a:graphicData>
-            </a:graphic>
-          </wp:inline>
-        </w:drawing>
-      </w:r>
-    </w:p>
-    <w:p>
-      <w:pPr>
-        <w:spacing w:after="200" w:before="60"/>
-        <w:jc w:val="center"/>
-      </w:pPr>
-      <w:r>
-        <w:rPr>
-          <w:i/>
-          <w:iCs/>
-          <w:color w:val="5F5E5A"/>
-          <w:sz w:val="18"/>
-          <w:szCs w:val="18"/>
-        </w:rPr>
-        <w:t xml:space="preserve">Figure 31 — The hybrid scheme: AES + MIC in the cluster, public key only for CH authentication with the sink.</w:t>
-      </w:r>
-    </w:p>
-    <w:p>
-      <w:pPr>
-        <w:keepNext/>
-        <w:spacing w:after="40" w:before="120"/>
-        <w:jc w:val="center"/>
-      </w:pPr>
-      <w:r>
-        <w:drawing>
-          <wp:inline distT="0" distB="0" distL="0" distR="0">
-            <wp:extent cx="4572000" cy="609600"/>
-            <wp:effectExtent t="0" r="0" b="0" l="0"/>
-            <wp:docPr id="1" name="eq_security.png" descr="eq_security.png" title="eq_security.png"/>
-            <wp:cNvGraphicFramePr>
-              <a:graphicFrameLocks xmlns:a="http://schemas.openxmlformats.org/drawingml/2006/main" noChangeAspect="1"/>
-            </wp:cNvGraphicFramePr>
-            <a:graphic xmlns:a="http://schemas.openxmlformats.org/drawingml/2006/main">
-              <a:graphicData uri="http://schemas.openxmlformats.org/drawingml/2006/picture">
-                <pic:pic xmlns:pic="http://schemas.openxmlformats.org/drawingml/2006/picture">
-                  <pic:nvPicPr>
-                    <pic:cNvPr id="0" name="" descr=""/>
-                    <pic:cNvPicPr>
-                      <a:picLocks noChangeAspect="1" noChangeArrowheads="1"/>
-                    </pic:cNvPicPr>
-                  </pic:nvPicPr>
-                  <pic:blipFill>
-                    <a:blip r:embed="rId50" cstate="none"/>
-                    <a:srcRect/>
-                    <a:stretch>
-                      <a:fillRect/>
-                    </a:stretch>
-                  </pic:blipFill>
-                  <pic:spPr bwMode="auto">
-                    <a:xfrm>
-                      <a:off x="0" y="0"/>
-                      <a:ext cx="4572000" cy="609600"/>
-                    </a:xfrm>
-                    <a:prstGeom prst="rect">
-                      <a:avLst/>
-                    </a:prstGeom>
-                  </pic:spPr>
-                </pic:pic>
-              </a:graphicData>
-            </a:graphic>
-          </wp:inline>
-        </w:drawing>
-      </w:r>
-    </w:p>
-    <w:p>
-      <w:pPr>
-        <w:pStyle w:val="Heading2"/>
-      </w:pPr>
-      <w:r>
-        <w:t xml:space="preserve">9.1 Why not RSA for everything</w:t>
-      </w:r>
-    </w:p>
-    <w:p>
-      <w:pPr>
-        <w:keepNext/>
-        <w:spacing w:after="40" w:before="120"/>
-        <w:jc w:val="center"/>
-      </w:pPr>
-      <w:r>
-        <w:drawing>
-          <wp:inline distT="0" distB="0" distL="0" distR="0">
-            <wp:extent cx="5762625" cy="2009775"/>
-            <wp:effectExtent t="0" r="0" b="0" l="0"/>
-            <wp:docPr id="1" name="s5_sec_ops.png" descr="Figure 32 — Energy of one operation on an 8-bit sensor MCU (ATmega128) [16], log scale." title="Figure 32 — Energy of one operation on an 8-bit sensor MCU (ATmega128) [16], log scale."/>
-            <wp:cNvGraphicFramePr>
-              <a:graphicFrameLocks xmlns:a="http://schemas.openxmlformats.org/drawingml/2006/main" noChangeAspect="1"/>
-            </wp:cNvGraphicFramePr>
-            <a:graphic xmlns:a="http://schemas.openxmlformats.org/drawingml/2006/main">
-              <a:graphicData uri="http://schemas.openxmlformats.org/drawingml/2006/picture">
-                <pic:pic xmlns:pic="http://schemas.openxmlformats.org/drawingml/2006/picture">
-                  <pic:nvPicPr>
-                    <pic:cNvPr id="0" name="" descr=""/>
-                    <pic:cNvPicPr>
-                      <a:picLocks noChangeAspect="1" noChangeArrowheads="1"/>
-                    </pic:cNvPicPr>
-                  </pic:nvPicPr>
-                  <pic:blipFill>
-                    <a:blip r:embed="rId51" cstate="none"/>
-                    <a:srcRect/>
-                    <a:stretch>
-                      <a:fillRect/>
-                    </a:stretch>
-                  </pic:blipFill>
-                  <pic:spPr bwMode="auto">
-                    <a:xfrm>
-                      <a:off x="0" y="0"/>
-                      <a:ext cx="5762625" cy="2009775"/>
-                    </a:xfrm>
-                    <a:prstGeom prst="rect">
-                      <a:avLst/>
-                    </a:prstGeom>
-                  </pic:spPr>
-                </pic:pic>
-              </a:graphicData>
-            </a:graphic>
-          </wp:inline>
-        </w:drawing>
-      </w:r>
-    </w:p>
-    <w:p>
-      <w:pPr>
-        <w:spacing w:after="200" w:before="60"/>
-        <w:jc w:val="center"/>
-      </w:pPr>
-      <w:r>
-        <w:rPr>
-          <w:i/>
-          <w:iCs/>
-          <w:color w:val="5F5E5A"/>
-          <w:sz w:val="18"/>
-          <w:szCs w:val="18"/>
-        </w:rPr>
-        <w:t xml:space="preserve">Figure 32 — Energy of one operation on an 8-bit sensor MCU (ATmega128) [16], log scale.</w:t>
-      </w:r>
-    </w:p>
-    <w:p>
-      <w:pPr>
-        <w:pStyle w:val="ListParagraph"/>
-        <w:numPr>
-          <w:ilvl w:val="0"/>
-          <w:numId w:val="3"/>
-        </w:numPr>
-        <w:spacing w:after="60" w:line="290"/>
-      </w:pPr>
-      <w:r>
-        <w:t xml:space="preserve">RSA-decrypting one 2000-bit reading (3 RSA-1024 blocks) costs 912 mJ — more than the whole 500 mJ battery.</w:t>
-      </w:r>
-    </w:p>
-    <w:p>
-      <w:pPr>
-        <w:pStyle w:val="ListParagraph"/>
-        <w:numPr>
-          <w:ilvl w:val="0"/>
-          <w:numId w:val="3"/>
-        </w:numPr>
-        <w:spacing w:after="60" w:line="290"/>
-      </w:pPr>
-      <w:r>
-        <w:t xml:space="preserve">AES on the same reading costs about 10 µJ (≈ 90 000 times less).</w:t>
-      </w:r>
-    </w:p>
-    <w:p>
-      <w:pPr>
-        <w:pStyle w:val="ListParagraph"/>
-        <w:numPr>
-          <w:ilvl w:val="0"/>
-          <w:numId w:val="3"/>
-        </w:numPr>
-        <w:spacing w:after="60" w:line="290"/>
-      </w:pPr>
-      <w:r>
-        <w:t xml:space="preserve">With the heavy private-key work done by the mains-powered sink, the node side of RSA key transport costs 15.4 mJ; ECDH-160 costs 22.3 mJ.</w:t>
-      </w:r>
-    </w:p>
-    <w:p>
-      <w:pPr>
-        <w:pStyle w:val="Heading2"/>
-      </w:pPr>
-      <w:r>
-        <w:t xml:space="preserve">9.2 Scenarios</w:t>
-      </w:r>
-    </w:p>
-    <w:tbl>
-      <w:tblPr>
-        <w:tblW w:type="dxa" w:w="9638"/>
-        <w:tblBorders>
-          <w:top w:val="single" w:color="auto" w:sz="4"/>
-          <w:left w:val="single" w:color="auto" w:sz="4"/>
-          <w:bottom w:val="single" w:color="auto" w:sz="4"/>
-          <w:right w:val="single" w:color="auto" w:sz="4"/>
-          <w:insideH w:val="single" w:color="auto" w:sz="4"/>
-          <w:insideV w:val="single" w:color="auto" w:sz="4"/>
-        </w:tblBorders>
-      </w:tblPr>
-      <w:tblGrid>
-        <w:gridCol w:w="2300"/>
-        <w:gridCol w:w="1900"/>
-        <w:gridCol w:w="2200"/>
-        <w:gridCol w:w="3238"/>
-      </w:tblGrid>
-      <w:tr>
-        <w:trPr>
-          <w:cantSplit/>
-          <w:tblHeader/>
-        </w:trPr>
-        <w:tc>
-          <w:tcPr>
-            <w:tcW w:type="dxa" w:w="2300"/>
-            <w:tcBorders>
-              <w:top w:val="single" w:color="D9D8D2" w:sz="4"/>
-              <w:left w:val="single" w:color="D9D8D2" w:sz="4"/>
-              <w:bottom w:val="single" w:color="D9D8D2" w:sz="4"/>
-              <w:right w:val="single" w:color="D9D8D2" w:sz="4"/>
-            </w:tcBorders>
-            <w:shd w:fill="14213D" w:color="auto" w:val="clear"/>
-            <w:tcMar>
-              <w:top w:type="dxa" w:w="60"/>
-              <w:left w:type="dxa" w:w="100"/>
-              <w:bottom w:type="dxa" w:w="60"/>
-              <w:right w:type="dxa" w:w="100"/>
-            </w:tcMar>
-          </w:tcPr>
-          <w:p>
-            <w:pPr>
-              <w:jc w:val="left"/>
-            </w:pPr>
-            <w:r>
-              <w:rPr>
-                <w:b/>
-                <w:bCs/>
-                <w:color w:val="FFFFFF"/>
-                <w:sz w:val="18"/>
-                <w:szCs w:val="18"/>
-              </w:rPr>
-              <w:t xml:space="preserve">Scenario</w:t>
-            </w:r>
-          </w:p>
-        </w:tc>
-        <w:tc>
-          <w:tcPr>
-            <w:tcW w:type="dxa" w:w="1900"/>
-            <w:tcBorders>
-              <w:top w:val="single" w:color="D9D8D2" w:sz="4"/>
-              <w:left w:val="single" w:color="D9D8D2" w:sz="4"/>
-              <w:bottom w:val="single" w:color="D9D8D2" w:sz="4"/>
-              <w:right w:val="single" w:color="D9D8D2" w:sz="4"/>
-            </w:tcBorders>
-            <w:shd w:fill="14213D" w:color="auto" w:val="clear"/>
-            <w:tcMar>
-              <w:top w:type="dxa" w:w="60"/>
-              <w:left w:type="dxa" w:w="100"/>
-              <w:bottom w:type="dxa" w:w="60"/>
-              <w:right w:type="dxa" w:w="100"/>
-            </w:tcMar>
-          </w:tcPr>
-          <w:p>
-            <w:pPr>
-              <w:jc w:val="left"/>
-            </w:pPr>
-            <w:r>
-              <w:rPr>
-                <w:b/>
-                <w:bCs/>
-                <w:color w:val="FFFFFF"/>
-                <w:sz w:val="18"/>
-                <w:szCs w:val="18"/>
-              </w:rPr>
-              <w:t xml:space="preserve">Every message</w:t>
-            </w:r>
-          </w:p>
-        </w:tc>
-        <w:tc>
-          <w:tcPr>
-            <w:tcW w:type="dxa" w:w="2200"/>
-            <w:tcBorders>
-              <w:top w:val="single" w:color="D9D8D2" w:sz="4"/>
-              <w:left w:val="single" w:color="D9D8D2" w:sz="4"/>
-              <w:bottom w:val="single" w:color="D9D8D2" w:sz="4"/>
-              <w:right w:val="single" w:color="D9D8D2" w:sz="4"/>
-            </w:tcBorders>
-            <w:shd w:fill="14213D" w:color="auto" w:val="clear"/>
-            <w:tcMar>
-              <w:top w:type="dxa" w:w="60"/>
-              <w:left w:type="dxa" w:w="100"/>
-              <w:bottom w:type="dxa" w:w="60"/>
-              <w:right w:type="dxa" w:w="100"/>
-            </w:tcMar>
-          </w:tcPr>
-          <w:p>
-            <w:pPr>
-              <w:jc w:val="left"/>
-            </w:pPr>
-            <w:r>
-              <w:rPr>
-                <w:b/>
-                <w:bCs/>
-                <w:color w:val="FFFFFF"/>
-                <w:sz w:val="18"/>
-                <w:szCs w:val="18"/>
-              </w:rPr>
-              <w:t xml:space="preserve">Public key</w:t>
-            </w:r>
-          </w:p>
-        </w:tc>
-        <w:tc>
-          <w:tcPr>
-            <w:tcW w:type="dxa" w:w="3238"/>
-            <w:tcBorders>
-              <w:top w:val="single" w:color="D9D8D2" w:sz="4"/>
-              <w:left w:val="single" w:color="D9D8D2" w:sz="4"/>
-              <w:bottom w:val="single" w:color="D9D8D2" w:sz="4"/>
-              <w:right w:val="single" w:color="D9D8D2" w:sz="4"/>
-            </w:tcBorders>
-            <w:shd w:fill="14213D" w:color="auto" w:val="clear"/>
-            <w:tcMar>
-              <w:top w:type="dxa" w:w="60"/>
-              <w:left w:type="dxa" w:w="100"/>
-              <w:bottom w:type="dxa" w:w="60"/>
-              <w:right w:type="dxa" w:w="100"/>
-            </w:tcMar>
-          </w:tcPr>
-          <w:p>
-            <w:pPr>
-              <w:jc w:val="left"/>
-            </w:pPr>
-            <w:r>
-              <w:rPr>
-                <w:b/>
-                <w:bCs/>
-                <w:color w:val="FFFFFF"/>
-                <w:sz w:val="18"/>
-                <w:szCs w:val="18"/>
-              </w:rPr>
-              <w:t xml:space="preserve">What a node pays</w:t>
-            </w:r>
-          </w:p>
-        </w:tc>
-      </w:tr>
-      <w:tr>
-        <w:trPr>
-          <w:cantSplit/>
-        </w:trPr>
-        <w:tc>
-          <w:tcPr>
-            <w:tcW w:type="dxa" w:w="2300"/>
-            <w:tcBorders>
-              <w:top w:val="single" w:color="D9D8D2" w:sz="4"/>
-              <w:left w:val="single" w:color="D9D8D2" w:sz="4"/>
-              <w:bottom w:val="single" w:color="D9D8D2" w:sz="4"/>
-              <w:right w:val="single" w:color="D9D8D2" w:sz="4"/>
-            </w:tcBorders>
-            <w:shd w:fill="FFFFFF" w:color="auto" w:val="clear"/>
-            <w:tcMar>
-              <w:top w:type="dxa" w:w="60"/>
-              <w:left w:type="dxa" w:w="100"/>
-              <w:bottom w:type="dxa" w:w="60"/>
-              <w:right w:type="dxa" w:w="100"/>
-            </w:tcMar>
-          </w:tcPr>
-          <w:p>
-            <w:pPr>
-              <w:jc w:val="left"/>
-            </w:pPr>
-            <w:r>
-              <w:rPr>
-                <w:color w:val="1F1F1D"/>
-                <w:sz w:val="18"/>
-                <w:szCs w:val="18"/>
-              </w:rPr>
-              <w:t xml:space="preserve">No security</w:t>
-            </w:r>
-          </w:p>
-        </w:tc>
-        <w:tc>
-          <w:tcPr>
-            <w:tcW w:type="dxa" w:w="1900"/>
-            <w:tcBorders>
-              <w:top w:val="single" w:color="D9D8D2" w:sz="4"/>
-              <w:left w:val="single" w:color="D9D8D2" w:sz="4"/>
-              <w:bottom w:val="single" w:color="D9D8D2" w:sz="4"/>
-              <w:right w:val="single" w:color="D9D8D2" w:sz="4"/>
-            </w:tcBorders>
-            <w:shd w:fill="FFFFFF" w:color="auto" w:val="clear"/>
-            <w:tcMar>
-              <w:top w:type="dxa" w:w="60"/>
-              <w:left w:type="dxa" w:w="100"/>
-              <w:bottom w:type="dxa" w:w="60"/>
-              <w:right w:type="dxa" w:w="100"/>
-            </w:tcMar>
-          </w:tcPr>
-          <w:p>
-            <w:pPr>
-              <w:jc w:val="left"/>
-            </w:pPr>
-            <w:r>
-              <w:rPr>
-                <w:color w:val="1F1F1D"/>
-                <w:sz w:val="18"/>
-                <w:szCs w:val="18"/>
-              </w:rPr>
-              <w:t xml:space="preserve">—</w:t>
-            </w:r>
-          </w:p>
-        </w:tc>
-        <w:tc>
-          <w:tcPr>
-            <w:tcW w:type="dxa" w:w="2200"/>
-            <w:tcBorders>
-              <w:top w:val="single" w:color="D9D8D2" w:sz="4"/>
-              <w:left w:val="single" w:color="D9D8D2" w:sz="4"/>
-              <w:bottom w:val="single" w:color="D9D8D2" w:sz="4"/>
-              <w:right w:val="single" w:color="D9D8D2" w:sz="4"/>
-            </w:tcBorders>
-            <w:shd w:fill="FFFFFF" w:color="auto" w:val="clear"/>
-            <w:tcMar>
-              <w:top w:type="dxa" w:w="60"/>
-              <w:left w:type="dxa" w:w="100"/>
-              <w:bottom w:type="dxa" w:w="60"/>
-              <w:right w:type="dxa" w:w="100"/>
-            </w:tcMar>
-          </w:tcPr>
-          <w:p>
-            <w:pPr>
-              <w:jc w:val="left"/>
-            </w:pPr>
-            <w:r>
-              <w:rPr>
-                <w:color w:val="1F1F1D"/>
-                <w:sz w:val="18"/>
-                <w:szCs w:val="18"/>
-              </w:rPr>
-              <w:t xml:space="preserve">—</w:t>
-            </w:r>
-          </w:p>
-        </w:tc>
-        <w:tc>
-          <w:tcPr>
-            <w:tcW w:type="dxa" w:w="3238"/>
-            <w:tcBorders>
-              <w:top w:val="single" w:color="D9D8D2" w:sz="4"/>
-              <w:left w:val="single" w:color="D9D8D2" w:sz="4"/>
-              <w:bottom w:val="single" w:color="D9D8D2" w:sz="4"/>
-              <w:right w:val="single" w:color="D9D8D2" w:sz="4"/>
-            </w:tcBorders>
-            <w:shd w:fill="FFFFFF" w:color="auto" w:val="clear"/>
-            <w:tcMar>
-              <w:top w:type="dxa" w:w="60"/>
-              <w:left w:type="dxa" w:w="100"/>
-              <w:bottom w:type="dxa" w:w="60"/>
-              <w:right w:type="dxa" w:w="100"/>
-            </w:tcMar>
-          </w:tcPr>
-          <w:p>
-            <w:pPr>
-              <w:jc w:val="left"/>
-            </w:pPr>
-            <w:r>
-              <w:rPr>
-                <w:color w:val="1F1F1D"/>
-                <w:sz w:val="18"/>
-                <w:szCs w:val="18"/>
-              </w:rPr>
-              <w:t xml:space="preserve">nothing</w:t>
-            </w:r>
-          </w:p>
-        </w:tc>
-      </w:tr>
-      <w:tr>
-        <w:trPr>
-          <w:cantSplit/>
-        </w:trPr>
-        <w:tc>
-          <w:tcPr>
-            <w:tcW w:type="dxa" w:w="2300"/>
-            <w:tcBorders>
-              <w:top w:val="single" w:color="D9D8D2" w:sz="4"/>
-              <w:left w:val="single" w:color="D9D8D2" w:sz="4"/>
-              <w:bottom w:val="single" w:color="D9D8D2" w:sz="4"/>
-              <w:right w:val="single" w:color="D9D8D2" w:sz="4"/>
-            </w:tcBorders>
-            <w:shd w:fill="F3F6FB" w:color="auto" w:val="clear"/>
-            <w:tcMar>
-              <w:top w:type="dxa" w:w="60"/>
-              <w:left w:type="dxa" w:w="100"/>
-              <w:bottom w:type="dxa" w:w="60"/>
-              <w:right w:type="dxa" w:w="100"/>
-            </w:tcMar>
-          </w:tcPr>
-          <w:p>
-            <w:pPr>
-              <w:jc w:val="left"/>
-            </w:pPr>
-            <w:r>
-              <w:rPr>
-                <w:color w:val="1F1F1D"/>
-                <w:sz w:val="18"/>
-                <w:szCs w:val="18"/>
-              </w:rPr>
-              <w:t xml:space="preserve">AES + MIC only</w:t>
-            </w:r>
-          </w:p>
-        </w:tc>
-        <w:tc>
-          <w:tcPr>
-            <w:tcW w:type="dxa" w:w="1900"/>
-            <w:tcBorders>
-              <w:top w:val="single" w:color="D9D8D2" w:sz="4"/>
-              <w:left w:val="single" w:color="D9D8D2" w:sz="4"/>
-              <w:bottom w:val="single" w:color="D9D8D2" w:sz="4"/>
-              <w:right w:val="single" w:color="D9D8D2" w:sz="4"/>
-            </w:tcBorders>
-            <w:shd w:fill="F3F6FB" w:color="auto" w:val="clear"/>
-            <w:tcMar>
-              <w:top w:type="dxa" w:w="60"/>
-              <w:left w:type="dxa" w:w="100"/>
-              <w:bottom w:type="dxa" w:w="60"/>
-              <w:right w:type="dxa" w:w="100"/>
-            </w:tcMar>
-          </w:tcPr>
-          <w:p>
-            <w:pPr>
-              <w:jc w:val="left"/>
-            </w:pPr>
-            <w:r>
-              <w:rPr>
-                <w:color w:val="1F1F1D"/>
-                <w:sz w:val="18"/>
-                <w:szCs w:val="18"/>
-              </w:rPr>
-              <w:t xml:space="preserve">AES + MIC</w:t>
-            </w:r>
-          </w:p>
-        </w:tc>
-        <w:tc>
-          <w:tcPr>
-            <w:tcW w:type="dxa" w:w="2200"/>
-            <w:tcBorders>
-              <w:top w:val="single" w:color="D9D8D2" w:sz="4"/>
-              <w:left w:val="single" w:color="D9D8D2" w:sz="4"/>
-              <w:bottom w:val="single" w:color="D9D8D2" w:sz="4"/>
-              <w:right w:val="single" w:color="D9D8D2" w:sz="4"/>
-            </w:tcBorders>
-            <w:shd w:fill="F3F6FB" w:color="auto" w:val="clear"/>
-            <w:tcMar>
-              <w:top w:type="dxa" w:w="60"/>
-              <w:left w:type="dxa" w:w="100"/>
-              <w:bottom w:type="dxa" w:w="60"/>
-              <w:right w:type="dxa" w:w="100"/>
-            </w:tcMar>
-          </w:tcPr>
-          <w:p>
-            <w:pPr>
-              <w:jc w:val="left"/>
-            </w:pPr>
-            <w:r>
-              <w:rPr>
-                <w:color w:val="1F1F1D"/>
-                <w:sz w:val="18"/>
-                <w:szCs w:val="18"/>
-              </w:rPr>
-              <w:t xml:space="preserve">— (keys pre-loaded)</w:t>
-            </w:r>
-          </w:p>
-        </w:tc>
-        <w:tc>
-          <w:tcPr>
-            <w:tcW w:type="dxa" w:w="3238"/>
-            <w:tcBorders>
-              <w:top w:val="single" w:color="D9D8D2" w:sz="4"/>
-              <w:left w:val="single" w:color="D9D8D2" w:sz="4"/>
-              <w:bottom w:val="single" w:color="D9D8D2" w:sz="4"/>
-              <w:right w:val="single" w:color="D9D8D2" w:sz="4"/>
-            </w:tcBorders>
-            <w:shd w:fill="F3F6FB" w:color="auto" w:val="clear"/>
-            <w:tcMar>
-              <w:top w:type="dxa" w:w="60"/>
-              <w:left w:type="dxa" w:w="100"/>
-              <w:bottom w:type="dxa" w:w="60"/>
-              <w:right w:type="dxa" w:w="100"/>
-            </w:tcMar>
-          </w:tcPr>
-          <w:p>
-            <w:pPr>
-              <w:jc w:val="left"/>
-            </w:pPr>
-            <w:r>
-              <w:rPr>
-                <w:color w:val="1F1F1D"/>
-                <w:sz w:val="18"/>
-                <w:szCs w:val="18"/>
-              </w:rPr>
-              <w:t xml:space="preserve">+104 bits, 5 nJ/bit</w:t>
-            </w:r>
-          </w:p>
-        </w:tc>
-      </w:tr>
-      <w:tr>
-        <w:trPr>
-          <w:cantSplit/>
-        </w:trPr>
-        <w:tc>
-          <w:tcPr>
-            <w:tcW w:type="dxa" w:w="2300"/>
-            <w:tcBorders>
-              <w:top w:val="single" w:color="D9D8D2" w:sz="4"/>
-              <w:left w:val="single" w:color="D9D8D2" w:sz="4"/>
-              <w:bottom w:val="single" w:color="D9D8D2" w:sz="4"/>
-              <w:right w:val="single" w:color="D9D8D2" w:sz="4"/>
-            </w:tcBorders>
-            <w:shd w:fill="FFFFFF" w:color="auto" w:val="clear"/>
-            <w:tcMar>
-              <w:top w:type="dxa" w:w="60"/>
-              <w:left w:type="dxa" w:w="100"/>
-              <w:bottom w:type="dxa" w:w="60"/>
-              <w:right w:type="dxa" w:w="100"/>
-            </w:tcMar>
-          </w:tcPr>
-          <w:p>
-            <w:pPr>
-              <w:jc w:val="left"/>
-            </w:pPr>
-            <w:r>
-              <w:rPr>
-                <w:color w:val="1F1F1D"/>
-                <w:sz w:val="18"/>
-                <w:szCs w:val="18"/>
-              </w:rPr>
-              <w:t xml:space="preserve">Hybrid — once per node</w:t>
-            </w:r>
-          </w:p>
-        </w:tc>
-        <w:tc>
-          <w:tcPr>
-            <w:tcW w:type="dxa" w:w="1900"/>
-            <w:tcBorders>
-              <w:top w:val="single" w:color="D9D8D2" w:sz="4"/>
-              <w:left w:val="single" w:color="D9D8D2" w:sz="4"/>
-              <w:bottom w:val="single" w:color="D9D8D2" w:sz="4"/>
-              <w:right w:val="single" w:color="D9D8D2" w:sz="4"/>
-            </w:tcBorders>
-            <w:shd w:fill="FFFFFF" w:color="auto" w:val="clear"/>
-            <w:tcMar>
-              <w:top w:type="dxa" w:w="60"/>
-              <w:left w:type="dxa" w:w="100"/>
-              <w:bottom w:type="dxa" w:w="60"/>
-              <w:right w:type="dxa" w:w="100"/>
-            </w:tcMar>
-          </w:tcPr>
-          <w:p>
-            <w:pPr>
-              <w:jc w:val="left"/>
-            </w:pPr>
-            <w:r>
-              <w:rPr>
-                <w:color w:val="1F1F1D"/>
-                <w:sz w:val="18"/>
-                <w:szCs w:val="18"/>
-              </w:rPr>
-              <w:t xml:space="preserve">AES + MIC</w:t>
-            </w:r>
-          </w:p>
-        </w:tc>
-        <w:tc>
-          <w:tcPr>
-            <w:tcW w:type="dxa" w:w="2200"/>
-            <w:tcBorders>
-              <w:top w:val="single" w:color="D9D8D2" w:sz="4"/>
-              <w:left w:val="single" w:color="D9D8D2" w:sz="4"/>
-              <w:bottom w:val="single" w:color="D9D8D2" w:sz="4"/>
-              <w:right w:val="single" w:color="D9D8D2" w:sz="4"/>
-            </w:tcBorders>
-            <w:shd w:fill="FFFFFF" w:color="auto" w:val="clear"/>
-            <w:tcMar>
-              <w:top w:type="dxa" w:w="60"/>
-              <w:left w:type="dxa" w:w="100"/>
-              <w:bottom w:type="dxa" w:w="60"/>
-              <w:right w:type="dxa" w:w="100"/>
-            </w:tcMar>
-          </w:tcPr>
-          <w:p>
-            <w:pPr>
-              <w:jc w:val="left"/>
-            </w:pPr>
-            <w:r>
-              <w:rPr>
-                <w:color w:val="1F1F1D"/>
-                <w:sz w:val="18"/>
-                <w:szCs w:val="18"/>
-              </w:rPr>
-              <w:t xml:space="preserve">once at deployment</w:t>
-            </w:r>
-          </w:p>
-        </w:tc>
-        <w:tc>
-          <w:tcPr>
-            <w:tcW w:type="dxa" w:w="3238"/>
-            <w:tcBorders>
-              <w:top w:val="single" w:color="D9D8D2" w:sz="4"/>
-              <w:left w:val="single" w:color="D9D8D2" w:sz="4"/>
-              <w:bottom w:val="single" w:color="D9D8D2" w:sz="4"/>
-              <w:right w:val="single" w:color="D9D8D2" w:sz="4"/>
-            </w:tcBorders>
-            <w:shd w:fill="FFFFFF" w:color="auto" w:val="clear"/>
-            <w:tcMar>
-              <w:top w:type="dxa" w:w="60"/>
-              <w:left w:type="dxa" w:w="100"/>
-              <w:bottom w:type="dxa" w:w="60"/>
-              <w:right w:type="dxa" w:w="100"/>
-            </w:tcMar>
-          </w:tcPr>
-          <w:p>
-            <w:pPr>
-              <w:jc w:val="left"/>
-            </w:pPr>
-            <w:r>
-              <w:rPr>
-                <w:color w:val="1F1F1D"/>
-                <w:sz w:val="18"/>
-                <w:szCs w:val="18"/>
-              </w:rPr>
-              <w:t xml:space="preserve">+15.4 mJ (RSA) / 22.3 mJ (ECC) once</w:t>
-            </w:r>
-          </w:p>
-        </w:tc>
-      </w:tr>
-      <w:tr>
-        <w:trPr>
-          <w:cantSplit/>
-        </w:trPr>
-        <w:tc>
-          <w:tcPr>
-            <w:tcW w:type="dxa" w:w="2300"/>
-            <w:tcBorders>
-              <w:top w:val="single" w:color="D9D8D2" w:sz="4"/>
-              <w:left w:val="single" w:color="D9D8D2" w:sz="4"/>
-              <w:bottom w:val="single" w:color="D9D8D2" w:sz="4"/>
-              <w:right w:val="single" w:color="D9D8D2" w:sz="4"/>
-            </w:tcBorders>
-            <w:shd w:fill="F3F6FB" w:color="auto" w:val="clear"/>
-            <w:tcMar>
-              <w:top w:type="dxa" w:w="60"/>
-              <w:left w:type="dxa" w:w="100"/>
-              <w:bottom w:type="dxa" w:w="60"/>
-              <w:right w:type="dxa" w:w="100"/>
-            </w:tcMar>
-          </w:tcPr>
-          <w:p>
-            <w:pPr>
-              <w:jc w:val="left"/>
-            </w:pPr>
-            <w:r>
-              <w:rPr>
-                <w:color w:val="1F1F1D"/>
-                <w:sz w:val="18"/>
-                <w:szCs w:val="18"/>
-              </w:rPr>
-              <w:t xml:space="preserve">Hybrid — per new CH</w:t>
-            </w:r>
-          </w:p>
-        </w:tc>
-        <w:tc>
-          <w:tcPr>
-            <w:tcW w:type="dxa" w:w="1900"/>
-            <w:tcBorders>
-              <w:top w:val="single" w:color="D9D8D2" w:sz="4"/>
-              <w:left w:val="single" w:color="D9D8D2" w:sz="4"/>
-              <w:bottom w:val="single" w:color="D9D8D2" w:sz="4"/>
-              <w:right w:val="single" w:color="D9D8D2" w:sz="4"/>
-            </w:tcBorders>
-            <w:shd w:fill="F3F6FB" w:color="auto" w:val="clear"/>
-            <w:tcMar>
-              <w:top w:type="dxa" w:w="60"/>
-              <w:left w:type="dxa" w:w="100"/>
-              <w:bottom w:type="dxa" w:w="60"/>
-              <w:right w:type="dxa" w:w="100"/>
-            </w:tcMar>
-          </w:tcPr>
-          <w:p>
-            <w:pPr>
-              <w:jc w:val="left"/>
-            </w:pPr>
-            <w:r>
-              <w:rPr>
-                <w:color w:val="1F1F1D"/>
-                <w:sz w:val="18"/>
-                <w:szCs w:val="18"/>
-              </w:rPr>
-              <w:t xml:space="preserve">AES + MIC</w:t>
-            </w:r>
-          </w:p>
-        </w:tc>
-        <w:tc>
-          <w:tcPr>
-            <w:tcW w:type="dxa" w:w="2200"/>
-            <w:tcBorders>
-              <w:top w:val="single" w:color="D9D8D2" w:sz="4"/>
-              <w:left w:val="single" w:color="D9D8D2" w:sz="4"/>
-              <w:bottom w:val="single" w:color="D9D8D2" w:sz="4"/>
-              <w:right w:val="single" w:color="D9D8D2" w:sz="4"/>
-            </w:tcBorders>
-            <w:shd w:fill="F3F6FB" w:color="auto" w:val="clear"/>
-            <w:tcMar>
-              <w:top w:type="dxa" w:w="60"/>
-              <w:left w:type="dxa" w:w="100"/>
-              <w:bottom w:type="dxa" w:w="60"/>
-              <w:right w:type="dxa" w:w="100"/>
-            </w:tcMar>
-          </w:tcPr>
-          <w:p>
-            <w:pPr>
-              <w:jc w:val="left"/>
-            </w:pPr>
-            <w:r>
-              <w:rPr>
-                <w:color w:val="1F1F1D"/>
-                <w:sz w:val="18"/>
-                <w:szCs w:val="18"/>
-              </w:rPr>
-              <w:t xml:space="preserve">every time a node becomes CH</w:t>
-            </w:r>
-          </w:p>
-        </w:tc>
-        <w:tc>
-          <w:tcPr>
-            <w:tcW w:type="dxa" w:w="3238"/>
-            <w:tcBorders>
-              <w:top w:val="single" w:color="D9D8D2" w:sz="4"/>
-              <w:left w:val="single" w:color="D9D8D2" w:sz="4"/>
-              <w:bottom w:val="single" w:color="D9D8D2" w:sz="4"/>
-              <w:right w:val="single" w:color="D9D8D2" w:sz="4"/>
-            </w:tcBorders>
-            <w:shd w:fill="F3F6FB" w:color="auto" w:val="clear"/>
-            <w:tcMar>
-              <w:top w:type="dxa" w:w="60"/>
-              <w:left w:type="dxa" w:w="100"/>
-              <w:bottom w:type="dxa" w:w="60"/>
-              <w:right w:type="dxa" w:w="100"/>
-            </w:tcMar>
-          </w:tcPr>
-          <w:p>
-            <w:pPr>
-              <w:jc w:val="left"/>
-            </w:pPr>
-            <w:r>
-              <w:rPr>
-                <w:color w:val="1F1F1D"/>
-                <w:sz w:val="18"/>
-                <w:szCs w:val="18"/>
-              </w:rPr>
-              <w:t xml:space="preserve">+15.4 / 22.3 mJ per election</w:t>
-            </w:r>
-          </w:p>
-        </w:tc>
-      </w:tr>
-      <w:tr>
-        <w:trPr>
-          <w:cantSplit/>
-        </w:trPr>
-        <w:tc>
-          <w:tcPr>
-            <w:tcW w:type="dxa" w:w="2300"/>
-            <w:tcBorders>
-              <w:top w:val="single" w:color="D9D8D2" w:sz="4"/>
-              <w:left w:val="single" w:color="D9D8D2" w:sz="4"/>
-              <w:bottom w:val="single" w:color="D9D8D2" w:sz="4"/>
-              <w:right w:val="single" w:color="D9D8D2" w:sz="4"/>
-            </w:tcBorders>
-            <w:shd w:fill="FFFFFF" w:color="auto" w:val="clear"/>
-            <w:tcMar>
-              <w:top w:type="dxa" w:w="60"/>
-              <w:left w:type="dxa" w:w="100"/>
-              <w:bottom w:type="dxa" w:w="60"/>
-              <w:right w:type="dxa" w:w="100"/>
-            </w:tcMar>
-          </w:tcPr>
-          <w:p>
-            <w:pPr>
-              <w:jc w:val="left"/>
-            </w:pPr>
-            <w:r>
-              <w:rPr>
-                <w:color w:val="1F1F1D"/>
-                <w:sz w:val="18"/>
-                <w:szCs w:val="18"/>
-              </w:rPr>
-              <w:t xml:space="preserve">ECC / RSA on CH → sink</w:t>
-            </w:r>
-          </w:p>
-        </w:tc>
-        <w:tc>
-          <w:tcPr>
-            <w:tcW w:type="dxa" w:w="1900"/>
-            <w:tcBorders>
-              <w:top w:val="single" w:color="D9D8D2" w:sz="4"/>
-              <w:left w:val="single" w:color="D9D8D2" w:sz="4"/>
-              <w:bottom w:val="single" w:color="D9D8D2" w:sz="4"/>
-              <w:right w:val="single" w:color="D9D8D2" w:sz="4"/>
-            </w:tcBorders>
-            <w:shd w:fill="FFFFFF" w:color="auto" w:val="clear"/>
-            <w:tcMar>
-              <w:top w:type="dxa" w:w="60"/>
-              <w:left w:type="dxa" w:w="100"/>
-              <w:bottom w:type="dxa" w:w="60"/>
-              <w:right w:type="dxa" w:w="100"/>
-            </w:tcMar>
-          </w:tcPr>
-          <w:p>
-            <w:pPr>
-              <w:jc w:val="left"/>
-            </w:pPr>
-            <w:r>
-              <w:rPr>
-                <w:color w:val="1F1F1D"/>
-                <w:sz w:val="18"/>
-                <w:szCs w:val="18"/>
-              </w:rPr>
-              <w:t xml:space="preserve">AES + MIC</w:t>
-            </w:r>
-          </w:p>
-        </w:tc>
-        <w:tc>
-          <w:tcPr>
-            <w:tcW w:type="dxa" w:w="2200"/>
-            <w:tcBorders>
-              <w:top w:val="single" w:color="D9D8D2" w:sz="4"/>
-              <w:left w:val="single" w:color="D9D8D2" w:sz="4"/>
-              <w:bottom w:val="single" w:color="D9D8D2" w:sz="4"/>
-              <w:right w:val="single" w:color="D9D8D2" w:sz="4"/>
-            </w:tcBorders>
-            <w:shd w:fill="FFFFFF" w:color="auto" w:val="clear"/>
-            <w:tcMar>
-              <w:top w:type="dxa" w:w="60"/>
-              <w:left w:type="dxa" w:w="100"/>
-              <w:bottom w:type="dxa" w:w="60"/>
-              <w:right w:type="dxa" w:w="100"/>
-            </w:tcMar>
-          </w:tcPr>
-          <w:p>
-            <w:pPr>
-              <w:jc w:val="left"/>
-            </w:pPr>
-            <w:r>
-              <w:rPr>
-                <w:color w:val="1F1F1D"/>
-                <w:sz w:val="18"/>
-                <w:szCs w:val="18"/>
-              </w:rPr>
-              <w:t xml:space="preserve">every packet to the sink</w:t>
-            </w:r>
-          </w:p>
-        </w:tc>
-        <w:tc>
-          <w:tcPr>
-            <w:tcW w:type="dxa" w:w="3238"/>
-            <w:tcBorders>
-              <w:top w:val="single" w:color="D9D8D2" w:sz="4"/>
-              <w:left w:val="single" w:color="D9D8D2" w:sz="4"/>
-              <w:bottom w:val="single" w:color="D9D8D2" w:sz="4"/>
-              <w:right w:val="single" w:color="D9D8D2" w:sz="4"/>
-            </w:tcBorders>
-            <w:shd w:fill="FFFFFF" w:color="auto" w:val="clear"/>
-            <w:tcMar>
-              <w:top w:type="dxa" w:w="60"/>
-              <w:left w:type="dxa" w:w="100"/>
-              <w:bottom w:type="dxa" w:w="60"/>
-              <w:right w:type="dxa" w:w="100"/>
-            </w:tcMar>
-          </w:tcPr>
-          <w:p>
-            <w:pPr>
-              <w:jc w:val="left"/>
-            </w:pPr>
-            <w:r>
-              <w:rPr>
-                <w:color w:val="1F1F1D"/>
-                <w:sz w:val="18"/>
-                <w:szCs w:val="18"/>
-              </w:rPr>
-              <w:t xml:space="preserve">+22.3 mJ (ECC) / 35.7 mJ (RSA) per packet</w:t>
-            </w:r>
-          </w:p>
-        </w:tc>
-      </w:tr>
-      <w:tr>
-        <w:trPr>
-          <w:cantSplit/>
-        </w:trPr>
-        <w:tc>
-          <w:tcPr>
-            <w:tcW w:type="dxa" w:w="2300"/>
-            <w:tcBorders>
-              <w:top w:val="single" w:color="D9D8D2" w:sz="4"/>
-              <w:left w:val="single" w:color="D9D8D2" w:sz="4"/>
-              <w:bottom w:val="single" w:color="D9D8D2" w:sz="4"/>
-              <w:right w:val="single" w:color="D9D8D2" w:sz="4"/>
-            </w:tcBorders>
-            <w:shd w:fill="F3F6FB" w:color="auto" w:val="clear"/>
-            <w:tcMar>
-              <w:top w:type="dxa" w:w="60"/>
-              <w:left w:type="dxa" w:w="100"/>
-              <w:bottom w:type="dxa" w:w="60"/>
-              <w:right w:type="dxa" w:w="100"/>
-            </w:tcMar>
-          </w:tcPr>
-          <w:p>
-            <w:pPr>
-              <w:jc w:val="left"/>
-            </w:pPr>
-            <w:r>
-              <w:rPr>
-                <w:color w:val="1F1F1D"/>
-                <w:sz w:val="18"/>
-                <w:szCs w:val="18"/>
-              </w:rPr>
-              <w:t xml:space="preserve">Full ECC</w:t>
-            </w:r>
-          </w:p>
-        </w:tc>
-        <w:tc>
-          <w:tcPr>
-            <w:tcW w:type="dxa" w:w="1900"/>
-            <w:tcBorders>
-              <w:top w:val="single" w:color="D9D8D2" w:sz="4"/>
-              <w:left w:val="single" w:color="D9D8D2" w:sz="4"/>
-              <w:bottom w:val="single" w:color="D9D8D2" w:sz="4"/>
-              <w:right w:val="single" w:color="D9D8D2" w:sz="4"/>
-            </w:tcBorders>
-            <w:shd w:fill="F3F6FB" w:color="auto" w:val="clear"/>
-            <w:tcMar>
-              <w:top w:type="dxa" w:w="60"/>
-              <w:left w:type="dxa" w:w="100"/>
-              <w:bottom w:type="dxa" w:w="60"/>
-              <w:right w:type="dxa" w:w="100"/>
-            </w:tcMar>
-          </w:tcPr>
-          <w:p>
-            <w:pPr>
-              <w:jc w:val="left"/>
-            </w:pPr>
-            <w:r>
-              <w:rPr>
-                <w:color w:val="1F1F1D"/>
-                <w:sz w:val="18"/>
-                <w:szCs w:val="18"/>
-              </w:rPr>
-              <w:t xml:space="preserve">ECIES</w:t>
-            </w:r>
-          </w:p>
-        </w:tc>
-        <w:tc>
-          <w:tcPr>
-            <w:tcW w:type="dxa" w:w="2200"/>
-            <w:tcBorders>
-              <w:top w:val="single" w:color="D9D8D2" w:sz="4"/>
-              <w:left w:val="single" w:color="D9D8D2" w:sz="4"/>
-              <w:bottom w:val="single" w:color="D9D8D2" w:sz="4"/>
-              <w:right w:val="single" w:color="D9D8D2" w:sz="4"/>
-            </w:tcBorders>
-            <w:shd w:fill="F3F6FB" w:color="auto" w:val="clear"/>
-            <w:tcMar>
-              <w:top w:type="dxa" w:w="60"/>
-              <w:left w:type="dxa" w:w="100"/>
-              <w:bottom w:type="dxa" w:w="60"/>
-              <w:right w:type="dxa" w:w="100"/>
-            </w:tcMar>
-          </w:tcPr>
-          <w:p>
-            <w:pPr>
-              <w:jc w:val="left"/>
-            </w:pPr>
-            <w:r>
-              <w:rPr>
-                <w:color w:val="1F1F1D"/>
-                <w:sz w:val="18"/>
-                <w:szCs w:val="18"/>
-              </w:rPr>
-              <w:t xml:space="preserve">every packet</w:t>
-            </w:r>
-          </w:p>
-        </w:tc>
-        <w:tc>
-          <w:tcPr>
-            <w:tcW w:type="dxa" w:w="3238"/>
-            <w:tcBorders>
-              <w:top w:val="single" w:color="D9D8D2" w:sz="4"/>
-              <w:left w:val="single" w:color="D9D8D2" w:sz="4"/>
-              <w:bottom w:val="single" w:color="D9D8D2" w:sz="4"/>
-              <w:right w:val="single" w:color="D9D8D2" w:sz="4"/>
-            </w:tcBorders>
-            <w:shd w:fill="F3F6FB" w:color="auto" w:val="clear"/>
-            <w:tcMar>
-              <w:top w:type="dxa" w:w="60"/>
-              <w:left w:type="dxa" w:w="100"/>
-              <w:bottom w:type="dxa" w:w="60"/>
-              <w:right w:type="dxa" w:w="100"/>
-            </w:tcMar>
-          </w:tcPr>
-          <w:p>
-            <w:pPr>
-              <w:jc w:val="left"/>
-            </w:pPr>
-            <w:r>
-              <w:rPr>
-                <w:color w:val="1F1F1D"/>
-                <w:sz w:val="18"/>
-                <w:szCs w:val="18"/>
-              </w:rPr>
-              <w:t xml:space="preserve">22.3 mJ send + 22.3 mJ receive</w:t>
-            </w:r>
-          </w:p>
-        </w:tc>
-      </w:tr>
-      <w:tr>
-        <w:trPr>
-          <w:cantSplit/>
-        </w:trPr>
-        <w:tc>
-          <w:tcPr>
-            <w:tcW w:type="dxa" w:w="2300"/>
-            <w:tcBorders>
-              <w:top w:val="single" w:color="D9D8D2" w:sz="4"/>
-              <w:left w:val="single" w:color="D9D8D2" w:sz="4"/>
-              <w:bottom w:val="single" w:color="D9D8D2" w:sz="4"/>
-              <w:right w:val="single" w:color="D9D8D2" w:sz="4"/>
-            </w:tcBorders>
-            <w:shd w:fill="FFFFFF" w:color="auto" w:val="clear"/>
-            <w:tcMar>
-              <w:top w:type="dxa" w:w="60"/>
-              <w:left w:type="dxa" w:w="100"/>
-              <w:bottom w:type="dxa" w:w="60"/>
-              <w:right w:type="dxa" w:w="100"/>
-            </w:tcMar>
-          </w:tcPr>
-          <w:p>
-            <w:pPr>
-              <w:jc w:val="left"/>
-            </w:pPr>
-            <w:r>
-              <w:rPr>
-                <w:color w:val="1F1F1D"/>
-                <w:sz w:val="18"/>
-                <w:szCs w:val="18"/>
-              </w:rPr>
-              <w:t xml:space="preserve">Full RSA</w:t>
-            </w:r>
-          </w:p>
-        </w:tc>
-        <w:tc>
-          <w:tcPr>
-            <w:tcW w:type="dxa" w:w="1900"/>
-            <w:tcBorders>
-              <w:top w:val="single" w:color="D9D8D2" w:sz="4"/>
-              <w:left w:val="single" w:color="D9D8D2" w:sz="4"/>
-              <w:bottom w:val="single" w:color="D9D8D2" w:sz="4"/>
-              <w:right w:val="single" w:color="D9D8D2" w:sz="4"/>
-            </w:tcBorders>
-            <w:shd w:fill="FFFFFF" w:color="auto" w:val="clear"/>
-            <w:tcMar>
-              <w:top w:type="dxa" w:w="60"/>
-              <w:left w:type="dxa" w:w="100"/>
-              <w:bottom w:type="dxa" w:w="60"/>
-              <w:right w:type="dxa" w:w="100"/>
-            </w:tcMar>
-          </w:tcPr>
-          <w:p>
-            <w:pPr>
-              <w:jc w:val="left"/>
-            </w:pPr>
-            <w:r>
-              <w:rPr>
-                <w:color w:val="1F1F1D"/>
-                <w:sz w:val="18"/>
-                <w:szCs w:val="18"/>
-              </w:rPr>
-              <w:t xml:space="preserve">RSA-1024 (3 blocks)</w:t>
-            </w:r>
-          </w:p>
-        </w:tc>
-        <w:tc>
-          <w:tcPr>
-            <w:tcW w:type="dxa" w:w="2200"/>
-            <w:tcBorders>
-              <w:top w:val="single" w:color="D9D8D2" w:sz="4"/>
-              <w:left w:val="single" w:color="D9D8D2" w:sz="4"/>
-              <w:bottom w:val="single" w:color="D9D8D2" w:sz="4"/>
-              <w:right w:val="single" w:color="D9D8D2" w:sz="4"/>
-            </w:tcBorders>
-            <w:shd w:fill="FFFFFF" w:color="auto" w:val="clear"/>
-            <w:tcMar>
-              <w:top w:type="dxa" w:w="60"/>
-              <w:left w:type="dxa" w:w="100"/>
-              <w:bottom w:type="dxa" w:w="60"/>
-              <w:right w:type="dxa" w:w="100"/>
-            </w:tcMar>
-          </w:tcPr>
-          <w:p>
-            <w:pPr>
-              <w:jc w:val="left"/>
-            </w:pPr>
-            <w:r>
-              <w:rPr>
-                <w:color w:val="1F1F1D"/>
-                <w:sz w:val="18"/>
-                <w:szCs w:val="18"/>
-              </w:rPr>
-              <w:t xml:space="preserve">every packet</w:t>
-            </w:r>
-          </w:p>
-        </w:tc>
-        <w:tc>
-          <w:tcPr>
-            <w:tcW w:type="dxa" w:w="3238"/>
-            <w:tcBorders>
-              <w:top w:val="single" w:color="D9D8D2" w:sz="4"/>
-              <w:left w:val="single" w:color="D9D8D2" w:sz="4"/>
-              <w:bottom w:val="single" w:color="D9D8D2" w:sz="4"/>
-              <w:right w:val="single" w:color="D9D8D2" w:sz="4"/>
-            </w:tcBorders>
-            <w:shd w:fill="FFFFFF" w:color="auto" w:val="clear"/>
-            <w:tcMar>
-              <w:top w:type="dxa" w:w="60"/>
-              <w:left w:type="dxa" w:w="100"/>
-              <w:bottom w:type="dxa" w:w="60"/>
-              <w:right w:type="dxa" w:w="100"/>
-            </w:tcMar>
-          </w:tcPr>
-          <w:p>
-            <w:pPr>
-              <w:jc w:val="left"/>
-            </w:pPr>
-            <w:r>
-              <w:rPr>
-                <w:color w:val="1F1F1D"/>
-                <w:sz w:val="18"/>
-                <w:szCs w:val="18"/>
-              </w:rPr>
-              <w:t xml:space="preserve">35.7 mJ send + 912 mJ receive</w:t>
-            </w:r>
-          </w:p>
-        </w:tc>
-      </w:tr>
-    </w:tbl>
-    <w:p>
-      <w:pPr>
-        <w:pStyle w:val="Heading2"/>
-      </w:pPr>
-      <w:r>
-        <w:t xml:space="preserve">9.3 Results</w:t>
-      </w:r>
-    </w:p>
-    <w:tbl>
-      <w:tblPr>
-        <w:tblW w:type="dxa" w:w="9638"/>
-        <w:tblBorders>
-          <w:top w:val="single" w:color="auto" w:sz="4"/>
-          <w:left w:val="single" w:color="auto" w:sz="4"/>
-          <w:bottom w:val="single" w:color="auto" w:sz="4"/>
-          <w:right w:val="single" w:color="auto" w:sz="4"/>
-          <w:insideH w:val="single" w:color="auto" w:sz="4"/>
-          <w:insideV w:val="single" w:color="auto" w:sz="4"/>
-        </w:tblBorders>
-      </w:tblPr>
-      <w:tblGrid>
-        <w:gridCol w:w="1900"/>
-        <w:gridCol w:w="1180"/>
-        <w:gridCol w:w="1180"/>
-        <w:gridCol w:w="1180"/>
-        <w:gridCol w:w="1180"/>
-        <w:gridCol w:w="1190"/>
-        <w:gridCol w:w="1828"/>
-      </w:tblGrid>
-      <w:tr>
-        <w:trPr>
-          <w:cantSplit/>
-          <w:tblHeader/>
-        </w:trPr>
-        <w:tc>
-          <w:tcPr>
-            <w:tcW w:type="dxa" w:w="1900"/>
-            <w:tcBorders>
-              <w:top w:val="single" w:color="D9D8D2" w:sz="4"/>
-              <w:left w:val="single" w:color="D9D8D2" w:sz="4"/>
-              <w:bottom w:val="single" w:color="D9D8D2" w:sz="4"/>
-              <w:right w:val="single" w:color="D9D8D2" w:sz="4"/>
-            </w:tcBorders>
-            <w:shd w:fill="14213D" w:color="auto" w:val="clear"/>
-            <w:tcMar>
-              <w:top w:type="dxa" w:w="60"/>
-              <w:left w:type="dxa" w:w="100"/>
-              <w:bottom w:type="dxa" w:w="60"/>
-              <w:right w:type="dxa" w:w="100"/>
-            </w:tcMar>
-          </w:tcPr>
-          <w:p>
-            <w:pPr>
-              <w:jc w:val="left"/>
-            </w:pPr>
-            <w:r>
-              <w:rPr>
-                <w:b/>
-                <w:bCs/>
-                <w:color w:val="FFFFFF"/>
-                <w:sz w:val="18"/>
-                <w:szCs w:val="18"/>
-              </w:rPr>
-              <w:t xml:space="preserve">Scenario</w:t>
-            </w:r>
-          </w:p>
-        </w:tc>
-        <w:tc>
-          <w:tcPr>
-            <w:tcW w:type="dxa" w:w="1180"/>
-            <w:tcBorders>
-              <w:top w:val="single" w:color="D9D8D2" w:sz="4"/>
-              <w:left w:val="single" w:color="D9D8D2" w:sz="4"/>
-              <w:bottom w:val="single" w:color="D9D8D2" w:sz="4"/>
-              <w:right w:val="single" w:color="D9D8D2" w:sz="4"/>
-            </w:tcBorders>
-            <w:shd w:fill="14213D" w:color="auto" w:val="clear"/>
-            <w:tcMar>
-              <w:top w:type="dxa" w:w="60"/>
-              <w:left w:type="dxa" w:w="100"/>
-              <w:bottom w:type="dxa" w:w="60"/>
-              <w:right w:type="dxa" w:w="100"/>
-            </w:tcMar>
-          </w:tcPr>
-          <w:p>
-            <w:pPr>
-              <w:jc w:val="center"/>
-            </w:pPr>
-            <w:r>
-              <w:rPr>
-                <w:b/>
-                <w:bCs/>
-                <w:color w:val="FFFFFF"/>
-                <w:sz w:val="18"/>
-                <w:szCs w:val="18"/>
-              </w:rPr>
-              <w:t xml:space="preserve">LEACH</w:t>
-            </w:r>
-          </w:p>
-        </w:tc>
-        <w:tc>
-          <w:tcPr>
-            <w:tcW w:type="dxa" w:w="1180"/>
-            <w:tcBorders>
-              <w:top w:val="single" w:color="D9D8D2" w:sz="4"/>
-              <w:left w:val="single" w:color="D9D8D2" w:sz="4"/>
-              <w:bottom w:val="single" w:color="D9D8D2" w:sz="4"/>
-              <w:right w:val="single" w:color="D9D8D2" w:sz="4"/>
-            </w:tcBorders>
-            <w:shd w:fill="14213D" w:color="auto" w:val="clear"/>
-            <w:tcMar>
-              <w:top w:type="dxa" w:w="60"/>
-              <w:left w:type="dxa" w:w="100"/>
-              <w:bottom w:type="dxa" w:w="60"/>
-              <w:right w:type="dxa" w:w="100"/>
-            </w:tcMar>
-          </w:tcPr>
-          <w:p>
-            <w:pPr>
-              <w:jc w:val="center"/>
-            </w:pPr>
-            <w:r>
-              <w:rPr>
-                <w:b/>
-                <w:bCs/>
-                <w:color w:val="FFFFFF"/>
-                <w:sz w:val="18"/>
-                <w:szCs w:val="18"/>
-              </w:rPr>
-              <w:t xml:space="preserve">PEGASIS</w:t>
-            </w:r>
-          </w:p>
-        </w:tc>
-        <w:tc>
-          <w:tcPr>
-            <w:tcW w:type="dxa" w:w="1180"/>
-            <w:tcBorders>
-              <w:top w:val="single" w:color="D9D8D2" w:sz="4"/>
-              <w:left w:val="single" w:color="D9D8D2" w:sz="4"/>
-              <w:bottom w:val="single" w:color="D9D8D2" w:sz="4"/>
-              <w:right w:val="single" w:color="D9D8D2" w:sz="4"/>
-            </w:tcBorders>
-            <w:shd w:fill="14213D" w:color="auto" w:val="clear"/>
-            <w:tcMar>
-              <w:top w:type="dxa" w:w="60"/>
-              <w:left w:type="dxa" w:w="100"/>
-              <w:bottom w:type="dxa" w:w="60"/>
-              <w:right w:type="dxa" w:w="100"/>
-            </w:tcMar>
-          </w:tcPr>
-          <w:p>
-            <w:pPr>
-              <w:jc w:val="center"/>
-            </w:pPr>
-            <w:r>
-              <w:rPr>
-                <w:b/>
-                <w:bCs/>
-                <w:color w:val="FFFFFF"/>
-                <w:sz w:val="18"/>
-                <w:szCs w:val="18"/>
-              </w:rPr>
-              <w:t xml:space="preserve">v8</w:t>
-            </w:r>
-          </w:p>
-        </w:tc>
-        <w:tc>
-          <w:tcPr>
-            <w:tcW w:type="dxa" w:w="1180"/>
-            <w:tcBorders>
-              <w:top w:val="single" w:color="D9D8D2" w:sz="4"/>
-              <w:left w:val="single" w:color="D9D8D2" w:sz="4"/>
-              <w:bottom w:val="single" w:color="D9D8D2" w:sz="4"/>
-              <w:right w:val="single" w:color="D9D8D2" w:sz="4"/>
-            </w:tcBorders>
-            <w:shd w:fill="14213D" w:color="auto" w:val="clear"/>
-            <w:tcMar>
-              <w:top w:type="dxa" w:w="60"/>
-              <w:left w:type="dxa" w:w="100"/>
-              <w:bottom w:type="dxa" w:w="60"/>
-              <w:right w:type="dxa" w:w="100"/>
-            </w:tcMar>
-          </w:tcPr>
-          <w:p>
-            <w:pPr>
-              <w:jc w:val="center"/>
-            </w:pPr>
-            <w:r>
-              <w:rPr>
-                <w:b/>
-                <w:bCs/>
-                <w:color w:val="FFFFFF"/>
-                <w:sz w:val="18"/>
-                <w:szCs w:val="18"/>
-              </w:rPr>
-              <w:t xml:space="preserve">LEACH far</w:t>
-            </w:r>
-          </w:p>
-        </w:tc>
-        <w:tc>
-          <w:tcPr>
-            <w:tcW w:type="dxa" w:w="1190"/>
-            <w:tcBorders>
-              <w:top w:val="single" w:color="D9D8D2" w:sz="4"/>
-              <w:left w:val="single" w:color="D9D8D2" w:sz="4"/>
-              <w:bottom w:val="single" w:color="D9D8D2" w:sz="4"/>
-              <w:right w:val="single" w:color="D9D8D2" w:sz="4"/>
-            </w:tcBorders>
-            <w:shd w:fill="14213D" w:color="auto" w:val="clear"/>
-            <w:tcMar>
-              <w:top w:type="dxa" w:w="60"/>
-              <w:left w:type="dxa" w:w="100"/>
-              <w:bottom w:type="dxa" w:w="60"/>
-              <w:right w:type="dxa" w:w="100"/>
-            </w:tcMar>
-          </w:tcPr>
-          <w:p>
-            <w:pPr>
-              <w:jc w:val="center"/>
-            </w:pPr>
-            <w:r>
-              <w:rPr>
-                <w:b/>
-                <w:bCs/>
-                <w:color w:val="FFFFFF"/>
-                <w:sz w:val="18"/>
-                <w:szCs w:val="18"/>
-              </w:rPr>
-              <w:t xml:space="preserve">PEGASIS far</w:t>
-            </w:r>
-          </w:p>
-        </w:tc>
-        <w:tc>
-          <w:tcPr>
-            <w:tcW w:type="dxa" w:w="1828"/>
-            <w:tcBorders>
-              <w:top w:val="single" w:color="D9D8D2" w:sz="4"/>
-              <w:left w:val="single" w:color="D9D8D2" w:sz="4"/>
-              <w:bottom w:val="single" w:color="D9D8D2" w:sz="4"/>
-              <w:right w:val="single" w:color="D9D8D2" w:sz="4"/>
-            </w:tcBorders>
-            <w:shd w:fill="14213D" w:color="auto" w:val="clear"/>
-            <w:tcMar>
-              <w:top w:type="dxa" w:w="60"/>
-              <w:left w:type="dxa" w:w="100"/>
-              <w:bottom w:type="dxa" w:w="60"/>
-              <w:right w:type="dxa" w:w="100"/>
-            </w:tcMar>
-          </w:tcPr>
-          <w:p>
-            <w:pPr>
-              <w:jc w:val="center"/>
-            </w:pPr>
-            <w:r>
-              <w:rPr>
-                <w:b/>
-                <w:bCs/>
-                <w:color w:val="FFFFFF"/>
-                <w:sz w:val="18"/>
-                <w:szCs w:val="18"/>
-              </w:rPr>
-              <w:t xml:space="preserve">v8-Chain far</w:t>
-            </w:r>
-          </w:p>
-        </w:tc>
-      </w:tr>
-      <w:tr>
-        <w:trPr>
-          <w:cantSplit/>
-        </w:trPr>
-        <w:tc>
-          <w:tcPr>
-            <w:tcW w:type="dxa" w:w="1900"/>
-            <w:tcBorders>
-              <w:top w:val="single" w:color="D9D8D2" w:sz="4"/>
-              <w:left w:val="single" w:color="D9D8D2" w:sz="4"/>
-              <w:bottom w:val="single" w:color="D9D8D2" w:sz="4"/>
-              <w:right w:val="single" w:color="D9D8D2" w:sz="4"/>
-            </w:tcBorders>
-            <w:shd w:fill="FFFFFF" w:color="auto" w:val="clear"/>
-            <w:tcMar>
-              <w:top w:type="dxa" w:w="60"/>
-              <w:left w:type="dxa" w:w="100"/>
-              <w:bottom w:type="dxa" w:w="60"/>
-              <w:right w:type="dxa" w:w="100"/>
-            </w:tcMar>
-          </w:tcPr>
-          <w:p>
-            <w:pPr>
-              <w:jc w:val="left"/>
-            </w:pPr>
-            <w:r>
-              <w:rPr>
-                <w:b w:val="false"/>
-                <w:bCs w:val="false"/>
-                <w:color w:val="1F1F1D"/>
-                <w:sz w:val="18"/>
-                <w:szCs w:val="18"/>
-              </w:rPr>
-              <w:t xml:space="preserve">No security</w:t>
-            </w:r>
-          </w:p>
-        </w:tc>
-        <w:tc>
-          <w:tcPr>
-            <w:tcW w:type="dxa" w:w="1180"/>
-            <w:tcBorders>
-              <w:top w:val="single" w:color="D9D8D2" w:sz="4"/>
-              <w:left w:val="single" w:color="D9D8D2" w:sz="4"/>
-              <w:bottom w:val="single" w:color="D9D8D2" w:sz="4"/>
-              <w:right w:val="single" w:color="D9D8D2" w:sz="4"/>
-            </w:tcBorders>
-            <w:shd w:fill="FFFFFF" w:color="auto" w:val="clear"/>
-            <w:tcMar>
-              <w:top w:type="dxa" w:w="60"/>
-              <w:left w:type="dxa" w:w="100"/>
-              <w:bottom w:type="dxa" w:w="60"/>
-              <w:right w:type="dxa" w:w="100"/>
-            </w:tcMar>
-          </w:tcPr>
-          <w:p>
-            <w:pPr>
-              <w:jc w:val="center"/>
-            </w:pPr>
-            <w:r>
-              <w:rPr>
-                <w:b w:val="false"/>
-                <w:bCs w:val="false"/>
-                <w:color w:val="1F1F1D"/>
-                <w:sz w:val="18"/>
-                <w:szCs w:val="18"/>
-              </w:rPr>
-              <w:t xml:space="preserve">1383 (99.40%)</w:t>
-            </w:r>
-          </w:p>
-        </w:tc>
-        <w:tc>
-          <w:tcPr>
-            <w:tcW w:type="dxa" w:w="1180"/>
-            <w:tcBorders>
-              <w:top w:val="single" w:color="D9D8D2" w:sz="4"/>
-              <w:left w:val="single" w:color="D9D8D2" w:sz="4"/>
-              <w:bottom w:val="single" w:color="D9D8D2" w:sz="4"/>
-              <w:right w:val="single" w:color="D9D8D2" w:sz="4"/>
-            </w:tcBorders>
-            <w:shd w:fill="FFFFFF" w:color="auto" w:val="clear"/>
-            <w:tcMar>
-              <w:top w:type="dxa" w:w="60"/>
-              <w:left w:type="dxa" w:w="100"/>
-              <w:bottom w:type="dxa" w:w="60"/>
-              <w:right w:type="dxa" w:w="100"/>
-            </w:tcMar>
-          </w:tcPr>
-          <w:p>
-            <w:pPr>
-              <w:jc w:val="center"/>
-            </w:pPr>
-            <w:r>
-              <w:rPr>
-                <w:b w:val="false"/>
-                <w:bCs w:val="false"/>
-                <w:color w:val="1F1F1D"/>
-                <w:sz w:val="18"/>
-                <w:szCs w:val="18"/>
-              </w:rPr>
-              <w:t xml:space="preserve">1324 (99.42%)</w:t>
-            </w:r>
-          </w:p>
-        </w:tc>
-        <w:tc>
-          <w:tcPr>
-            <w:tcW w:type="dxa" w:w="1180"/>
-            <w:tcBorders>
-              <w:top w:val="single" w:color="D9D8D2" w:sz="4"/>
-              <w:left w:val="single" w:color="D9D8D2" w:sz="4"/>
-              <w:bottom w:val="single" w:color="D9D8D2" w:sz="4"/>
-              <w:right w:val="single" w:color="D9D8D2" w:sz="4"/>
-            </w:tcBorders>
-            <w:shd w:fill="FFFFFF" w:color="auto" w:val="clear"/>
-            <w:tcMar>
-              <w:top w:type="dxa" w:w="60"/>
-              <w:left w:type="dxa" w:w="100"/>
-              <w:bottom w:type="dxa" w:w="60"/>
-              <w:right w:type="dxa" w:w="100"/>
-            </w:tcMar>
-          </w:tcPr>
-          <w:p>
-            <w:pPr>
-              <w:jc w:val="center"/>
-            </w:pPr>
-            <w:r>
-              <w:rPr>
-                <w:b w:val="false"/>
-                <w:bCs w:val="false"/>
-                <w:color w:val="1F1F1D"/>
-                <w:sz w:val="18"/>
-                <w:szCs w:val="18"/>
-              </w:rPr>
-              <w:t xml:space="preserve">2501 (99.64%)</w:t>
-            </w:r>
-          </w:p>
-        </w:tc>
-        <w:tc>
-          <w:tcPr>
-            <w:tcW w:type="dxa" w:w="1180"/>
-            <w:tcBorders>
-              <w:top w:val="single" w:color="D9D8D2" w:sz="4"/>
-              <w:left w:val="single" w:color="D9D8D2" w:sz="4"/>
-              <w:bottom w:val="single" w:color="D9D8D2" w:sz="4"/>
-              <w:right w:val="single" w:color="D9D8D2" w:sz="4"/>
-            </w:tcBorders>
-            <w:shd w:fill="FFFFFF" w:color="auto" w:val="clear"/>
-            <w:tcMar>
-              <w:top w:type="dxa" w:w="60"/>
-              <w:left w:type="dxa" w:w="100"/>
-              <w:bottom w:type="dxa" w:w="60"/>
-              <w:right w:type="dxa" w:w="100"/>
-            </w:tcMar>
-          </w:tcPr>
-          <w:p>
-            <w:pPr>
-              <w:jc w:val="center"/>
-            </w:pPr>
-            <w:r>
-              <w:rPr>
-                <w:b w:val="false"/>
-                <w:bCs w:val="false"/>
-                <w:color w:val="1F1F1D"/>
-                <w:sz w:val="18"/>
-                <w:szCs w:val="18"/>
-              </w:rPr>
-              <w:t xml:space="preserve">988 (99.43%)</w:t>
-            </w:r>
-          </w:p>
-        </w:tc>
-        <w:tc>
-          <w:tcPr>
-            <w:tcW w:type="dxa" w:w="1190"/>
-            <w:tcBorders>
-              <w:top w:val="single" w:color="D9D8D2" w:sz="4"/>
-              <w:left w:val="single" w:color="D9D8D2" w:sz="4"/>
-              <w:bottom w:val="single" w:color="D9D8D2" w:sz="4"/>
-              <w:right w:val="single" w:color="D9D8D2" w:sz="4"/>
-            </w:tcBorders>
-            <w:shd w:fill="FFFFFF" w:color="auto" w:val="clear"/>
-            <w:tcMar>
-              <w:top w:type="dxa" w:w="60"/>
-              <w:left w:type="dxa" w:w="100"/>
-              <w:bottom w:type="dxa" w:w="60"/>
-              <w:right w:type="dxa" w:w="100"/>
-            </w:tcMar>
-          </w:tcPr>
-          <w:p>
-            <w:pPr>
-              <w:jc w:val="center"/>
-            </w:pPr>
-            <w:r>
-              <w:rPr>
-                <w:b w:val="false"/>
-                <w:bCs w:val="false"/>
-                <w:color w:val="1F1F1D"/>
-                <w:sz w:val="18"/>
-                <w:szCs w:val="18"/>
-              </w:rPr>
-              <w:t xml:space="preserve">1374 (99.08%)</w:t>
-            </w:r>
-          </w:p>
-        </w:tc>
-        <w:tc>
-          <w:tcPr>
-            <w:tcW w:type="dxa" w:w="1828"/>
-            <w:tcBorders>
-              <w:top w:val="single" w:color="D9D8D2" w:sz="4"/>
-              <w:left w:val="single" w:color="D9D8D2" w:sz="4"/>
-              <w:bottom w:val="single" w:color="D9D8D2" w:sz="4"/>
-              <w:right w:val="single" w:color="D9D8D2" w:sz="4"/>
-            </w:tcBorders>
-            <w:shd w:fill="FFFFFF" w:color="auto" w:val="clear"/>
-            <w:tcMar>
-              <w:top w:type="dxa" w:w="60"/>
-              <w:left w:type="dxa" w:w="100"/>
-              <w:bottom w:type="dxa" w:w="60"/>
-              <w:right w:type="dxa" w:w="100"/>
-            </w:tcMar>
-          </w:tcPr>
-          <w:p>
-            <w:pPr>
-              <w:jc w:val="center"/>
-            </w:pPr>
-            <w:r>
-              <w:rPr>
-                <w:b w:val="false"/>
-                <w:bCs w:val="false"/>
-                <w:color w:val="1F1F1D"/>
-                <w:sz w:val="18"/>
-                <w:szCs w:val="18"/>
-              </w:rPr>
-              <w:t xml:space="preserve">1671 (99.36%)</w:t>
-            </w:r>
-          </w:p>
-        </w:tc>
-      </w:tr>
-      <w:tr>
-        <w:trPr>
-          <w:cantSplit/>
-        </w:trPr>
-        <w:tc>
-          <w:tcPr>
-            <w:tcW w:type="dxa" w:w="1900"/>
-            <w:tcBorders>
-              <w:top w:val="single" w:color="D9D8D2" w:sz="4"/>
-              <w:left w:val="single" w:color="D9D8D2" w:sz="4"/>
-              <w:bottom w:val="single" w:color="D9D8D2" w:sz="4"/>
-              <w:right w:val="single" w:color="D9D8D2" w:sz="4"/>
-            </w:tcBorders>
-            <w:shd w:fill="F3F6FB" w:color="auto" w:val="clear"/>
-            <w:tcMar>
-              <w:top w:type="dxa" w:w="60"/>
-              <w:left w:type="dxa" w:w="100"/>
-              <w:bottom w:type="dxa" w:w="60"/>
-              <w:right w:type="dxa" w:w="100"/>
-            </w:tcMar>
-          </w:tcPr>
-          <w:p>
-            <w:pPr>
-              <w:jc w:val="left"/>
-            </w:pPr>
-            <w:r>
-              <w:rPr>
-                <w:b w:val="false"/>
-                <w:bCs w:val="false"/>
-                <w:color w:val="1F1F1D"/>
-                <w:sz w:val="18"/>
-                <w:szCs w:val="18"/>
-              </w:rPr>
-              <w:t xml:space="preserve">AES + MIC only</w:t>
-            </w:r>
-          </w:p>
-        </w:tc>
-        <w:tc>
-          <w:tcPr>
-            <w:tcW w:type="dxa" w:w="1180"/>
-            <w:tcBorders>
-              <w:top w:val="single" w:color="D9D8D2" w:sz="4"/>
-              <w:left w:val="single" w:color="D9D8D2" w:sz="4"/>
-              <w:bottom w:val="single" w:color="D9D8D2" w:sz="4"/>
-              <w:right w:val="single" w:color="D9D8D2" w:sz="4"/>
-            </w:tcBorders>
-            <w:shd w:fill="F3F6FB" w:color="auto" w:val="clear"/>
-            <w:tcMar>
-              <w:top w:type="dxa" w:w="60"/>
-              <w:left w:type="dxa" w:w="100"/>
-              <w:bottom w:type="dxa" w:w="60"/>
-              <w:right w:type="dxa" w:w="100"/>
-            </w:tcMar>
-          </w:tcPr>
-          <w:p>
-            <w:pPr>
-              <w:jc w:val="center"/>
-            </w:pPr>
-            <w:r>
-              <w:rPr>
-                <w:b w:val="false"/>
-                <w:bCs w:val="false"/>
-                <w:color w:val="1F1F1D"/>
-                <w:sz w:val="18"/>
-                <w:szCs w:val="18"/>
-              </w:rPr>
-              <w:t xml:space="preserve">1037 (99.13%)</w:t>
-            </w:r>
-          </w:p>
-        </w:tc>
-        <w:tc>
-          <w:tcPr>
-            <w:tcW w:type="dxa" w:w="1180"/>
-            <w:tcBorders>
-              <w:top w:val="single" w:color="D9D8D2" w:sz="4"/>
-              <w:left w:val="single" w:color="D9D8D2" w:sz="4"/>
-              <w:bottom w:val="single" w:color="D9D8D2" w:sz="4"/>
-              <w:right w:val="single" w:color="D9D8D2" w:sz="4"/>
-            </w:tcBorders>
-            <w:shd w:fill="F3F6FB" w:color="auto" w:val="clear"/>
-            <w:tcMar>
-              <w:top w:type="dxa" w:w="60"/>
-              <w:left w:type="dxa" w:w="100"/>
-              <w:bottom w:type="dxa" w:w="60"/>
-              <w:right w:type="dxa" w:w="100"/>
-            </w:tcMar>
-          </w:tcPr>
-          <w:p>
-            <w:pPr>
-              <w:jc w:val="center"/>
-            </w:pPr>
-            <w:r>
-              <w:rPr>
-                <w:b w:val="false"/>
-                <w:bCs w:val="false"/>
-                <w:color w:val="1F1F1D"/>
-                <w:sz w:val="18"/>
-                <w:szCs w:val="18"/>
-              </w:rPr>
-              <w:t xml:space="preserve">1196 (99.42%)</w:t>
-            </w:r>
-          </w:p>
-        </w:tc>
-        <w:tc>
-          <w:tcPr>
-            <w:tcW w:type="dxa" w:w="1180"/>
-            <w:tcBorders>
-              <w:top w:val="single" w:color="D9D8D2" w:sz="4"/>
-              <w:left w:val="single" w:color="D9D8D2" w:sz="4"/>
-              <w:bottom w:val="single" w:color="D9D8D2" w:sz="4"/>
-              <w:right w:val="single" w:color="D9D8D2" w:sz="4"/>
-            </w:tcBorders>
-            <w:shd w:fill="F3F6FB" w:color="auto" w:val="clear"/>
-            <w:tcMar>
-              <w:top w:type="dxa" w:w="60"/>
-              <w:left w:type="dxa" w:w="100"/>
-              <w:bottom w:type="dxa" w:w="60"/>
-              <w:right w:type="dxa" w:w="100"/>
-            </w:tcMar>
-          </w:tcPr>
-          <w:p>
-            <w:pPr>
-              <w:jc w:val="center"/>
-            </w:pPr>
-            <w:r>
-              <w:rPr>
-                <w:b w:val="false"/>
-                <w:bCs w:val="false"/>
-                <w:color w:val="1F1F1D"/>
-                <w:sz w:val="18"/>
-                <w:szCs w:val="18"/>
-              </w:rPr>
-              <w:t xml:space="preserve">2096 (99.72%)</w:t>
-            </w:r>
-          </w:p>
-        </w:tc>
-        <w:tc>
-          <w:tcPr>
-            <w:tcW w:type="dxa" w:w="1180"/>
-            <w:tcBorders>
-              <w:top w:val="single" w:color="D9D8D2" w:sz="4"/>
-              <w:left w:val="single" w:color="D9D8D2" w:sz="4"/>
-              <w:bottom w:val="single" w:color="D9D8D2" w:sz="4"/>
-              <w:right w:val="single" w:color="D9D8D2" w:sz="4"/>
-            </w:tcBorders>
-            <w:shd w:fill="F3F6FB" w:color="auto" w:val="clear"/>
-            <w:tcMar>
-              <w:top w:type="dxa" w:w="60"/>
-              <w:left w:type="dxa" w:w="100"/>
-              <w:bottom w:type="dxa" w:w="60"/>
-              <w:right w:type="dxa" w:w="100"/>
-            </w:tcMar>
-          </w:tcPr>
-          <w:p>
-            <w:pPr>
-              <w:jc w:val="center"/>
-            </w:pPr>
-            <w:r>
-              <w:rPr>
-                <w:b w:val="false"/>
-                <w:bCs w:val="false"/>
-                <w:color w:val="1F1F1D"/>
-                <w:sz w:val="18"/>
-                <w:szCs w:val="18"/>
-              </w:rPr>
-              <w:t xml:space="preserve">821 (98.84%)</w:t>
-            </w:r>
-          </w:p>
-        </w:tc>
-        <w:tc>
-          <w:tcPr>
-            <w:tcW w:type="dxa" w:w="1190"/>
-            <w:tcBorders>
-              <w:top w:val="single" w:color="D9D8D2" w:sz="4"/>
-              <w:left w:val="single" w:color="D9D8D2" w:sz="4"/>
-              <w:bottom w:val="single" w:color="D9D8D2" w:sz="4"/>
-              <w:right w:val="single" w:color="D9D8D2" w:sz="4"/>
-            </w:tcBorders>
-            <w:shd w:fill="F3F6FB" w:color="auto" w:val="clear"/>
-            <w:tcMar>
-              <w:top w:type="dxa" w:w="60"/>
-              <w:left w:type="dxa" w:w="100"/>
-              <w:bottom w:type="dxa" w:w="60"/>
-              <w:right w:type="dxa" w:w="100"/>
-            </w:tcMar>
-          </w:tcPr>
-          <w:p>
-            <w:pPr>
-              <w:jc w:val="center"/>
-            </w:pPr>
-            <w:r>
-              <w:rPr>
-                <w:b w:val="false"/>
-                <w:bCs w:val="false"/>
-                <w:color w:val="1F1F1D"/>
-                <w:sz w:val="18"/>
-                <w:szCs w:val="18"/>
-              </w:rPr>
-              <w:t xml:space="preserve">1237 (99.11%)</w:t>
-            </w:r>
-          </w:p>
-        </w:tc>
-        <w:tc>
-          <w:tcPr>
-            <w:tcW w:type="dxa" w:w="1828"/>
-            <w:tcBorders>
-              <w:top w:val="single" w:color="D9D8D2" w:sz="4"/>
-              <w:left w:val="single" w:color="D9D8D2" w:sz="4"/>
-              <w:bottom w:val="single" w:color="D9D8D2" w:sz="4"/>
-              <w:right w:val="single" w:color="D9D8D2" w:sz="4"/>
-            </w:tcBorders>
-            <w:shd w:fill="F3F6FB" w:color="auto" w:val="clear"/>
-            <w:tcMar>
-              <w:top w:type="dxa" w:w="60"/>
-              <w:left w:type="dxa" w:w="100"/>
-              <w:bottom w:type="dxa" w:w="60"/>
-              <w:right w:type="dxa" w:w="100"/>
-            </w:tcMar>
-          </w:tcPr>
-          <w:p>
-            <w:pPr>
-              <w:jc w:val="center"/>
-            </w:pPr>
-            <w:r>
-              <w:rPr>
-                <w:b w:val="false"/>
-                <w:bCs w:val="false"/>
-                <w:color w:val="1F1F1D"/>
-                <w:sz w:val="18"/>
-                <w:szCs w:val="18"/>
-              </w:rPr>
-              <w:t xml:space="preserve">1356 (99.52%)</w:t>
-            </w:r>
-          </w:p>
-        </w:tc>
-      </w:tr>
-      <w:tr>
-        <w:trPr>
-          <w:cantSplit/>
-        </w:trPr>
-        <w:tc>
-          <w:tcPr>
-            <w:tcW w:type="dxa" w:w="1900"/>
-            <w:tcBorders>
-              <w:top w:val="single" w:color="D9D8D2" w:sz="4"/>
-              <w:left w:val="single" w:color="D9D8D2" w:sz="4"/>
-              <w:bottom w:val="single" w:color="D9D8D2" w:sz="4"/>
-              <w:right w:val="single" w:color="D9D8D2" w:sz="4"/>
-            </w:tcBorders>
-            <w:shd w:fill="DCE9FA" w:color="auto" w:val="clear"/>
-            <w:tcMar>
-              <w:top w:type="dxa" w:w="60"/>
-              <w:left w:type="dxa" w:w="100"/>
-              <w:bottom w:type="dxa" w:w="60"/>
-              <w:right w:type="dxa" w:w="100"/>
-            </w:tcMar>
-          </w:tcPr>
-          <w:p>
-            <w:pPr>
-              <w:jc w:val="left"/>
-            </w:pPr>
-            <w:r>
-              <w:rPr>
-                <w:b/>
-                <w:bCs/>
-                <w:color w:val="1F1F1D"/>
-                <w:sz w:val="18"/>
-                <w:szCs w:val="18"/>
-              </w:rPr>
-              <w:t xml:space="preserve">Hybrid RSA once</w:t>
-            </w:r>
-          </w:p>
-        </w:tc>
-        <w:tc>
-          <w:tcPr>
-            <w:tcW w:type="dxa" w:w="1180"/>
-            <w:tcBorders>
-              <w:top w:val="single" w:color="D9D8D2" w:sz="4"/>
-              <w:left w:val="single" w:color="D9D8D2" w:sz="4"/>
-              <w:bottom w:val="single" w:color="D9D8D2" w:sz="4"/>
-              <w:right w:val="single" w:color="D9D8D2" w:sz="4"/>
-            </w:tcBorders>
-            <w:shd w:fill="DCE9FA" w:color="auto" w:val="clear"/>
-            <w:tcMar>
-              <w:top w:type="dxa" w:w="60"/>
-              <w:left w:type="dxa" w:w="100"/>
-              <w:bottom w:type="dxa" w:w="60"/>
-              <w:right w:type="dxa" w:w="100"/>
-            </w:tcMar>
-          </w:tcPr>
-          <w:p>
-            <w:pPr>
-              <w:jc w:val="center"/>
-            </w:pPr>
-            <w:r>
-              <w:rPr>
-                <w:b/>
-                <w:bCs/>
-                <w:color w:val="1F1F1D"/>
-                <w:sz w:val="18"/>
-                <w:szCs w:val="18"/>
-              </w:rPr>
-              <w:t xml:space="preserve">1019 (99.20%)</w:t>
-            </w:r>
-          </w:p>
-        </w:tc>
-        <w:tc>
-          <w:tcPr>
-            <w:tcW w:type="dxa" w:w="1180"/>
-            <w:tcBorders>
-              <w:top w:val="single" w:color="D9D8D2" w:sz="4"/>
-              <w:left w:val="single" w:color="D9D8D2" w:sz="4"/>
-              <w:bottom w:val="single" w:color="D9D8D2" w:sz="4"/>
-              <w:right w:val="single" w:color="D9D8D2" w:sz="4"/>
-            </w:tcBorders>
-            <w:shd w:fill="DCE9FA" w:color="auto" w:val="clear"/>
-            <w:tcMar>
-              <w:top w:type="dxa" w:w="60"/>
-              <w:left w:type="dxa" w:w="100"/>
-              <w:bottom w:type="dxa" w:w="60"/>
-              <w:right w:type="dxa" w:w="100"/>
-            </w:tcMar>
-          </w:tcPr>
-          <w:p>
-            <w:pPr>
-              <w:jc w:val="center"/>
-            </w:pPr>
-            <w:r>
-              <w:rPr>
-                <w:b/>
-                <w:bCs/>
-                <w:color w:val="1F1F1D"/>
-                <w:sz w:val="18"/>
-                <w:szCs w:val="18"/>
-              </w:rPr>
-              <w:t xml:space="preserve">1158 (99.35%)</w:t>
-            </w:r>
-          </w:p>
-        </w:tc>
-        <w:tc>
-          <w:tcPr>
-            <w:tcW w:type="dxa" w:w="1180"/>
-            <w:tcBorders>
-              <w:top w:val="single" w:color="D9D8D2" w:sz="4"/>
-              <w:left w:val="single" w:color="D9D8D2" w:sz="4"/>
-              <w:bottom w:val="single" w:color="D9D8D2" w:sz="4"/>
-              <w:right w:val="single" w:color="D9D8D2" w:sz="4"/>
-            </w:tcBorders>
-            <w:shd w:fill="DCE9FA" w:color="auto" w:val="clear"/>
-            <w:tcMar>
-              <w:top w:type="dxa" w:w="60"/>
-              <w:left w:type="dxa" w:w="100"/>
-              <w:bottom w:type="dxa" w:w="60"/>
-              <w:right w:type="dxa" w:w="100"/>
-            </w:tcMar>
-          </w:tcPr>
-          <w:p>
-            <w:pPr>
-              <w:jc w:val="center"/>
-            </w:pPr>
-            <w:r>
-              <w:rPr>
-                <w:b/>
-                <w:bCs/>
-                <w:color w:val="1F1F1D"/>
-                <w:sz w:val="18"/>
-                <w:szCs w:val="18"/>
-              </w:rPr>
-              <w:t xml:space="preserve">2061 (99.62%)</w:t>
-            </w:r>
-          </w:p>
-        </w:tc>
-        <w:tc>
-          <w:tcPr>
-            <w:tcW w:type="dxa" w:w="1180"/>
-            <w:tcBorders>
-              <w:top w:val="single" w:color="D9D8D2" w:sz="4"/>
-              <w:left w:val="single" w:color="D9D8D2" w:sz="4"/>
-              <w:bottom w:val="single" w:color="D9D8D2" w:sz="4"/>
-              <w:right w:val="single" w:color="D9D8D2" w:sz="4"/>
-            </w:tcBorders>
-            <w:shd w:fill="DCE9FA" w:color="auto" w:val="clear"/>
-            <w:tcMar>
-              <w:top w:type="dxa" w:w="60"/>
-              <w:left w:type="dxa" w:w="100"/>
-              <w:bottom w:type="dxa" w:w="60"/>
-              <w:right w:type="dxa" w:w="100"/>
-            </w:tcMar>
-          </w:tcPr>
-          <w:p>
-            <w:pPr>
-              <w:jc w:val="center"/>
-            </w:pPr>
-            <w:r>
-              <w:rPr>
-                <w:b/>
-                <w:bCs/>
-                <w:color w:val="1F1F1D"/>
-                <w:sz w:val="18"/>
-                <w:szCs w:val="18"/>
-              </w:rPr>
-              <w:t xml:space="preserve">798 (99.10%)</w:t>
-            </w:r>
-          </w:p>
-        </w:tc>
-        <w:tc>
-          <w:tcPr>
-            <w:tcW w:type="dxa" w:w="1190"/>
-            <w:tcBorders>
-              <w:top w:val="single" w:color="D9D8D2" w:sz="4"/>
-              <w:left w:val="single" w:color="D9D8D2" w:sz="4"/>
-              <w:bottom w:val="single" w:color="D9D8D2" w:sz="4"/>
-              <w:right w:val="single" w:color="D9D8D2" w:sz="4"/>
-            </w:tcBorders>
-            <w:shd w:fill="DCE9FA" w:color="auto" w:val="clear"/>
-            <w:tcMar>
-              <w:top w:type="dxa" w:w="60"/>
-              <w:left w:type="dxa" w:w="100"/>
-              <w:bottom w:type="dxa" w:w="60"/>
-              <w:right w:type="dxa" w:w="100"/>
-            </w:tcMar>
-          </w:tcPr>
-          <w:p>
-            <w:pPr>
-              <w:jc w:val="center"/>
-            </w:pPr>
-            <w:r>
-              <w:rPr>
-                <w:b/>
-                <w:bCs/>
-                <w:color w:val="1F1F1D"/>
-                <w:sz w:val="18"/>
-                <w:szCs w:val="18"/>
-              </w:rPr>
-              <w:t xml:space="preserve">1199 (98.97%)</w:t>
-            </w:r>
-          </w:p>
-        </w:tc>
-        <w:tc>
-          <w:tcPr>
-            <w:tcW w:type="dxa" w:w="1828"/>
-            <w:tcBorders>
-              <w:top w:val="single" w:color="D9D8D2" w:sz="4"/>
-              <w:left w:val="single" w:color="D9D8D2" w:sz="4"/>
-              <w:bottom w:val="single" w:color="D9D8D2" w:sz="4"/>
-              <w:right w:val="single" w:color="D9D8D2" w:sz="4"/>
-            </w:tcBorders>
-            <w:shd w:fill="DCE9FA" w:color="auto" w:val="clear"/>
-            <w:tcMar>
-              <w:top w:type="dxa" w:w="60"/>
-              <w:left w:type="dxa" w:w="100"/>
-              <w:bottom w:type="dxa" w:w="60"/>
-              <w:right w:type="dxa" w:w="100"/>
-            </w:tcMar>
-          </w:tcPr>
-          <w:p>
-            <w:pPr>
-              <w:jc w:val="center"/>
-            </w:pPr>
-            <w:r>
-              <w:rPr>
-                <w:b/>
-                <w:bCs/>
-                <w:color w:val="1F1F1D"/>
-                <w:sz w:val="18"/>
-                <w:szCs w:val="18"/>
-              </w:rPr>
-              <w:t xml:space="preserve">1331 (99.35%)</w:t>
-            </w:r>
-          </w:p>
-        </w:tc>
-      </w:tr>
-      <w:tr>
-        <w:trPr>
-          <w:cantSplit/>
-        </w:trPr>
-        <w:tc>
-          <w:tcPr>
-            <w:tcW w:type="dxa" w:w="1900"/>
-            <w:tcBorders>
-              <w:top w:val="single" w:color="D9D8D2" w:sz="4"/>
-              <w:left w:val="single" w:color="D9D8D2" w:sz="4"/>
-              <w:bottom w:val="single" w:color="D9D8D2" w:sz="4"/>
-              <w:right w:val="single" w:color="D9D8D2" w:sz="4"/>
-            </w:tcBorders>
-            <w:shd w:fill="DCE9FA" w:color="auto" w:val="clear"/>
-            <w:tcMar>
-              <w:top w:type="dxa" w:w="60"/>
-              <w:left w:type="dxa" w:w="100"/>
-              <w:bottom w:type="dxa" w:w="60"/>
-              <w:right w:type="dxa" w:w="100"/>
-            </w:tcMar>
-          </w:tcPr>
-          <w:p>
-            <w:pPr>
-              <w:jc w:val="left"/>
-            </w:pPr>
-            <w:r>
-              <w:rPr>
-                <w:b/>
-                <w:bCs/>
-                <w:color w:val="1F1F1D"/>
-                <w:sz w:val="18"/>
-                <w:szCs w:val="18"/>
-              </w:rPr>
-              <w:t xml:space="preserve">Hybrid ECC once</w:t>
-            </w:r>
-          </w:p>
-        </w:tc>
-        <w:tc>
-          <w:tcPr>
-            <w:tcW w:type="dxa" w:w="1180"/>
-            <w:tcBorders>
-              <w:top w:val="single" w:color="D9D8D2" w:sz="4"/>
-              <w:left w:val="single" w:color="D9D8D2" w:sz="4"/>
-              <w:bottom w:val="single" w:color="D9D8D2" w:sz="4"/>
-              <w:right w:val="single" w:color="D9D8D2" w:sz="4"/>
-            </w:tcBorders>
-            <w:shd w:fill="DCE9FA" w:color="auto" w:val="clear"/>
-            <w:tcMar>
-              <w:top w:type="dxa" w:w="60"/>
-              <w:left w:type="dxa" w:w="100"/>
-              <w:bottom w:type="dxa" w:w="60"/>
-              <w:right w:type="dxa" w:w="100"/>
-            </w:tcMar>
-          </w:tcPr>
-          <w:p>
-            <w:pPr>
-              <w:jc w:val="center"/>
-            </w:pPr>
-            <w:r>
-              <w:rPr>
-                <w:b/>
-                <w:bCs/>
-                <w:color w:val="1F1F1D"/>
-                <w:sz w:val="18"/>
-                <w:szCs w:val="18"/>
-              </w:rPr>
-              <w:t xml:space="preserve">1017 (99.12%)</w:t>
-            </w:r>
-          </w:p>
-        </w:tc>
-        <w:tc>
-          <w:tcPr>
-            <w:tcW w:type="dxa" w:w="1180"/>
-            <w:tcBorders>
-              <w:top w:val="single" w:color="D9D8D2" w:sz="4"/>
-              <w:left w:val="single" w:color="D9D8D2" w:sz="4"/>
-              <w:bottom w:val="single" w:color="D9D8D2" w:sz="4"/>
-              <w:right w:val="single" w:color="D9D8D2" w:sz="4"/>
-            </w:tcBorders>
-            <w:shd w:fill="DCE9FA" w:color="auto" w:val="clear"/>
-            <w:tcMar>
-              <w:top w:type="dxa" w:w="60"/>
-              <w:left w:type="dxa" w:w="100"/>
-              <w:bottom w:type="dxa" w:w="60"/>
-              <w:right w:type="dxa" w:w="100"/>
-            </w:tcMar>
-          </w:tcPr>
-          <w:p>
-            <w:pPr>
-              <w:jc w:val="center"/>
-            </w:pPr>
-            <w:r>
-              <w:rPr>
-                <w:b/>
-                <w:bCs/>
-                <w:color w:val="1F1F1D"/>
-                <w:sz w:val="18"/>
-                <w:szCs w:val="18"/>
-              </w:rPr>
-              <w:t xml:space="preserve">1141 (99.32%)</w:t>
-            </w:r>
-          </w:p>
-        </w:tc>
-        <w:tc>
-          <w:tcPr>
-            <w:tcW w:type="dxa" w:w="1180"/>
-            <w:tcBorders>
-              <w:top w:val="single" w:color="D9D8D2" w:sz="4"/>
-              <w:left w:val="single" w:color="D9D8D2" w:sz="4"/>
-              <w:bottom w:val="single" w:color="D9D8D2" w:sz="4"/>
-              <w:right w:val="single" w:color="D9D8D2" w:sz="4"/>
-            </w:tcBorders>
-            <w:shd w:fill="DCE9FA" w:color="auto" w:val="clear"/>
-            <w:tcMar>
-              <w:top w:type="dxa" w:w="60"/>
-              <w:left w:type="dxa" w:w="100"/>
-              <w:bottom w:type="dxa" w:w="60"/>
-              <w:right w:type="dxa" w:w="100"/>
-            </w:tcMar>
-          </w:tcPr>
-          <w:p>
-            <w:pPr>
-              <w:jc w:val="center"/>
-            </w:pPr>
-            <w:r>
-              <w:rPr>
-                <w:b/>
-                <w:bCs/>
-                <w:color w:val="1F1F1D"/>
-                <w:sz w:val="18"/>
-                <w:szCs w:val="18"/>
-              </w:rPr>
-              <w:t xml:space="preserve">2001 (99.69%)</w:t>
-            </w:r>
-          </w:p>
-        </w:tc>
-        <w:tc>
-          <w:tcPr>
-            <w:tcW w:type="dxa" w:w="1180"/>
-            <w:tcBorders>
-              <w:top w:val="single" w:color="D9D8D2" w:sz="4"/>
-              <w:left w:val="single" w:color="D9D8D2" w:sz="4"/>
-              <w:bottom w:val="single" w:color="D9D8D2" w:sz="4"/>
-              <w:right w:val="single" w:color="D9D8D2" w:sz="4"/>
-            </w:tcBorders>
-            <w:shd w:fill="DCE9FA" w:color="auto" w:val="clear"/>
-            <w:tcMar>
-              <w:top w:type="dxa" w:w="60"/>
-              <w:left w:type="dxa" w:w="100"/>
-              <w:bottom w:type="dxa" w:w="60"/>
-              <w:right w:type="dxa" w:w="100"/>
-            </w:tcMar>
-          </w:tcPr>
-          <w:p>
-            <w:pPr>
-              <w:jc w:val="center"/>
-            </w:pPr>
-            <w:r>
-              <w:rPr>
-                <w:b/>
-                <w:bCs/>
-                <w:color w:val="1F1F1D"/>
-                <w:sz w:val="18"/>
-                <w:szCs w:val="18"/>
-              </w:rPr>
-              <w:t xml:space="preserve">786 (99.16%)</w:t>
-            </w:r>
-          </w:p>
-        </w:tc>
-        <w:tc>
-          <w:tcPr>
-            <w:tcW w:type="dxa" w:w="1190"/>
-            <w:tcBorders>
-              <w:top w:val="single" w:color="D9D8D2" w:sz="4"/>
-              <w:left w:val="single" w:color="D9D8D2" w:sz="4"/>
-              <w:bottom w:val="single" w:color="D9D8D2" w:sz="4"/>
-              <w:right w:val="single" w:color="D9D8D2" w:sz="4"/>
-            </w:tcBorders>
-            <w:shd w:fill="DCE9FA" w:color="auto" w:val="clear"/>
-            <w:tcMar>
-              <w:top w:type="dxa" w:w="60"/>
-              <w:left w:type="dxa" w:w="100"/>
-              <w:bottom w:type="dxa" w:w="60"/>
-              <w:right w:type="dxa" w:w="100"/>
-            </w:tcMar>
-          </w:tcPr>
-          <w:p>
-            <w:pPr>
-              <w:jc w:val="center"/>
-            </w:pPr>
-            <w:r>
-              <w:rPr>
-                <w:b/>
-                <w:bCs/>
-                <w:color w:val="1F1F1D"/>
-                <w:sz w:val="18"/>
-                <w:szCs w:val="18"/>
-              </w:rPr>
-              <w:t xml:space="preserve">1182 (99.11%)</w:t>
-            </w:r>
-          </w:p>
-        </w:tc>
-        <w:tc>
-          <w:tcPr>
-            <w:tcW w:type="dxa" w:w="1828"/>
-            <w:tcBorders>
-              <w:top w:val="single" w:color="D9D8D2" w:sz="4"/>
-              <w:left w:val="single" w:color="D9D8D2" w:sz="4"/>
-              <w:bottom w:val="single" w:color="D9D8D2" w:sz="4"/>
-              <w:right w:val="single" w:color="D9D8D2" w:sz="4"/>
-            </w:tcBorders>
-            <w:shd w:fill="DCE9FA" w:color="auto" w:val="clear"/>
-            <w:tcMar>
-              <w:top w:type="dxa" w:w="60"/>
-              <w:left w:type="dxa" w:w="100"/>
-              <w:bottom w:type="dxa" w:w="60"/>
-              <w:right w:type="dxa" w:w="100"/>
-            </w:tcMar>
-          </w:tcPr>
-          <w:p>
-            <w:pPr>
-              <w:jc w:val="center"/>
-            </w:pPr>
-            <w:r>
-              <w:rPr>
-                <w:b/>
-                <w:bCs/>
-                <w:color w:val="1F1F1D"/>
-                <w:sz w:val="18"/>
-                <w:szCs w:val="18"/>
-              </w:rPr>
-              <w:t xml:space="preserve">1336 (99.38%)</w:t>
-            </w:r>
-          </w:p>
-        </w:tc>
-      </w:tr>
-      <w:tr>
-        <w:trPr>
-          <w:cantSplit/>
-        </w:trPr>
-        <w:tc>
-          <w:tcPr>
-            <w:tcW w:type="dxa" w:w="1900"/>
-            <w:tcBorders>
-              <w:top w:val="single" w:color="D9D8D2" w:sz="4"/>
-              <w:left w:val="single" w:color="D9D8D2" w:sz="4"/>
-              <w:bottom w:val="single" w:color="D9D8D2" w:sz="4"/>
-              <w:right w:val="single" w:color="D9D8D2" w:sz="4"/>
-            </w:tcBorders>
-            <w:shd w:fill="FFFFFF" w:color="auto" w:val="clear"/>
-            <w:tcMar>
-              <w:top w:type="dxa" w:w="60"/>
-              <w:left w:type="dxa" w:w="100"/>
-              <w:bottom w:type="dxa" w:w="60"/>
-              <w:right w:type="dxa" w:w="100"/>
-            </w:tcMar>
-          </w:tcPr>
-          <w:p>
-            <w:pPr>
-              <w:jc w:val="left"/>
-            </w:pPr>
-            <w:r>
-              <w:rPr>
-                <w:b w:val="false"/>
-                <w:bCs w:val="false"/>
-                <w:color w:val="1F1F1D"/>
-                <w:sz w:val="18"/>
-                <w:szCs w:val="18"/>
-              </w:rPr>
-              <w:t xml:space="preserve">Hybrid RSA per CH</w:t>
-            </w:r>
-          </w:p>
-        </w:tc>
-        <w:tc>
-          <w:tcPr>
-            <w:tcW w:type="dxa" w:w="1180"/>
-            <w:tcBorders>
-              <w:top w:val="single" w:color="D9D8D2" w:sz="4"/>
-              <w:left w:val="single" w:color="D9D8D2" w:sz="4"/>
-              <w:bottom w:val="single" w:color="D9D8D2" w:sz="4"/>
-              <w:right w:val="single" w:color="D9D8D2" w:sz="4"/>
-            </w:tcBorders>
-            <w:shd w:fill="FFFFFF" w:color="auto" w:val="clear"/>
-            <w:tcMar>
-              <w:top w:type="dxa" w:w="60"/>
-              <w:left w:type="dxa" w:w="100"/>
-              <w:bottom w:type="dxa" w:w="60"/>
-              <w:right w:type="dxa" w:w="100"/>
-            </w:tcMar>
-          </w:tcPr>
-          <w:p>
-            <w:pPr>
-              <w:jc w:val="center"/>
-            </w:pPr>
-            <w:r>
-              <w:rPr>
-                <w:b w:val="false"/>
-                <w:bCs w:val="false"/>
-                <w:color w:val="1F1F1D"/>
-                <w:sz w:val="18"/>
-                <w:szCs w:val="18"/>
-              </w:rPr>
-              <w:t xml:space="preserve">395 (99.08%)</w:t>
-            </w:r>
-          </w:p>
-        </w:tc>
-        <w:tc>
-          <w:tcPr>
-            <w:tcW w:type="dxa" w:w="1180"/>
-            <w:tcBorders>
-              <w:top w:val="single" w:color="D9D8D2" w:sz="4"/>
-              <w:left w:val="single" w:color="D9D8D2" w:sz="4"/>
-              <w:bottom w:val="single" w:color="D9D8D2" w:sz="4"/>
-              <w:right w:val="single" w:color="D9D8D2" w:sz="4"/>
-            </w:tcBorders>
-            <w:shd w:fill="FFFFFF" w:color="auto" w:val="clear"/>
-            <w:tcMar>
-              <w:top w:type="dxa" w:w="60"/>
-              <w:left w:type="dxa" w:w="100"/>
-              <w:bottom w:type="dxa" w:w="60"/>
-              <w:right w:type="dxa" w:w="100"/>
-            </w:tcMar>
-          </w:tcPr>
-          <w:p>
-            <w:pPr>
-              <w:jc w:val="center"/>
-            </w:pPr>
-            <w:r>
-              <w:rPr>
-                <w:b w:val="false"/>
-                <w:bCs w:val="false"/>
-                <w:color w:val="1F1F1D"/>
-                <w:sz w:val="18"/>
-                <w:szCs w:val="18"/>
-              </w:rPr>
-              <w:t xml:space="preserve">874 (97.72%)</w:t>
-            </w:r>
-          </w:p>
-        </w:tc>
-        <w:tc>
-          <w:tcPr>
-            <w:tcW w:type="dxa" w:w="1180"/>
-            <w:tcBorders>
-              <w:top w:val="single" w:color="D9D8D2" w:sz="4"/>
-              <w:left w:val="single" w:color="D9D8D2" w:sz="4"/>
-              <w:bottom w:val="single" w:color="D9D8D2" w:sz="4"/>
-              <w:right w:val="single" w:color="D9D8D2" w:sz="4"/>
-            </w:tcBorders>
-            <w:shd w:fill="FFFFFF" w:color="auto" w:val="clear"/>
-            <w:tcMar>
-              <w:top w:type="dxa" w:w="60"/>
-              <w:left w:type="dxa" w:w="100"/>
-              <w:bottom w:type="dxa" w:w="60"/>
-              <w:right w:type="dxa" w:w="100"/>
-            </w:tcMar>
-          </w:tcPr>
-          <w:p>
-            <w:pPr>
-              <w:jc w:val="center"/>
-            </w:pPr>
-            <w:r>
-              <w:rPr>
-                <w:b w:val="false"/>
-                <w:bCs w:val="false"/>
-                <w:color w:val="1F1F1D"/>
-                <w:sz w:val="18"/>
-                <w:szCs w:val="18"/>
-              </w:rPr>
-              <w:t xml:space="preserve">1336 (96.21%)</w:t>
-            </w:r>
-          </w:p>
-        </w:tc>
-        <w:tc>
-          <w:tcPr>
-            <w:tcW w:type="dxa" w:w="1180"/>
-            <w:tcBorders>
-              <w:top w:val="single" w:color="D9D8D2" w:sz="4"/>
-              <w:left w:val="single" w:color="D9D8D2" w:sz="4"/>
-              <w:bottom w:val="single" w:color="D9D8D2" w:sz="4"/>
-              <w:right w:val="single" w:color="D9D8D2" w:sz="4"/>
-            </w:tcBorders>
-            <w:shd w:fill="FFFFFF" w:color="auto" w:val="clear"/>
-            <w:tcMar>
-              <w:top w:type="dxa" w:w="60"/>
-              <w:left w:type="dxa" w:w="100"/>
-              <w:bottom w:type="dxa" w:w="60"/>
-              <w:right w:type="dxa" w:w="100"/>
-            </w:tcMar>
-          </w:tcPr>
-          <w:p>
-            <w:pPr>
-              <w:jc w:val="center"/>
-            </w:pPr>
-            <w:r>
-              <w:rPr>
-                <w:b w:val="false"/>
-                <w:bCs w:val="false"/>
-                <w:color w:val="1F1F1D"/>
-                <w:sz w:val="18"/>
-                <w:szCs w:val="18"/>
-              </w:rPr>
-              <w:t xml:space="preserve">351 (98.84%)</w:t>
-            </w:r>
-          </w:p>
-        </w:tc>
-        <w:tc>
-          <w:tcPr>
-            <w:tcW w:type="dxa" w:w="1190"/>
-            <w:tcBorders>
-              <w:top w:val="single" w:color="D9D8D2" w:sz="4"/>
-              <w:left w:val="single" w:color="D9D8D2" w:sz="4"/>
-              <w:bottom w:val="single" w:color="D9D8D2" w:sz="4"/>
-              <w:right w:val="single" w:color="D9D8D2" w:sz="4"/>
-            </w:tcBorders>
-            <w:shd w:fill="FFFFFF" w:color="auto" w:val="clear"/>
-            <w:tcMar>
-              <w:top w:type="dxa" w:w="60"/>
-              <w:left w:type="dxa" w:w="100"/>
-              <w:bottom w:type="dxa" w:w="60"/>
-              <w:right w:type="dxa" w:w="100"/>
-            </w:tcMar>
-          </w:tcPr>
-          <w:p>
-            <w:pPr>
-              <w:jc w:val="center"/>
-            </w:pPr>
-            <w:r>
-              <w:rPr>
-                <w:b w:val="false"/>
-                <w:bCs w:val="false"/>
-                <w:color w:val="1F1F1D"/>
-                <w:sz w:val="18"/>
-                <w:szCs w:val="18"/>
-              </w:rPr>
-              <w:t xml:space="preserve">894 (97.35%)</w:t>
-            </w:r>
-          </w:p>
-        </w:tc>
-        <w:tc>
-          <w:tcPr>
-            <w:tcW w:type="dxa" w:w="1828"/>
-            <w:tcBorders>
-              <w:top w:val="single" w:color="D9D8D2" w:sz="4"/>
-              <w:left w:val="single" w:color="D9D8D2" w:sz="4"/>
-              <w:bottom w:val="single" w:color="D9D8D2" w:sz="4"/>
-              <w:right w:val="single" w:color="D9D8D2" w:sz="4"/>
-            </w:tcBorders>
-            <w:shd w:fill="FFFFFF" w:color="auto" w:val="clear"/>
-            <w:tcMar>
-              <w:top w:type="dxa" w:w="60"/>
-              <w:left w:type="dxa" w:w="100"/>
-              <w:bottom w:type="dxa" w:w="60"/>
-              <w:right w:type="dxa" w:w="100"/>
-            </w:tcMar>
-          </w:tcPr>
-          <w:p>
-            <w:pPr>
-              <w:jc w:val="center"/>
-            </w:pPr>
-            <w:r>
-              <w:rPr>
-                <w:b w:val="false"/>
-                <w:bCs w:val="false"/>
-                <w:color w:val="1F1F1D"/>
-                <w:sz w:val="18"/>
-                <w:szCs w:val="18"/>
-              </w:rPr>
-              <w:t xml:space="preserve">956 (96.55%)</w:t>
-            </w:r>
-          </w:p>
-        </w:tc>
-      </w:tr>
-      <w:tr>
-        <w:trPr>
-          <w:cantSplit/>
-        </w:trPr>
-        <w:tc>
-          <w:tcPr>
-            <w:tcW w:type="dxa" w:w="1900"/>
-            <w:tcBorders>
-              <w:top w:val="single" w:color="D9D8D2" w:sz="4"/>
-              <w:left w:val="single" w:color="D9D8D2" w:sz="4"/>
-              <w:bottom w:val="single" w:color="D9D8D2" w:sz="4"/>
-              <w:right w:val="single" w:color="D9D8D2" w:sz="4"/>
-            </w:tcBorders>
-            <w:shd w:fill="F3F6FB" w:color="auto" w:val="clear"/>
-            <w:tcMar>
-              <w:top w:type="dxa" w:w="60"/>
-              <w:left w:type="dxa" w:w="100"/>
-              <w:bottom w:type="dxa" w:w="60"/>
-              <w:right w:type="dxa" w:w="100"/>
-            </w:tcMar>
-          </w:tcPr>
-          <w:p>
-            <w:pPr>
-              <w:jc w:val="left"/>
-            </w:pPr>
-            <w:r>
-              <w:rPr>
-                <w:b w:val="false"/>
-                <w:bCs w:val="false"/>
-                <w:color w:val="1F1F1D"/>
-                <w:sz w:val="18"/>
-                <w:szCs w:val="18"/>
-              </w:rPr>
-              <w:t xml:space="preserve">Hybrid ECC per CH</w:t>
-            </w:r>
-          </w:p>
-        </w:tc>
-        <w:tc>
-          <w:tcPr>
-            <w:tcW w:type="dxa" w:w="1180"/>
-            <w:tcBorders>
-              <w:top w:val="single" w:color="D9D8D2" w:sz="4"/>
-              <w:left w:val="single" w:color="D9D8D2" w:sz="4"/>
-              <w:bottom w:val="single" w:color="D9D8D2" w:sz="4"/>
-              <w:right w:val="single" w:color="D9D8D2" w:sz="4"/>
-            </w:tcBorders>
-            <w:shd w:fill="F3F6FB" w:color="auto" w:val="clear"/>
-            <w:tcMar>
-              <w:top w:type="dxa" w:w="60"/>
-              <w:left w:type="dxa" w:w="100"/>
-              <w:bottom w:type="dxa" w:w="60"/>
-              <w:right w:type="dxa" w:w="100"/>
-            </w:tcMar>
-          </w:tcPr>
-          <w:p>
-            <w:pPr>
-              <w:jc w:val="center"/>
-            </w:pPr>
-            <w:r>
-              <w:rPr>
-                <w:b w:val="false"/>
-                <w:bCs w:val="false"/>
-                <w:color w:val="1F1F1D"/>
-                <w:sz w:val="18"/>
-                <w:szCs w:val="18"/>
-              </w:rPr>
-              <w:t xml:space="preserve">302 (98.06%)</w:t>
-            </w:r>
-          </w:p>
-        </w:tc>
-        <w:tc>
-          <w:tcPr>
-            <w:tcW w:type="dxa" w:w="1180"/>
-            <w:tcBorders>
-              <w:top w:val="single" w:color="D9D8D2" w:sz="4"/>
-              <w:left w:val="single" w:color="D9D8D2" w:sz="4"/>
-              <w:bottom w:val="single" w:color="D9D8D2" w:sz="4"/>
-              <w:right w:val="single" w:color="D9D8D2" w:sz="4"/>
-            </w:tcBorders>
-            <w:shd w:fill="F3F6FB" w:color="auto" w:val="clear"/>
-            <w:tcMar>
-              <w:top w:type="dxa" w:w="60"/>
-              <w:left w:type="dxa" w:w="100"/>
-              <w:bottom w:type="dxa" w:w="60"/>
-              <w:right w:type="dxa" w:w="100"/>
-            </w:tcMar>
-          </w:tcPr>
-          <w:p>
-            <w:pPr>
-              <w:jc w:val="center"/>
-            </w:pPr>
-            <w:r>
-              <w:rPr>
-                <w:b w:val="false"/>
-                <w:bCs w:val="false"/>
-                <w:color w:val="1F1F1D"/>
-                <w:sz w:val="18"/>
-                <w:szCs w:val="18"/>
-              </w:rPr>
-              <w:t xml:space="preserve">774 (97.68%)</w:t>
-            </w:r>
-          </w:p>
-        </w:tc>
-        <w:tc>
-          <w:tcPr>
-            <w:tcW w:type="dxa" w:w="1180"/>
-            <w:tcBorders>
-              <w:top w:val="single" w:color="D9D8D2" w:sz="4"/>
-              <w:left w:val="single" w:color="D9D8D2" w:sz="4"/>
-              <w:bottom w:val="single" w:color="D9D8D2" w:sz="4"/>
-              <w:right w:val="single" w:color="D9D8D2" w:sz="4"/>
-            </w:tcBorders>
-            <w:shd w:fill="F3F6FB" w:color="auto" w:val="clear"/>
-            <w:tcMar>
-              <w:top w:type="dxa" w:w="60"/>
-              <w:left w:type="dxa" w:w="100"/>
-              <w:bottom w:type="dxa" w:w="60"/>
-              <w:right w:type="dxa" w:w="100"/>
-            </w:tcMar>
-          </w:tcPr>
-          <w:p>
-            <w:pPr>
-              <w:jc w:val="center"/>
-            </w:pPr>
-            <w:r>
-              <w:rPr>
-                <w:b w:val="false"/>
-                <w:bCs w:val="false"/>
-                <w:color w:val="1F1F1D"/>
-                <w:sz w:val="18"/>
-                <w:szCs w:val="18"/>
-              </w:rPr>
-              <w:t xml:space="preserve">1121 (95.17%)</w:t>
-            </w:r>
-          </w:p>
-        </w:tc>
-        <w:tc>
-          <w:tcPr>
-            <w:tcW w:type="dxa" w:w="1180"/>
-            <w:tcBorders>
-              <w:top w:val="single" w:color="D9D8D2" w:sz="4"/>
-              <w:left w:val="single" w:color="D9D8D2" w:sz="4"/>
-              <w:bottom w:val="single" w:color="D9D8D2" w:sz="4"/>
-              <w:right w:val="single" w:color="D9D8D2" w:sz="4"/>
-            </w:tcBorders>
-            <w:shd w:fill="F3F6FB" w:color="auto" w:val="clear"/>
-            <w:tcMar>
-              <w:top w:type="dxa" w:w="60"/>
-              <w:left w:type="dxa" w:w="100"/>
-              <w:bottom w:type="dxa" w:w="60"/>
-              <w:right w:type="dxa" w:w="100"/>
-            </w:tcMar>
-          </w:tcPr>
-          <w:p>
-            <w:pPr>
-              <w:jc w:val="center"/>
-            </w:pPr>
-            <w:r>
-              <w:rPr>
-                <w:b w:val="false"/>
-                <w:bCs w:val="false"/>
-                <w:color w:val="1F1F1D"/>
-                <w:sz w:val="18"/>
-                <w:szCs w:val="18"/>
-              </w:rPr>
-              <w:t xml:space="preserve">281 (98.83%)</w:t>
-            </w:r>
-          </w:p>
-        </w:tc>
-        <w:tc>
-          <w:tcPr>
-            <w:tcW w:type="dxa" w:w="1190"/>
-            <w:tcBorders>
-              <w:top w:val="single" w:color="D9D8D2" w:sz="4"/>
-              <w:left w:val="single" w:color="D9D8D2" w:sz="4"/>
-              <w:bottom w:val="single" w:color="D9D8D2" w:sz="4"/>
-              <w:right w:val="single" w:color="D9D8D2" w:sz="4"/>
-            </w:tcBorders>
-            <w:shd w:fill="F3F6FB" w:color="auto" w:val="clear"/>
-            <w:tcMar>
-              <w:top w:type="dxa" w:w="60"/>
-              <w:left w:type="dxa" w:w="100"/>
-              <w:bottom w:type="dxa" w:w="60"/>
-              <w:right w:type="dxa" w:w="100"/>
-            </w:tcMar>
-          </w:tcPr>
-          <w:p>
-            <w:pPr>
-              <w:jc w:val="center"/>
-            </w:pPr>
-            <w:r>
-              <w:rPr>
-                <w:b w:val="false"/>
-                <w:bCs w:val="false"/>
-                <w:color w:val="1F1F1D"/>
-                <w:sz w:val="18"/>
-                <w:szCs w:val="18"/>
-              </w:rPr>
-              <w:t xml:space="preserve">796 (96.81%)</w:t>
-            </w:r>
-          </w:p>
-        </w:tc>
-        <w:tc>
-          <w:tcPr>
-            <w:tcW w:type="dxa" w:w="1828"/>
-            <w:tcBorders>
-              <w:top w:val="single" w:color="D9D8D2" w:sz="4"/>
-              <w:left w:val="single" w:color="D9D8D2" w:sz="4"/>
-              <w:bottom w:val="single" w:color="D9D8D2" w:sz="4"/>
-              <w:right w:val="single" w:color="D9D8D2" w:sz="4"/>
-            </w:tcBorders>
-            <w:shd w:fill="F3F6FB" w:color="auto" w:val="clear"/>
-            <w:tcMar>
-              <w:top w:type="dxa" w:w="60"/>
-              <w:left w:type="dxa" w:w="100"/>
-              <w:bottom w:type="dxa" w:w="60"/>
-              <w:right w:type="dxa" w:w="100"/>
-            </w:tcMar>
-          </w:tcPr>
-          <w:p>
-            <w:pPr>
-              <w:jc w:val="center"/>
-            </w:pPr>
-            <w:r>
-              <w:rPr>
-                <w:b w:val="false"/>
-                <w:bCs w:val="false"/>
-                <w:color w:val="1F1F1D"/>
-                <w:sz w:val="18"/>
-                <w:szCs w:val="18"/>
-              </w:rPr>
-              <w:t xml:space="preserve">866 (95.66%)</w:t>
-            </w:r>
-          </w:p>
-        </w:tc>
-      </w:tr>
-      <w:tr>
-        <w:trPr>
-          <w:cantSplit/>
-        </w:trPr>
-        <w:tc>
-          <w:tcPr>
-            <w:tcW w:type="dxa" w:w="1900"/>
-            <w:tcBorders>
-              <w:top w:val="single" w:color="D9D8D2" w:sz="4"/>
-              <w:left w:val="single" w:color="D9D8D2" w:sz="4"/>
-              <w:bottom w:val="single" w:color="D9D8D2" w:sz="4"/>
-              <w:right w:val="single" w:color="D9D8D2" w:sz="4"/>
-            </w:tcBorders>
-            <w:shd w:fill="FFFFFF" w:color="auto" w:val="clear"/>
-            <w:tcMar>
-              <w:top w:type="dxa" w:w="60"/>
-              <w:left w:type="dxa" w:w="100"/>
-              <w:bottom w:type="dxa" w:w="60"/>
-              <w:right w:type="dxa" w:w="100"/>
-            </w:tcMar>
-          </w:tcPr>
-          <w:p>
-            <w:pPr>
-              <w:jc w:val="left"/>
-            </w:pPr>
-            <w:r>
-              <w:rPr>
-                <w:b w:val="false"/>
-                <w:bCs w:val="false"/>
-                <w:color w:val="1F1F1D"/>
-                <w:sz w:val="18"/>
-                <w:szCs w:val="18"/>
-              </w:rPr>
-              <w:t xml:space="preserve">ECC on CH → sink</w:t>
-            </w:r>
-          </w:p>
-        </w:tc>
-        <w:tc>
-          <w:tcPr>
-            <w:tcW w:type="dxa" w:w="1180"/>
-            <w:tcBorders>
-              <w:top w:val="single" w:color="D9D8D2" w:sz="4"/>
-              <w:left w:val="single" w:color="D9D8D2" w:sz="4"/>
-              <w:bottom w:val="single" w:color="D9D8D2" w:sz="4"/>
-              <w:right w:val="single" w:color="D9D8D2" w:sz="4"/>
-            </w:tcBorders>
-            <w:shd w:fill="FFFFFF" w:color="auto" w:val="clear"/>
-            <w:tcMar>
-              <w:top w:type="dxa" w:w="60"/>
-              <w:left w:type="dxa" w:w="100"/>
-              <w:bottom w:type="dxa" w:w="60"/>
-              <w:right w:type="dxa" w:w="100"/>
-            </w:tcMar>
-          </w:tcPr>
-          <w:p>
-            <w:pPr>
-              <w:jc w:val="center"/>
-            </w:pPr>
-            <w:r>
-              <w:rPr>
-                <w:b w:val="false"/>
-                <w:bCs w:val="false"/>
-                <w:color w:val="1F1F1D"/>
-                <w:sz w:val="18"/>
-                <w:szCs w:val="18"/>
-              </w:rPr>
-              <w:t xml:space="preserve">284 (96.98%)</w:t>
-            </w:r>
-          </w:p>
-        </w:tc>
-        <w:tc>
-          <w:tcPr>
-            <w:tcW w:type="dxa" w:w="1180"/>
-            <w:tcBorders>
-              <w:top w:val="single" w:color="D9D8D2" w:sz="4"/>
-              <w:left w:val="single" w:color="D9D8D2" w:sz="4"/>
-              <w:bottom w:val="single" w:color="D9D8D2" w:sz="4"/>
-              <w:right w:val="single" w:color="D9D8D2" w:sz="4"/>
-            </w:tcBorders>
-            <w:shd w:fill="FFFFFF" w:color="auto" w:val="clear"/>
-            <w:tcMar>
-              <w:top w:type="dxa" w:w="60"/>
-              <w:left w:type="dxa" w:w="100"/>
-              <w:bottom w:type="dxa" w:w="60"/>
-              <w:right w:type="dxa" w:w="100"/>
-            </w:tcMar>
-          </w:tcPr>
-          <w:p>
-            <w:pPr>
-              <w:jc w:val="center"/>
-            </w:pPr>
-            <w:r>
-              <w:rPr>
-                <w:b w:val="false"/>
-                <w:bCs w:val="false"/>
-                <w:color w:val="1F1F1D"/>
-                <w:sz w:val="18"/>
-                <w:szCs w:val="18"/>
-              </w:rPr>
-              <w:t xml:space="preserve">774 (97.68%)</w:t>
-            </w:r>
-          </w:p>
-        </w:tc>
-        <w:tc>
-          <w:tcPr>
-            <w:tcW w:type="dxa" w:w="1180"/>
-            <w:tcBorders>
-              <w:top w:val="single" w:color="D9D8D2" w:sz="4"/>
-              <w:left w:val="single" w:color="D9D8D2" w:sz="4"/>
-              <w:bottom w:val="single" w:color="D9D8D2" w:sz="4"/>
-              <w:right w:val="single" w:color="D9D8D2" w:sz="4"/>
-            </w:tcBorders>
-            <w:shd w:fill="FFFFFF" w:color="auto" w:val="clear"/>
-            <w:tcMar>
-              <w:top w:type="dxa" w:w="60"/>
-              <w:left w:type="dxa" w:w="100"/>
-              <w:bottom w:type="dxa" w:w="60"/>
-              <w:right w:type="dxa" w:w="100"/>
-            </w:tcMar>
-          </w:tcPr>
-          <w:p>
-            <w:pPr>
-              <w:jc w:val="center"/>
-            </w:pPr>
-            <w:r>
-              <w:rPr>
-                <w:b w:val="false"/>
-                <w:bCs w:val="false"/>
-                <w:color w:val="1F1F1D"/>
-                <w:sz w:val="18"/>
-                <w:szCs w:val="18"/>
-              </w:rPr>
-              <w:t xml:space="preserve">736 (96.26%)</w:t>
-            </w:r>
-          </w:p>
-        </w:tc>
-        <w:tc>
-          <w:tcPr>
-            <w:tcW w:type="dxa" w:w="1180"/>
-            <w:tcBorders>
-              <w:top w:val="single" w:color="D9D8D2" w:sz="4"/>
-              <w:left w:val="single" w:color="D9D8D2" w:sz="4"/>
-              <w:bottom w:val="single" w:color="D9D8D2" w:sz="4"/>
-              <w:right w:val="single" w:color="D9D8D2" w:sz="4"/>
-            </w:tcBorders>
-            <w:shd w:fill="FFFFFF" w:color="auto" w:val="clear"/>
-            <w:tcMar>
-              <w:top w:type="dxa" w:w="60"/>
-              <w:left w:type="dxa" w:w="100"/>
-              <w:bottom w:type="dxa" w:w="60"/>
-              <w:right w:type="dxa" w:w="100"/>
-            </w:tcMar>
-          </w:tcPr>
-          <w:p>
-            <w:pPr>
-              <w:jc w:val="center"/>
-            </w:pPr>
-            <w:r>
-              <w:rPr>
-                <w:b w:val="false"/>
-                <w:bCs w:val="false"/>
-                <w:color w:val="1F1F1D"/>
-                <w:sz w:val="18"/>
-                <w:szCs w:val="18"/>
-              </w:rPr>
-              <w:t xml:space="preserve">264 (95.84%)</w:t>
-            </w:r>
-          </w:p>
-        </w:tc>
-        <w:tc>
-          <w:tcPr>
-            <w:tcW w:type="dxa" w:w="1190"/>
-            <w:tcBorders>
-              <w:top w:val="single" w:color="D9D8D2" w:sz="4"/>
-              <w:left w:val="single" w:color="D9D8D2" w:sz="4"/>
-              <w:bottom w:val="single" w:color="D9D8D2" w:sz="4"/>
-              <w:right w:val="single" w:color="D9D8D2" w:sz="4"/>
-            </w:tcBorders>
-            <w:shd w:fill="FFFFFF" w:color="auto" w:val="clear"/>
-            <w:tcMar>
-              <w:top w:type="dxa" w:w="60"/>
-              <w:left w:type="dxa" w:w="100"/>
-              <w:bottom w:type="dxa" w:w="60"/>
-              <w:right w:type="dxa" w:w="100"/>
-            </w:tcMar>
-          </w:tcPr>
-          <w:p>
-            <w:pPr>
-              <w:jc w:val="center"/>
-            </w:pPr>
-            <w:r>
-              <w:rPr>
-                <w:b w:val="false"/>
-                <w:bCs w:val="false"/>
-                <w:color w:val="1F1F1D"/>
-                <w:sz w:val="18"/>
-                <w:szCs w:val="18"/>
-              </w:rPr>
-              <w:t xml:space="preserve">796 (96.81%)</w:t>
-            </w:r>
-          </w:p>
-        </w:tc>
-        <w:tc>
-          <w:tcPr>
-            <w:tcW w:type="dxa" w:w="1828"/>
-            <w:tcBorders>
-              <w:top w:val="single" w:color="D9D8D2" w:sz="4"/>
-              <w:left w:val="single" w:color="D9D8D2" w:sz="4"/>
-              <w:bottom w:val="single" w:color="D9D8D2" w:sz="4"/>
-              <w:right w:val="single" w:color="D9D8D2" w:sz="4"/>
-            </w:tcBorders>
-            <w:shd w:fill="FFFFFF" w:color="auto" w:val="clear"/>
-            <w:tcMar>
-              <w:top w:type="dxa" w:w="60"/>
-              <w:left w:type="dxa" w:w="100"/>
-              <w:bottom w:type="dxa" w:w="60"/>
-              <w:right w:type="dxa" w:w="100"/>
-            </w:tcMar>
-          </w:tcPr>
-          <w:p>
-            <w:pPr>
-              <w:jc w:val="center"/>
-            </w:pPr>
-            <w:r>
-              <w:rPr>
-                <w:b w:val="false"/>
-                <w:bCs w:val="false"/>
-                <w:color w:val="1F1F1D"/>
-                <w:sz w:val="18"/>
-                <w:szCs w:val="18"/>
-              </w:rPr>
-              <w:t xml:space="preserve">716 (96.01%)</w:t>
-            </w:r>
-          </w:p>
-        </w:tc>
-      </w:tr>
-      <w:tr>
-        <w:trPr>
-          <w:cantSplit/>
-        </w:trPr>
-        <w:tc>
-          <w:tcPr>
-            <w:tcW w:type="dxa" w:w="1900"/>
-            <w:tcBorders>
-              <w:top w:val="single" w:color="D9D8D2" w:sz="4"/>
-              <w:left w:val="single" w:color="D9D8D2" w:sz="4"/>
-              <w:bottom w:val="single" w:color="D9D8D2" w:sz="4"/>
-              <w:right w:val="single" w:color="D9D8D2" w:sz="4"/>
-            </w:tcBorders>
-            <w:shd w:fill="F3F6FB" w:color="auto" w:val="clear"/>
-            <w:tcMar>
-              <w:top w:type="dxa" w:w="60"/>
-              <w:left w:type="dxa" w:w="100"/>
-              <w:bottom w:type="dxa" w:w="60"/>
-              <w:right w:type="dxa" w:w="100"/>
-            </w:tcMar>
-          </w:tcPr>
-          <w:p>
-            <w:pPr>
-              <w:jc w:val="left"/>
-            </w:pPr>
-            <w:r>
-              <w:rPr>
-                <w:b w:val="false"/>
-                <w:bCs w:val="false"/>
-                <w:color w:val="1F1F1D"/>
-                <w:sz w:val="18"/>
-                <w:szCs w:val="18"/>
-              </w:rPr>
-              <w:t xml:space="preserve">RSA on CH → sink</w:t>
-            </w:r>
-          </w:p>
-        </w:tc>
-        <w:tc>
-          <w:tcPr>
-            <w:tcW w:type="dxa" w:w="1180"/>
-            <w:tcBorders>
-              <w:top w:val="single" w:color="D9D8D2" w:sz="4"/>
-              <w:left w:val="single" w:color="D9D8D2" w:sz="4"/>
-              <w:bottom w:val="single" w:color="D9D8D2" w:sz="4"/>
-              <w:right w:val="single" w:color="D9D8D2" w:sz="4"/>
-            </w:tcBorders>
-            <w:shd w:fill="F3F6FB" w:color="auto" w:val="clear"/>
-            <w:tcMar>
-              <w:top w:type="dxa" w:w="60"/>
-              <w:left w:type="dxa" w:w="100"/>
-              <w:bottom w:type="dxa" w:w="60"/>
-              <w:right w:type="dxa" w:w="100"/>
-            </w:tcMar>
-          </w:tcPr>
-          <w:p>
-            <w:pPr>
-              <w:jc w:val="center"/>
-            </w:pPr>
-            <w:r>
-              <w:rPr>
-                <w:b w:val="false"/>
-                <w:bCs w:val="false"/>
-                <w:color w:val="1F1F1D"/>
-                <w:sz w:val="18"/>
-                <w:szCs w:val="18"/>
-              </w:rPr>
-              <w:t xml:space="preserve">201 (95.32%)</w:t>
-            </w:r>
-          </w:p>
-        </w:tc>
-        <w:tc>
-          <w:tcPr>
-            <w:tcW w:type="dxa" w:w="1180"/>
-            <w:tcBorders>
-              <w:top w:val="single" w:color="D9D8D2" w:sz="4"/>
-              <w:left w:val="single" w:color="D9D8D2" w:sz="4"/>
-              <w:bottom w:val="single" w:color="D9D8D2" w:sz="4"/>
-              <w:right w:val="single" w:color="D9D8D2" w:sz="4"/>
-            </w:tcBorders>
-            <w:shd w:fill="F3F6FB" w:color="auto" w:val="clear"/>
-            <w:tcMar>
-              <w:top w:type="dxa" w:w="60"/>
-              <w:left w:type="dxa" w:w="100"/>
-              <w:bottom w:type="dxa" w:w="60"/>
-              <w:right w:type="dxa" w:w="100"/>
-            </w:tcMar>
-          </w:tcPr>
-          <w:p>
-            <w:pPr>
-              <w:jc w:val="center"/>
-            </w:pPr>
-            <w:r>
-              <w:rPr>
-                <w:b w:val="false"/>
-                <w:bCs w:val="false"/>
-                <w:color w:val="1F1F1D"/>
-                <w:sz w:val="18"/>
-                <w:szCs w:val="18"/>
-              </w:rPr>
-              <w:t xml:space="preserve">674 (94.46%)</w:t>
-            </w:r>
-          </w:p>
-        </w:tc>
-        <w:tc>
-          <w:tcPr>
-            <w:tcW w:type="dxa" w:w="1180"/>
-            <w:tcBorders>
-              <w:top w:val="single" w:color="D9D8D2" w:sz="4"/>
-              <w:left w:val="single" w:color="D9D8D2" w:sz="4"/>
-              <w:bottom w:val="single" w:color="D9D8D2" w:sz="4"/>
-              <w:right w:val="single" w:color="D9D8D2" w:sz="4"/>
-            </w:tcBorders>
-            <w:shd w:fill="F3F6FB" w:color="auto" w:val="clear"/>
-            <w:tcMar>
-              <w:top w:type="dxa" w:w="60"/>
-              <w:left w:type="dxa" w:w="100"/>
-              <w:bottom w:type="dxa" w:w="60"/>
-              <w:right w:type="dxa" w:w="100"/>
-            </w:tcMar>
-          </w:tcPr>
-          <w:p>
-            <w:pPr>
-              <w:jc w:val="center"/>
-            </w:pPr>
-            <w:r>
-              <w:rPr>
-                <w:b w:val="false"/>
-                <w:bCs w:val="false"/>
-                <w:color w:val="1F1F1D"/>
-                <w:sz w:val="18"/>
-                <w:szCs w:val="18"/>
-              </w:rPr>
-              <w:t xml:space="preserve">371 (96.25%)</w:t>
-            </w:r>
-          </w:p>
-        </w:tc>
-        <w:tc>
-          <w:tcPr>
-            <w:tcW w:type="dxa" w:w="1180"/>
-            <w:tcBorders>
-              <w:top w:val="single" w:color="D9D8D2" w:sz="4"/>
-              <w:left w:val="single" w:color="D9D8D2" w:sz="4"/>
-              <w:bottom w:val="single" w:color="D9D8D2" w:sz="4"/>
-              <w:right w:val="single" w:color="D9D8D2" w:sz="4"/>
-            </w:tcBorders>
-            <w:shd w:fill="F3F6FB" w:color="auto" w:val="clear"/>
-            <w:tcMar>
-              <w:top w:type="dxa" w:w="60"/>
-              <w:left w:type="dxa" w:w="100"/>
-              <w:bottom w:type="dxa" w:w="60"/>
-              <w:right w:type="dxa" w:w="100"/>
-            </w:tcMar>
-          </w:tcPr>
-          <w:p>
-            <w:pPr>
-              <w:jc w:val="center"/>
-            </w:pPr>
-            <w:r>
-              <w:rPr>
-                <w:b w:val="false"/>
-                <w:bCs w:val="false"/>
-                <w:color w:val="1F1F1D"/>
-                <w:sz w:val="18"/>
-                <w:szCs w:val="18"/>
-              </w:rPr>
-              <w:t xml:space="preserve">181 (94.15%)</w:t>
-            </w:r>
-          </w:p>
-        </w:tc>
-        <w:tc>
-          <w:tcPr>
-            <w:tcW w:type="dxa" w:w="1190"/>
-            <w:tcBorders>
-              <w:top w:val="single" w:color="D9D8D2" w:sz="4"/>
-              <w:left w:val="single" w:color="D9D8D2" w:sz="4"/>
-              <w:bottom w:val="single" w:color="D9D8D2" w:sz="4"/>
-              <w:right w:val="single" w:color="D9D8D2" w:sz="4"/>
-            </w:tcBorders>
-            <w:shd w:fill="F3F6FB" w:color="auto" w:val="clear"/>
-            <w:tcMar>
-              <w:top w:type="dxa" w:w="60"/>
-              <w:left w:type="dxa" w:w="100"/>
-              <w:bottom w:type="dxa" w:w="60"/>
-              <w:right w:type="dxa" w:w="100"/>
-            </w:tcMar>
-          </w:tcPr>
-          <w:p>
-            <w:pPr>
-              <w:jc w:val="center"/>
-            </w:pPr>
-            <w:r>
-              <w:rPr>
-                <w:b w:val="false"/>
-                <w:bCs w:val="false"/>
-                <w:color w:val="1F1F1D"/>
-                <w:sz w:val="18"/>
-                <w:szCs w:val="18"/>
-              </w:rPr>
-              <w:t xml:space="preserve">674 (95.94%)</w:t>
-            </w:r>
-          </w:p>
-        </w:tc>
-        <w:tc>
-          <w:tcPr>
-            <w:tcW w:type="dxa" w:w="1828"/>
-            <w:tcBorders>
-              <w:top w:val="single" w:color="D9D8D2" w:sz="4"/>
-              <w:left w:val="single" w:color="D9D8D2" w:sz="4"/>
-              <w:bottom w:val="single" w:color="D9D8D2" w:sz="4"/>
-              <w:right w:val="single" w:color="D9D8D2" w:sz="4"/>
-            </w:tcBorders>
-            <w:shd w:fill="F3F6FB" w:color="auto" w:val="clear"/>
-            <w:tcMar>
-              <w:top w:type="dxa" w:w="60"/>
-              <w:left w:type="dxa" w:w="100"/>
-              <w:bottom w:type="dxa" w:w="60"/>
-              <w:right w:type="dxa" w:w="100"/>
-            </w:tcMar>
-          </w:tcPr>
-          <w:p>
-            <w:pPr>
-              <w:jc w:val="center"/>
-            </w:pPr>
-            <w:r>
-              <w:rPr>
-                <w:b w:val="false"/>
-                <w:bCs w:val="false"/>
-                <w:color w:val="1F1F1D"/>
-                <w:sz w:val="18"/>
-                <w:szCs w:val="18"/>
-              </w:rPr>
-              <w:t xml:space="preserve">336 (95.34%)</w:t>
-            </w:r>
-          </w:p>
-        </w:tc>
-      </w:tr>
-      <w:tr>
-        <w:trPr>
-          <w:cantSplit/>
-        </w:trPr>
-        <w:tc>
-          <w:tcPr>
-            <w:tcW w:type="dxa" w:w="1900"/>
-            <w:tcBorders>
-              <w:top w:val="single" w:color="D9D8D2" w:sz="4"/>
-              <w:left w:val="single" w:color="D9D8D2" w:sz="4"/>
-              <w:bottom w:val="single" w:color="D9D8D2" w:sz="4"/>
-              <w:right w:val="single" w:color="D9D8D2" w:sz="4"/>
-            </w:tcBorders>
-            <w:shd w:fill="FFFFFF" w:color="auto" w:val="clear"/>
-            <w:tcMar>
-              <w:top w:type="dxa" w:w="60"/>
-              <w:left w:type="dxa" w:w="100"/>
-              <w:bottom w:type="dxa" w:w="60"/>
-              <w:right w:type="dxa" w:w="100"/>
-            </w:tcMar>
-          </w:tcPr>
-          <w:p>
-            <w:pPr>
-              <w:jc w:val="left"/>
-            </w:pPr>
-            <w:r>
-              <w:rPr>
-                <w:b w:val="false"/>
-                <w:bCs w:val="false"/>
-                <w:color w:val="1F1F1D"/>
-                <w:sz w:val="18"/>
-                <w:szCs w:val="18"/>
-              </w:rPr>
-              <w:t xml:space="preserve">Full ECC</w:t>
-            </w:r>
-          </w:p>
-        </w:tc>
-        <w:tc>
-          <w:tcPr>
-            <w:tcW w:type="dxa" w:w="1180"/>
-            <w:tcBorders>
-              <w:top w:val="single" w:color="D9D8D2" w:sz="4"/>
-              <w:left w:val="single" w:color="D9D8D2" w:sz="4"/>
-              <w:bottom w:val="single" w:color="D9D8D2" w:sz="4"/>
-              <w:right w:val="single" w:color="D9D8D2" w:sz="4"/>
-            </w:tcBorders>
-            <w:shd w:fill="FFFFFF" w:color="auto" w:val="clear"/>
-            <w:tcMar>
-              <w:top w:type="dxa" w:w="60"/>
-              <w:left w:type="dxa" w:w="100"/>
-              <w:bottom w:type="dxa" w:w="60"/>
-              <w:right w:type="dxa" w:w="100"/>
-            </w:tcMar>
-          </w:tcPr>
-          <w:p>
-            <w:pPr>
-              <w:jc w:val="center"/>
-            </w:pPr>
-            <w:r>
-              <w:rPr>
-                <w:b w:val="false"/>
-                <w:bCs w:val="false"/>
-                <w:color w:val="1F1F1D"/>
-                <w:sz w:val="18"/>
-                <w:szCs w:val="18"/>
-              </w:rPr>
-              <w:t xml:space="preserve">1 (23.82%)</w:t>
-            </w:r>
-          </w:p>
-        </w:tc>
-        <w:tc>
-          <w:tcPr>
-            <w:tcW w:type="dxa" w:w="1180"/>
-            <w:tcBorders>
-              <w:top w:val="single" w:color="D9D8D2" w:sz="4"/>
-              <w:left w:val="single" w:color="D9D8D2" w:sz="4"/>
-              <w:bottom w:val="single" w:color="D9D8D2" w:sz="4"/>
-              <w:right w:val="single" w:color="D9D8D2" w:sz="4"/>
-            </w:tcBorders>
-            <w:shd w:fill="FFFFFF" w:color="auto" w:val="clear"/>
-            <w:tcMar>
-              <w:top w:type="dxa" w:w="60"/>
-              <w:left w:type="dxa" w:w="100"/>
-              <w:bottom w:type="dxa" w:w="60"/>
-              <w:right w:type="dxa" w:w="100"/>
-            </w:tcMar>
-          </w:tcPr>
-          <w:p>
-            <w:pPr>
-              <w:jc w:val="center"/>
-            </w:pPr>
-            <w:r>
-              <w:rPr>
-                <w:b w:val="false"/>
-                <w:bCs w:val="false"/>
-                <w:color w:val="1F1F1D"/>
-                <w:sz w:val="18"/>
-                <w:szCs w:val="18"/>
-              </w:rPr>
-              <w:t xml:space="preserve">11 (83.29%)</w:t>
-            </w:r>
-          </w:p>
-        </w:tc>
-        <w:tc>
-          <w:tcPr>
-            <w:tcW w:type="dxa" w:w="1180"/>
-            <w:tcBorders>
-              <w:top w:val="single" w:color="D9D8D2" w:sz="4"/>
-              <w:left w:val="single" w:color="D9D8D2" w:sz="4"/>
-              <w:bottom w:val="single" w:color="D9D8D2" w:sz="4"/>
-              <w:right w:val="single" w:color="D9D8D2" w:sz="4"/>
-            </w:tcBorders>
-            <w:shd w:fill="FFFFFF" w:color="auto" w:val="clear"/>
-            <w:tcMar>
-              <w:top w:type="dxa" w:w="60"/>
-              <w:left w:type="dxa" w:w="100"/>
-              <w:bottom w:type="dxa" w:w="60"/>
-              <w:right w:type="dxa" w:w="100"/>
-            </w:tcMar>
-          </w:tcPr>
-          <w:p>
-            <w:pPr>
-              <w:jc w:val="center"/>
-            </w:pPr>
-            <w:r>
-              <w:rPr>
-                <w:b w:val="false"/>
-                <w:bCs w:val="false"/>
-                <w:color w:val="1F1F1D"/>
-                <w:sz w:val="18"/>
-                <w:szCs w:val="18"/>
-              </w:rPr>
-              <w:t xml:space="preserve">7 (13.31%)</w:t>
-            </w:r>
-          </w:p>
-        </w:tc>
-        <w:tc>
-          <w:tcPr>
-            <w:tcW w:type="dxa" w:w="1180"/>
-            <w:tcBorders>
-              <w:top w:val="single" w:color="D9D8D2" w:sz="4"/>
-              <w:left w:val="single" w:color="D9D8D2" w:sz="4"/>
-              <w:bottom w:val="single" w:color="D9D8D2" w:sz="4"/>
-              <w:right w:val="single" w:color="D9D8D2" w:sz="4"/>
-            </w:tcBorders>
-            <w:shd w:fill="FFFFFF" w:color="auto" w:val="clear"/>
-            <w:tcMar>
-              <w:top w:type="dxa" w:w="60"/>
-              <w:left w:type="dxa" w:w="100"/>
-              <w:bottom w:type="dxa" w:w="60"/>
-              <w:right w:type="dxa" w:w="100"/>
-            </w:tcMar>
-          </w:tcPr>
-          <w:p>
-            <w:pPr>
-              <w:jc w:val="center"/>
-            </w:pPr>
-            <w:r>
-              <w:rPr>
-                <w:b w:val="false"/>
-                <w:bCs w:val="false"/>
-                <w:color w:val="1F1F1D"/>
-                <w:sz w:val="18"/>
-                <w:szCs w:val="18"/>
-              </w:rPr>
-              <w:t xml:space="preserve">1 (21.85%)</w:t>
-            </w:r>
-          </w:p>
-        </w:tc>
-        <w:tc>
-          <w:tcPr>
-            <w:tcW w:type="dxa" w:w="1190"/>
-            <w:tcBorders>
-              <w:top w:val="single" w:color="D9D8D2" w:sz="4"/>
-              <w:left w:val="single" w:color="D9D8D2" w:sz="4"/>
-              <w:bottom w:val="single" w:color="D9D8D2" w:sz="4"/>
-              <w:right w:val="single" w:color="D9D8D2" w:sz="4"/>
-            </w:tcBorders>
-            <w:shd w:fill="FFFFFF" w:color="auto" w:val="clear"/>
-            <w:tcMar>
-              <w:top w:type="dxa" w:w="60"/>
-              <w:left w:type="dxa" w:w="100"/>
-              <w:bottom w:type="dxa" w:w="60"/>
-              <w:right w:type="dxa" w:w="100"/>
-            </w:tcMar>
-          </w:tcPr>
-          <w:p>
-            <w:pPr>
-              <w:jc w:val="center"/>
-            </w:pPr>
-            <w:r>
-              <w:rPr>
-                <w:b w:val="false"/>
-                <w:bCs w:val="false"/>
-                <w:color w:val="1F1F1D"/>
-                <w:sz w:val="18"/>
-                <w:szCs w:val="18"/>
-              </w:rPr>
-              <w:t xml:space="preserve">11 (83.14%)</w:t>
-            </w:r>
-          </w:p>
-        </w:tc>
-        <w:tc>
-          <w:tcPr>
-            <w:tcW w:type="dxa" w:w="1828"/>
-            <w:tcBorders>
-              <w:top w:val="single" w:color="D9D8D2" w:sz="4"/>
-              <w:left w:val="single" w:color="D9D8D2" w:sz="4"/>
-              <w:bottom w:val="single" w:color="D9D8D2" w:sz="4"/>
-              <w:right w:val="single" w:color="D9D8D2" w:sz="4"/>
-            </w:tcBorders>
-            <w:shd w:fill="FFFFFF" w:color="auto" w:val="clear"/>
-            <w:tcMar>
-              <w:top w:type="dxa" w:w="60"/>
-              <w:left w:type="dxa" w:w="100"/>
-              <w:bottom w:type="dxa" w:w="60"/>
-              <w:right w:type="dxa" w:w="100"/>
-            </w:tcMar>
-          </w:tcPr>
-          <w:p>
-            <w:pPr>
-              <w:jc w:val="center"/>
-            </w:pPr>
-            <w:r>
-              <w:rPr>
-                <w:b w:val="false"/>
-                <w:bCs w:val="false"/>
-                <w:color w:val="1F1F1D"/>
-                <w:sz w:val="18"/>
-                <w:szCs w:val="18"/>
-              </w:rPr>
-              <w:t xml:space="preserve">6 (14.14%)</w:t>
-            </w:r>
-          </w:p>
-        </w:tc>
-      </w:tr>
-      <w:tr>
-        <w:trPr>
-          <w:cantSplit/>
-        </w:trPr>
-        <w:tc>
-          <w:tcPr>
-            <w:tcW w:type="dxa" w:w="1900"/>
-            <w:tcBorders>
-              <w:top w:val="single" w:color="D9D8D2" w:sz="4"/>
-              <w:left w:val="single" w:color="D9D8D2" w:sz="4"/>
-              <w:bottom w:val="single" w:color="D9D8D2" w:sz="4"/>
-              <w:right w:val="single" w:color="D9D8D2" w:sz="4"/>
-            </w:tcBorders>
-            <w:shd w:fill="F3F6FB" w:color="auto" w:val="clear"/>
-            <w:tcMar>
-              <w:top w:type="dxa" w:w="60"/>
-              <w:left w:type="dxa" w:w="100"/>
-              <w:bottom w:type="dxa" w:w="60"/>
-              <w:right w:type="dxa" w:w="100"/>
-            </w:tcMar>
-          </w:tcPr>
-          <w:p>
-            <w:pPr>
-              <w:jc w:val="left"/>
-            </w:pPr>
-            <w:r>
-              <w:rPr>
-                <w:b w:val="false"/>
-                <w:bCs w:val="false"/>
-                <w:color w:val="1F1F1D"/>
-                <w:sz w:val="18"/>
-                <w:szCs w:val="18"/>
-              </w:rPr>
-              <w:t xml:space="preserve">Full RSA</w:t>
-            </w:r>
-          </w:p>
-        </w:tc>
-        <w:tc>
-          <w:tcPr>
-            <w:tcW w:type="dxa" w:w="1180"/>
-            <w:tcBorders>
-              <w:top w:val="single" w:color="D9D8D2" w:sz="4"/>
-              <w:left w:val="single" w:color="D9D8D2" w:sz="4"/>
-              <w:bottom w:val="single" w:color="D9D8D2" w:sz="4"/>
-              <w:right w:val="single" w:color="D9D8D2" w:sz="4"/>
-            </w:tcBorders>
-            <w:shd w:fill="F3F6FB" w:color="auto" w:val="clear"/>
-            <w:tcMar>
-              <w:top w:type="dxa" w:w="60"/>
-              <w:left w:type="dxa" w:w="100"/>
-              <w:bottom w:type="dxa" w:w="60"/>
-              <w:right w:type="dxa" w:w="100"/>
-            </w:tcMar>
-          </w:tcPr>
-          <w:p>
-            <w:pPr>
-              <w:jc w:val="center"/>
-            </w:pPr>
-            <w:r>
-              <w:rPr>
-                <w:b w:val="false"/>
-                <w:bCs w:val="false"/>
-                <w:color w:val="1F1F1D"/>
-                <w:sz w:val="18"/>
-                <w:szCs w:val="18"/>
-              </w:rPr>
-              <w:t xml:space="preserve">182 (5.47%)</w:t>
-            </w:r>
-          </w:p>
-        </w:tc>
-        <w:tc>
-          <w:tcPr>
-            <w:tcW w:type="dxa" w:w="1180"/>
-            <w:tcBorders>
-              <w:top w:val="single" w:color="D9D8D2" w:sz="4"/>
-              <w:left w:val="single" w:color="D9D8D2" w:sz="4"/>
-              <w:bottom w:val="single" w:color="D9D8D2" w:sz="4"/>
-              <w:right w:val="single" w:color="D9D8D2" w:sz="4"/>
-            </w:tcBorders>
-            <w:shd w:fill="F3F6FB" w:color="auto" w:val="clear"/>
-            <w:tcMar>
-              <w:top w:type="dxa" w:w="60"/>
-              <w:left w:type="dxa" w:w="100"/>
-              <w:bottom w:type="dxa" w:w="60"/>
-              <w:right w:type="dxa" w:w="100"/>
-            </w:tcMar>
-          </w:tcPr>
-          <w:p>
-            <w:pPr>
-              <w:jc w:val="center"/>
-            </w:pPr>
-            <w:r>
-              <w:rPr>
-                <w:b w:val="false"/>
-                <w:bCs w:val="false"/>
-                <w:color w:val="1F1F1D"/>
-                <w:sz w:val="18"/>
-                <w:szCs w:val="18"/>
-              </w:rPr>
-              <w:t xml:space="preserve">1 (2.88%)</w:t>
-            </w:r>
-          </w:p>
-        </w:tc>
-        <w:tc>
-          <w:tcPr>
-            <w:tcW w:type="dxa" w:w="1180"/>
-            <w:tcBorders>
-              <w:top w:val="single" w:color="D9D8D2" w:sz="4"/>
-              <w:left w:val="single" w:color="D9D8D2" w:sz="4"/>
-              <w:bottom w:val="single" w:color="D9D8D2" w:sz="4"/>
-              <w:right w:val="single" w:color="D9D8D2" w:sz="4"/>
-            </w:tcBorders>
-            <w:shd w:fill="F3F6FB" w:color="auto" w:val="clear"/>
-            <w:tcMar>
-              <w:top w:type="dxa" w:w="60"/>
-              <w:left w:type="dxa" w:w="100"/>
-              <w:bottom w:type="dxa" w:w="60"/>
-              <w:right w:type="dxa" w:w="100"/>
-            </w:tcMar>
-          </w:tcPr>
-          <w:p>
-            <w:pPr>
-              <w:jc w:val="center"/>
-            </w:pPr>
-            <w:r>
-              <w:rPr>
-                <w:b w:val="false"/>
-                <w:bCs w:val="false"/>
-                <w:color w:val="1F1F1D"/>
-                <w:sz w:val="18"/>
-                <w:szCs w:val="18"/>
-              </w:rPr>
-              <w:t xml:space="preserve">49 (6.01%)</w:t>
-            </w:r>
-          </w:p>
-        </w:tc>
-        <w:tc>
-          <w:tcPr>
-            <w:tcW w:type="dxa" w:w="1180"/>
-            <w:tcBorders>
-              <w:top w:val="single" w:color="D9D8D2" w:sz="4"/>
-              <w:left w:val="single" w:color="D9D8D2" w:sz="4"/>
-              <w:bottom w:val="single" w:color="D9D8D2" w:sz="4"/>
-              <w:right w:val="single" w:color="D9D8D2" w:sz="4"/>
-            </w:tcBorders>
-            <w:shd w:fill="F3F6FB" w:color="auto" w:val="clear"/>
-            <w:tcMar>
-              <w:top w:type="dxa" w:w="60"/>
-              <w:left w:type="dxa" w:w="100"/>
-              <w:bottom w:type="dxa" w:w="60"/>
-              <w:right w:type="dxa" w:w="100"/>
-            </w:tcMar>
-          </w:tcPr>
-          <w:p>
-            <w:pPr>
-              <w:jc w:val="center"/>
-            </w:pPr>
-            <w:r>
-              <w:rPr>
-                <w:b w:val="false"/>
-                <w:bCs w:val="false"/>
-                <w:color w:val="1F1F1D"/>
-                <w:sz w:val="18"/>
-                <w:szCs w:val="18"/>
-              </w:rPr>
-              <w:t xml:space="preserve">161 (5.28%)</w:t>
-            </w:r>
-          </w:p>
-        </w:tc>
-        <w:tc>
-          <w:tcPr>
-            <w:tcW w:type="dxa" w:w="1190"/>
-            <w:tcBorders>
-              <w:top w:val="single" w:color="D9D8D2" w:sz="4"/>
-              <w:left w:val="single" w:color="D9D8D2" w:sz="4"/>
-              <w:bottom w:val="single" w:color="D9D8D2" w:sz="4"/>
-              <w:right w:val="single" w:color="D9D8D2" w:sz="4"/>
-            </w:tcBorders>
-            <w:shd w:fill="F3F6FB" w:color="auto" w:val="clear"/>
-            <w:tcMar>
-              <w:top w:type="dxa" w:w="60"/>
-              <w:left w:type="dxa" w:w="100"/>
-              <w:bottom w:type="dxa" w:w="60"/>
-              <w:right w:type="dxa" w:w="100"/>
-            </w:tcMar>
-          </w:tcPr>
-          <w:p>
-            <w:pPr>
-              <w:jc w:val="center"/>
-            </w:pPr>
-            <w:r>
-              <w:rPr>
-                <w:b w:val="false"/>
-                <w:bCs w:val="false"/>
-                <w:color w:val="1F1F1D"/>
-                <w:sz w:val="18"/>
-                <w:szCs w:val="18"/>
-              </w:rPr>
-              <w:t xml:space="preserve">1 (3.38%)</w:t>
-            </w:r>
-          </w:p>
-        </w:tc>
-        <w:tc>
-          <w:tcPr>
-            <w:tcW w:type="dxa" w:w="1828"/>
-            <w:tcBorders>
-              <w:top w:val="single" w:color="D9D8D2" w:sz="4"/>
-              <w:left w:val="single" w:color="D9D8D2" w:sz="4"/>
-              <w:bottom w:val="single" w:color="D9D8D2" w:sz="4"/>
-              <w:right w:val="single" w:color="D9D8D2" w:sz="4"/>
-            </w:tcBorders>
-            <w:shd w:fill="F3F6FB" w:color="auto" w:val="clear"/>
-            <w:tcMar>
-              <w:top w:type="dxa" w:w="60"/>
-              <w:left w:type="dxa" w:w="100"/>
-              <w:bottom w:type="dxa" w:w="60"/>
-              <w:right w:type="dxa" w:w="100"/>
-            </w:tcMar>
-          </w:tcPr>
-          <w:p>
-            <w:pPr>
-              <w:jc w:val="center"/>
-            </w:pPr>
-            <w:r>
-              <w:rPr>
-                <w:b w:val="false"/>
-                <w:bCs w:val="false"/>
-                <w:color w:val="1F1F1D"/>
-                <w:sz w:val="18"/>
-                <w:szCs w:val="18"/>
-              </w:rPr>
-              <w:t xml:space="preserve">203 (4.09%)</w:t>
-            </w:r>
-          </w:p>
-        </w:tc>
-      </w:tr>
-    </w:tbl>
-    <w:p>
-      <w:pPr>
-        <w:spacing w:after="120"/>
-      </w:pPr>
-      <w:r>
-        <w:t xml:space="preserve">FND in rounds, PDR in brackets. The v8 column uses the v8-Chain code: at the centre it equals v8 unless the packets to the sink carry a public-key cost; then the energy-aware relay counts that cost and CHs relay to save it.</w:t>
-      </w:r>
-    </w:p>
-    <w:p>
-      <w:pPr>
-        <w:keepNext/>
-        <w:spacing w:after="40" w:before="120"/>
-        <w:jc w:val="center"/>
-      </w:pPr>
-      <w:r>
-        <w:drawing>
-          <wp:inline distT="0" distB="0" distL="0" distR="0">
-            <wp:extent cx="5943600" cy="2247900"/>
-            <wp:effectExtent t="0" r="0" b="0" l="0"/>
-            <wp:docPr id="1" name="s2_sec_center.png" descr="Figure 33 — FND with each security scheme, BS at the centre." title="Figure 33 — FND with each security scheme, BS at the centre."/>
-            <wp:cNvGraphicFramePr>
-              <a:graphicFrameLocks xmlns:a="http://schemas.openxmlformats.org/drawingml/2006/main" noChangeAspect="1"/>
-            </wp:cNvGraphicFramePr>
-            <a:graphic xmlns:a="http://schemas.openxmlformats.org/drawingml/2006/main">
-              <a:graphicData uri="http://schemas.openxmlformats.org/drawingml/2006/picture">
-                <pic:pic xmlns:pic="http://schemas.openxmlformats.org/drawingml/2006/picture">
-                  <pic:nvPicPr>
-                    <pic:cNvPr id="0" name="" descr=""/>
-                    <pic:cNvPicPr>
-                      <a:picLocks noChangeAspect="1" noChangeArrowheads="1"/>
-                    </pic:cNvPicPr>
-                  </pic:nvPicPr>
-                  <pic:blipFill>
-                    <a:blip r:embed="rId52" cstate="none"/>
-                    <a:srcRect/>
-                    <a:stretch>
-                      <a:fillRect/>
-                    </a:stretch>
-                  </pic:blipFill>
-                  <pic:spPr bwMode="auto">
-                    <a:xfrm>
-                      <a:off x="0" y="0"/>
-                      <a:ext cx="5943600" cy="2247900"/>
-                    </a:xfrm>
-                    <a:prstGeom prst="rect">
-                      <a:avLst/>
-                    </a:prstGeom>
-                  </pic:spPr>
-                </pic:pic>
-              </a:graphicData>
-            </a:graphic>
-          </wp:inline>
-        </w:drawing>
-      </w:r>
-    </w:p>
-    <w:p>
-      <w:pPr>
-        <w:spacing w:after="200" w:before="60"/>
-        <w:jc w:val="center"/>
-      </w:pPr>
-      <w:r>
-        <w:rPr>
-          <w:i/>
-          <w:iCs/>
-          <w:color w:val="5F5E5A"/>
-          <w:sz w:val="18"/>
-          <w:szCs w:val="18"/>
-        </w:rPr>
-        <w:t xml:space="preserve">Figure 33 — FND with each security scheme, BS at the centre.</w:t>
-      </w:r>
-    </w:p>
-    <w:p>
-      <w:pPr>
-        <w:keepNext/>
-        <w:spacing w:after="40" w:before="120"/>
-        <w:jc w:val="center"/>
-      </w:pPr>
-      <w:r>
-        <w:drawing>
-          <wp:inline distT="0" distB="0" distL="0" distR="0">
-            <wp:extent cx="5943600" cy="2247900"/>
-            <wp:effectExtent t="0" r="0" b="0" l="0"/>
-            <wp:docPr id="1" name="s2_sec_far.png" descr="Figure 34 — FND with each security scheme, BS far away." title="Figure 34 — FND with each security scheme, BS far away."/>
-            <wp:cNvGraphicFramePr>
-              <a:graphicFrameLocks xmlns:a="http://schemas.openxmlformats.org/drawingml/2006/main" noChangeAspect="1"/>
-            </wp:cNvGraphicFramePr>
-            <a:graphic xmlns:a="http://schemas.openxmlformats.org/drawingml/2006/main">
-              <a:graphicData uri="http://schemas.openxmlformats.org/drawingml/2006/picture">
-                <pic:pic xmlns:pic="http://schemas.openxmlformats.org/drawingml/2006/picture">
-                  <pic:nvPicPr>
-                    <pic:cNvPr id="0" name="" descr=""/>
-                    <pic:cNvPicPr>
-                      <a:picLocks noChangeAspect="1" noChangeArrowheads="1"/>
-                    </pic:cNvPicPr>
-                  </pic:nvPicPr>
-                  <pic:blipFill>
-                    <a:blip r:embed="rId53" cstate="none"/>
-                    <a:srcRect/>
-                    <a:stretch>
-                      <a:fillRect/>
-                    </a:stretch>
-                  </pic:blipFill>
-                  <pic:spPr bwMode="auto">
-                    <a:xfrm>
-                      <a:off x="0" y="0"/>
-                      <a:ext cx="5943600" cy="2247900"/>
-                    </a:xfrm>
-                    <a:prstGeom prst="rect">
-                      <a:avLst/>
-                    </a:prstGeom>
-                  </pic:spPr>
-                </pic:pic>
-              </a:graphicData>
-            </a:graphic>
-          </wp:inline>
-        </w:drawing>
-      </w:r>
-    </w:p>
-    <w:p>
-      <w:pPr>
-        <w:spacing w:after="200" w:before="60"/>
-        <w:jc w:val="center"/>
-      </w:pPr>
-      <w:r>
-        <w:rPr>
-          <w:i/>
-          <w:iCs/>
-          <w:color w:val="5F5E5A"/>
-          <w:sz w:val="18"/>
-          <w:szCs w:val="18"/>
-        </w:rPr>
-        <w:t xml:space="preserve">Figure 34 — FND with each security scheme, BS far away.</w:t>
-      </w:r>
-    </w:p>
-    <w:p>
-      <w:pPr>
-        <w:keepNext/>
-        <w:spacing w:after="40" w:before="120"/>
-        <w:jc w:val="center"/>
-      </w:pPr>
-      <w:r>
-        <w:drawing>
-          <wp:inline distT="0" distB="0" distL="0" distR="0">
-            <wp:extent cx="5943600" cy="2066925"/>
-            <wp:effectExtent t="0" r="0" b="0" l="0"/>
-            <wp:docPr id="1" name="s3_sec_pdr.png" descr="Figure 35 — PDR with each security scheme, BS at the centre." title="Figure 35 — PDR with each security scheme, BS at the centre."/>
-            <wp:cNvGraphicFramePr>
-              <a:graphicFrameLocks xmlns:a="http://schemas.openxmlformats.org/drawingml/2006/main" noChangeAspect="1"/>
-            </wp:cNvGraphicFramePr>
-            <a:graphic xmlns:a="http://schemas.openxmlformats.org/drawingml/2006/main">
-              <a:graphicData uri="http://schemas.openxmlformats.org/drawingml/2006/picture">
-                <pic:pic xmlns:pic="http://schemas.openxmlformats.org/drawingml/2006/picture">
-                  <pic:nvPicPr>
-                    <pic:cNvPr id="0" name="" descr=""/>
-                    <pic:cNvPicPr>
-                      <a:picLocks noChangeAspect="1" noChangeArrowheads="1"/>
-                    </pic:cNvPicPr>
-                  </pic:nvPicPr>
-                  <pic:blipFill>
-                    <a:blip r:embed="rId54" cstate="none"/>
-                    <a:srcRect/>
-                    <a:stretch>
-                      <a:fillRect/>
-                    </a:stretch>
-                  </pic:blipFill>
-                  <pic:spPr bwMode="auto">
-                    <a:xfrm>
-                      <a:off x="0" y="0"/>
-                      <a:ext cx="5943600" cy="2066925"/>
-                    </a:xfrm>
-                    <a:prstGeom prst="rect">
-                      <a:avLst/>
-                    </a:prstGeom>
-                  </pic:spPr>
-                </pic:pic>
-              </a:graphicData>
-            </a:graphic>
-          </wp:inline>
-        </w:drawing>
-      </w:r>
-    </w:p>
-    <w:p>
-      <w:pPr>
-        <w:spacing w:after="200" w:before="60"/>
-        <w:jc w:val="center"/>
-      </w:pPr>
-      <w:r>
-        <w:rPr>
-          <w:i/>
-          <w:iCs/>
-          <w:color w:val="5F5E5A"/>
-          <w:sz w:val="18"/>
-          <w:szCs w:val="18"/>
-        </w:rPr>
-        <w:t xml:space="preserve">Figure 35 — PDR with each security scheme, BS at the centre.</w:t>
-      </w:r>
-    </w:p>
-    <w:p>
-      <w:pPr>
-        <w:pStyle w:val="Heading2"/>
-      </w:pPr>
-      <w:r>
-        <w:t xml:space="preserve">9.4 What we learn</w:t>
-      </w:r>
-    </w:p>
-    <w:p>
-      <w:pPr>
-        <w:pStyle w:val="ListParagraph"/>
-        <w:numPr>
-          <w:ilvl w:val="0"/>
-          <w:numId w:val="3"/>
-        </w:numPr>
-        <w:spacing w:after="60" w:line="290"/>
-      </w:pPr>
-      <w:r>
-        <w:t xml:space="preserve">Full RSA / full ECC is impossible: FND 1 – 203 rounds and PDR 3 – 24 %. A CH cannot pay 912 mJ to decrypt one packet — the proposal was right that RSA is too heavy for the nodes.</w:t>
-      </w:r>
-    </w:p>
-    <w:p>
-      <w:pPr>
-        <w:pStyle w:val="ListParagraph"/>
-        <w:numPr>
-          <w:ilvl w:val="0"/>
-          <w:numId w:val="3"/>
-        </w:numPr>
-        <w:spacing w:after="60" w:line="290"/>
-      </w:pPr>
-      <w:r>
-        <w:t xml:space="preserve">Use the public key once, not at every CH election: authenticating every new CH with RSA/ECC cuts FND by 47 – 71 %; once per node (then symmetric credentials from the sink) costs v8 only 18 %.</w:t>
-      </w:r>
-    </w:p>
-    <w:p>
-      <w:pPr>
-        <w:pStyle w:val="ListParagraph"/>
-        <w:numPr>
-          <w:ilvl w:val="0"/>
-          <w:numId w:val="3"/>
-        </w:numPr>
-        <w:spacing w:after="60" w:line="290"/>
-      </w:pPr>
-      <w:r>
-        <w:t xml:space="preserve">Lighter than full RSA — ECC only on the packets to the sink (members keep AES): the sender only encrypts and the sink decrypts, so the network works again (PDR ≈ 96 %), but 22.3 mJ on every packet to the sink still cuts FND by about 70 % (v8 736). Protocols that send fewer packets to the sink suffer less: PEGASIS (one leader) 774; v8 lets its CHs relay to a CH nearer the sink to save ECC operations; LEACH 284. ECC is best used once per node for the key agreement.</w:t>
-      </w:r>
-    </w:p>
-    <w:p>
-      <w:pPr>
-        <w:pStyle w:val="ListParagraph"/>
-        <w:numPr>
-          <w:ilvl w:val="0"/>
-          <w:numId w:val="3"/>
-        </w:numPr>
-        <w:spacing w:after="60" w:line="290"/>
-      </w:pPr>
-      <w:r>
-        <w:t xml:space="preserve">RSA vs ECC on the node: with the sink doing the private-key work, RSA is slightly cheaper for the node (15.4 vs 22.3 mJ); ECC gives the same security with much smaller keys (160 vs 1024 bits).</w:t>
-      </w:r>
-    </w:p>
-    <w:p>
-      <w:pPr>
-        <w:pStyle w:val="ListParagraph"/>
-        <w:numPr>
-          <w:ilvl w:val="0"/>
-          <w:numId w:val="3"/>
-        </w:numPr>
-        <w:spacing w:after="60" w:line="290"/>
-      </w:pPr>
-      <w:r>
-        <w:t xml:space="preserve">v8 protects best: it re-elects CHs less often (setup every 5 rounds), so it pays fewer authentications. With the recommended hybrid: v8 2061 vs PEGASIS 1158 vs LEACH 1019 — still +49 % over LEACH without any security. Far BS: v8-Chain 1331 vs PEGASIS 1199 and LEACH 798.</w:t>
-      </w:r>
-    </w:p>
-    <w:tbl>
-      <w:tblPr>
-        <w:tblW w:type="dxa" w:w="9638"/>
-        <w:tblBorders>
-          <w:top w:val="single" w:color="auto" w:sz="4"/>
-          <w:left w:val="single" w:color="auto" w:sz="4"/>
-          <w:bottom w:val="single" w:color="auto" w:sz="4"/>
-          <w:right w:val="single" w:color="auto" w:sz="4"/>
-          <w:insideH w:val="single" w:color="auto" w:sz="4"/>
-          <w:insideV w:val="single" w:color="auto" w:sz="4"/>
-        </w:tblBorders>
-      </w:tblPr>
-      <w:tblGrid>
-        <w:gridCol w:w="9638"/>
-      </w:tblGrid>
-      <w:tr>
-        <w:tc>
-          <w:tcPr>
-            <w:tcW w:type="dxa" w:w="9638"/>
-            <w:tcBorders>
-              <w:top w:val="single" w:color="BFD4F2" w:sz="4"/>
-              <w:left w:val="single" w:color="BFD4F2" w:sz="4"/>
-              <w:bottom w:val="single" w:color="BFD4F2" w:sz="4"/>
-              <w:right w:val="single" w:color="BFD4F2" w:sz="4"/>
-            </w:tcBorders>
-            <w:shd w:fill="EEF4FC" w:color="auto" w:val="clear"/>
-            <w:tcMar>
-              <w:top w:type="dxa" w:w="120"/>
-              <w:left w:type="dxa" w:w="180"/>
-              <w:bottom w:type="dxa" w:w="120"/>
-              <w:right w:type="dxa" w:w="180"/>
-            </w:tcMar>
-          </w:tcPr>
-          <w:p>
-            <w:pPr>
-              <w:spacing w:after="80"/>
-            </w:pPr>
-            <w:r>
-              <w:rPr>
-                <w:b/>
-                <w:bCs/>
-                <w:color w:val="14213D"/>
-              </w:rPr>
-              <w:t xml:space="preserve">Recommended design</w:t>
-            </w:r>
-          </w:p>
-          <w:p>
-            <w:pPr>
-              <w:spacing w:after="60"/>
-            </w:pPr>
-            <w:r>
-              <w:t xml:space="preserve">AES + 8-byte MIC on every message; public key (RSA or ECC) once per node; the sink authenticates new CHs and gives them credentials with the symmetric key.</w:t>
-            </w:r>
-          </w:p>
-        </w:tc>
-      </w:tr>
-    </w:tbl>
-    <w:p>
-      <w:pPr>
-        <w:pStyle w:val="Heading1"/>
-      </w:pPr>
-      <w:r>
-        <w:t xml:space="preserve">10. Limitations</w:t>
+        <w:t xml:space="preserve">9. Limitations</w:t>
       </w:r>
     </w:p>
     <w:p>
@@ -26305,7 +22031,7 @@
         <w:spacing w:after="60" w:line="290"/>
       </w:pPr>
       <w:r>
-        <w:t xml:space="preserve">Security is modelled as energy cost only: public-key energy from published MCU measurements [16], AES energy assumed; attacks are not simulated.</w:t>
+        <w:t xml:space="preserve">Uniform random deployment only: 8 random topologies tested (v8 FND 2471 – 2531); uneven or clustered layouts not tested.</w:t>
       </w:r>
     </w:p>
     <w:p>
@@ -26326,7 +22052,7 @@
         <w:pStyle w:val="Heading1"/>
       </w:pPr>
       <w:r>
-        <w:t xml:space="preserve">11. Conclusion</w:t>
+        <w:t xml:space="preserve">10. Conclusion</w:t>
       </w:r>
     </w:p>
     <w:p>
@@ -26379,19 +22105,6 @@
       </w:pPr>
       <w:r>
         <w:t xml:space="preserve">v8-Chain is v8 plus an energy-aware relay, used when the BS is far: FND 1671, the best of all protocols in that case.</w:t>
-      </w:r>
-    </w:p>
-    <w:p>
-      <w:pPr>
-        <w:pStyle w:val="ListParagraph"/>
-        <w:numPr>
-          <w:ilvl w:val="0"/>
-          <w:numId w:val="3"/>
-        </w:numPr>
-        <w:spacing w:after="60" w:line="290"/>
-      </w:pPr>
-      <w:r>
-        <w:t xml:space="preserve">The hybrid cryptography of the proposal (AES + public key once) costs v8 18 % of lifetime; full RSA breaks every protocol.</w:t>
       </w:r>
     </w:p>
     <w:p>
@@ -26520,22 +22233,6 @@
       </w:pPr>
       <w:r>
         <w:t xml:space="preserve">[15]  ns-3 Network Simulator, release 3.41, https://www.nsnam.org, 2024.</w:t>
-      </w:r>
-    </w:p>
-    <w:p>
-      <w:pPr>
-        <w:spacing w:after="100"/>
-      </w:pPr>
-      <w:r>
-        <w:t xml:space="preserve">[16]  A. S. Wander, N. Gura, H. Eberle, V. Gupta, S. C. Shantz, "Energy Analysis of Public-Key Cryptography for Wireless Sensor Networks," Proc. IEEE PerCom, 2005.</w:t>
-      </w:r>
-    </w:p>
-    <w:p>
-      <w:pPr>
-        <w:spacing w:after="100"/>
-      </w:pPr>
-      <w:r>
-        <w:t xml:space="preserve">[17]  IEEE Std 802.15.4-2020, "IEEE Standard for Low-Rate Wireless Networks," 2020.</w:t>
       </w:r>
     </w:p>
     <w:sectPr>

</xml_diff>

<commit_message>
Concept illustration as the opening slide of the proposed-protocol section and in the report
Co-Authored-By: Claude Opus 5.5 <noreply@anthropic.com>
Claude-Session: https://claude.ai/code/session_019rZdtfEbJpAbmcB9G79J6K
</commit_message>
<xml_diff>
--- a/thesis-final/SOTA_Report_v8-Chain.docx
+++ b/thesis-final/SOTA_Report_v8-Chain.docx
@@ -14764,6 +14764,69 @@
     </w:p>
     <w:p>
       <w:pPr>
+        <w:keepNext/>
+        <w:spacing w:after="40" w:before="120"/>
+        <w:jc w:val="center"/>
+      </w:pPr>
+      <w:r>
+        <w:drawing>
+          <wp:inline distT="0" distB="0" distL="0" distR="0">
+            <wp:extent cx="5943600" cy="3219450"/>
+            <wp:effectExtent t="0" r="0" b="0" l="0"/>
+            <wp:docPr id="1" name="v8_concept.png" descr="Figure 20 — Concept of the proposed protocol: clusters, CH election, fusion, CH protection and delivery to the BS." title="Figure 20 — Concept of the proposed protocol: clusters, CH election, fusion, CH protection and delivery to the BS."/>
+            <wp:cNvGraphicFramePr>
+              <a:graphicFrameLocks xmlns:a="http://schemas.openxmlformats.org/drawingml/2006/main" noChangeAspect="1"/>
+            </wp:cNvGraphicFramePr>
+            <a:graphic xmlns:a="http://schemas.openxmlformats.org/drawingml/2006/main">
+              <a:graphicData uri="http://schemas.openxmlformats.org/drawingml/2006/picture">
+                <pic:pic xmlns:pic="http://schemas.openxmlformats.org/drawingml/2006/picture">
+                  <pic:nvPicPr>
+                    <pic:cNvPr id="0" name="" descr=""/>
+                    <pic:cNvPicPr>
+                      <a:picLocks noChangeAspect="1" noChangeArrowheads="1"/>
+                    </pic:cNvPicPr>
+                  </pic:nvPicPr>
+                  <pic:blipFill>
+                    <a:blip r:embed="rId36" cstate="none"/>
+                    <a:srcRect/>
+                    <a:stretch>
+                      <a:fillRect/>
+                    </a:stretch>
+                  </pic:blipFill>
+                  <pic:spPr bwMode="auto">
+                    <a:xfrm>
+                      <a:off x="0" y="0"/>
+                      <a:ext cx="5943600" cy="3219450"/>
+                    </a:xfrm>
+                    <a:prstGeom prst="rect">
+                      <a:avLst/>
+                    </a:prstGeom>
+                  </pic:spPr>
+                </pic:pic>
+              </a:graphicData>
+            </a:graphic>
+          </wp:inline>
+        </w:drawing>
+      </w:r>
+    </w:p>
+    <w:p>
+      <w:pPr>
+        <w:spacing w:after="200" w:before="60"/>
+        <w:jc w:val="center"/>
+      </w:pPr>
+      <w:r>
+        <w:rPr>
+          <w:i/>
+          <w:iCs/>
+          <w:color w:val="5F5E5A"/>
+          <w:sz w:val="18"/>
+          <w:szCs w:val="18"/>
+        </w:rPr>
+        <w:t xml:space="preserve">Figure 20 — Concept of the proposed protocol: clusters, CH election, fusion, CH protection and delivery to the BS.</w:t>
+      </w:r>
+    </w:p>
+    <w:p>
+      <w:pPr>
         <w:spacing w:after="120" w:line="300"/>
       </w:pPr>
       <w:r>
@@ -17887,7 +17950,7 @@
           <wp:inline distT="0" distB="0" distL="0" distR="0">
             <wp:extent cx="5762625" cy="2562225"/>
             <wp:effectExtent t="0" r="0" b="0" l="0"/>
-            <wp:docPr id="1" name="f4_evolution.png" descr="Figure 20 — First node death of every version." title="Figure 20 — First node death of every version."/>
+            <wp:docPr id="1" name="f4_evolution.png" descr="Figure 21 — First node death of every version." title="Figure 21 — First node death of every version."/>
             <wp:cNvGraphicFramePr>
               <a:graphicFrameLocks xmlns:a="http://schemas.openxmlformats.org/drawingml/2006/main" noChangeAspect="1"/>
             </wp:cNvGraphicFramePr>
@@ -17901,7 +17964,7 @@
                     </pic:cNvPicPr>
                   </pic:nvPicPr>
                   <pic:blipFill>
-                    <a:blip r:embed="rId36" cstate="none"/>
+                    <a:blip r:embed="rId37" cstate="none"/>
                     <a:srcRect/>
                     <a:stretch>
                       <a:fillRect/>
@@ -17936,7 +17999,7 @@
           <w:sz w:val="18"/>
           <w:szCs w:val="18"/>
         </w:rPr>
-        <w:t xml:space="preserve">Figure 20 — First node death of every version.</w:t>
+        <w:t xml:space="preserve">Figure 21 — First node death of every version.</w:t>
       </w:r>
     </w:p>
     <w:p>
@@ -17950,7 +18013,7 @@
           <wp:inline distT="0" distB="0" distL="0" distR="0">
             <wp:extent cx="5762625" cy="2219325"/>
             <wp:effectExtent t="0" r="0" b="0" l="0"/>
-            <wp:docPr id="1" name="pdr_versions.png" descr="Figure 21 — PDR of every version." title="Figure 21 — PDR of every version."/>
+            <wp:docPr id="1" name="pdr_versions.png" descr="Figure 22 — PDR of every version." title="Figure 22 — PDR of every version."/>
             <wp:cNvGraphicFramePr>
               <a:graphicFrameLocks xmlns:a="http://schemas.openxmlformats.org/drawingml/2006/main" noChangeAspect="1"/>
             </wp:cNvGraphicFramePr>
@@ -17964,7 +18027,7 @@
                     </pic:cNvPicPr>
                   </pic:nvPicPr>
                   <pic:blipFill>
-                    <a:blip r:embed="rId37" cstate="none"/>
+                    <a:blip r:embed="rId38" cstate="none"/>
                     <a:srcRect/>
                     <a:stretch>
                       <a:fillRect/>
@@ -17999,7 +18062,7 @@
           <w:sz w:val="18"/>
           <w:szCs w:val="18"/>
         </w:rPr>
-        <w:t xml:space="preserve">Figure 21 — PDR of every version.</w:t>
+        <w:t xml:space="preserve">Figure 22 — PDR of every version.</w:t>
       </w:r>
     </w:p>
     <w:p>
@@ -18040,7 +18103,7 @@
                     </pic:cNvPicPr>
                   </pic:nvPicPr>
                   <pic:blipFill>
-                    <a:blip r:embed="rId38" cstate="none"/>
+                    <a:blip r:embed="rId39" cstate="none"/>
                     <a:srcRect/>
                     <a:stretch>
                       <a:fillRect/>
@@ -18126,7 +18189,7 @@
                     </pic:cNvPicPr>
                   </pic:nvPicPr>
                   <pic:blipFill>
-                    <a:blip r:embed="rId39" cstate="none"/>
+                    <a:blip r:embed="rId40" cstate="none"/>
                     <a:srcRect/>
                     <a:stretch>
                       <a:fillRect/>
@@ -18159,7 +18222,7 @@
           <wp:inline distT="0" distB="0" distL="0" distR="0">
             <wp:extent cx="5305425" cy="2486025"/>
             <wp:effectExtent t="0" r="0" b="0" l="0"/>
-            <wp:docPr id="1" name="f5_ablation.png" descr="Figure 22 — Ablation: I4 and I5 carry the gain." title="Figure 22 — Ablation: I4 and I5 carry the gain."/>
+            <wp:docPr id="1" name="f5_ablation.png" descr="Figure 23 — Ablation: I4 and I5 carry the gain." title="Figure 23 — Ablation: I4 and I5 carry the gain."/>
             <wp:cNvGraphicFramePr>
               <a:graphicFrameLocks xmlns:a="http://schemas.openxmlformats.org/drawingml/2006/main" noChangeAspect="1"/>
             </wp:cNvGraphicFramePr>
@@ -18173,7 +18236,7 @@
                     </pic:cNvPicPr>
                   </pic:nvPicPr>
                   <pic:blipFill>
-                    <a:blip r:embed="rId40" cstate="none"/>
+                    <a:blip r:embed="rId41" cstate="none"/>
                     <a:srcRect/>
                     <a:stretch>
                       <a:fillRect/>
@@ -18208,7 +18271,7 @@
           <w:sz w:val="18"/>
           <w:szCs w:val="18"/>
         </w:rPr>
-        <w:t xml:space="preserve">Figure 22 — Ablation: I4 and I5 carry the gain.</w:t>
+        <w:t xml:space="preserve">Figure 23 — Ablation: I4 and I5 carry the gain.</w:t>
       </w:r>
     </w:p>
     <w:p>
@@ -18222,7 +18285,7 @@
           <wp:inline distT="0" distB="0" distL="0" distR="0">
             <wp:extent cx="5762625" cy="2209800"/>
             <wp:effectExtent t="0" r="0" b="0" l="0"/>
-            <wp:docPr id="1" name="f6_routing.png" descr="Figure 23 — CH → BS routing: far BS +16 % with the energy-aware relay (1406 → 1626); no change at the centre." title="Figure 23 — CH → BS routing: far BS +16 % with the energy-aware relay (1406 → 1626); no change at the centre."/>
+            <wp:docPr id="1" name="f6_routing.png" descr="Figure 24 — CH → BS routing: far BS +16 % with the energy-aware relay (1406 → 1626); no change at the centre." title="Figure 24 — CH → BS routing: far BS +16 % with the energy-aware relay (1406 → 1626); no change at the centre."/>
             <wp:cNvGraphicFramePr>
               <a:graphicFrameLocks xmlns:a="http://schemas.openxmlformats.org/drawingml/2006/main" noChangeAspect="1"/>
             </wp:cNvGraphicFramePr>
@@ -18236,7 +18299,7 @@
                     </pic:cNvPicPr>
                   </pic:nvPicPr>
                   <pic:blipFill>
-                    <a:blip r:embed="rId41" cstate="none"/>
+                    <a:blip r:embed="rId42" cstate="none"/>
                     <a:srcRect/>
                     <a:stretch>
                       <a:fillRect/>
@@ -18271,7 +18334,7 @@
           <w:sz w:val="18"/>
           <w:szCs w:val="18"/>
         </w:rPr>
-        <w:t xml:space="preserve">Figure 23 — CH → BS routing: far BS +16 % with the energy-aware relay (1406 → 1626); no change at the centre.</w:t>
+        <w:t xml:space="preserve">Figure 24 — CH → BS routing: far BS +16 % with the energy-aware relay (1406 → 1626); no change at the centre.</w:t>
       </w:r>
     </w:p>
     <w:p>
@@ -18285,7 +18348,7 @@
           <wp:inline distT="0" distB="0" distL="0" distR="0">
             <wp:extent cx="5943600" cy="3352800"/>
             <wp:effectExtent t="0" r="0" b="0" l="0"/>
-            <wp:docPr id="1" name="f12_architecture.png" descr="Figure 24 — Architecture of v8 (the relay box is active only in v8-Chain)." title="Figure 24 — Architecture of v8 (the relay box is active only in v8-Chain)."/>
+            <wp:docPr id="1" name="f12_architecture.png" descr="Figure 25 — Architecture of v8 (the relay box is active only in v8-Chain)." title="Figure 25 — Architecture of v8 (the relay box is active only in v8-Chain)."/>
             <wp:cNvGraphicFramePr>
               <a:graphicFrameLocks xmlns:a="http://schemas.openxmlformats.org/drawingml/2006/main" noChangeAspect="1"/>
             </wp:cNvGraphicFramePr>
@@ -18299,7 +18362,7 @@
                     </pic:cNvPicPr>
                   </pic:nvPicPr>
                   <pic:blipFill>
-                    <a:blip r:embed="rId42" cstate="none"/>
+                    <a:blip r:embed="rId43" cstate="none"/>
                     <a:srcRect/>
                     <a:stretch>
                       <a:fillRect/>
@@ -18334,7 +18397,7 @@
           <w:sz w:val="18"/>
           <w:szCs w:val="18"/>
         </w:rPr>
-        <w:t xml:space="preserve">Figure 24 — Architecture of v8 (the relay box is active only in v8-Chain).</w:t>
+        <w:t xml:space="preserve">Figure 25 — Architecture of v8 (the relay box is active only in v8-Chain).</w:t>
       </w:r>
     </w:p>
     <w:p>
@@ -19737,7 +19800,7 @@
           <wp:inline distT="0" distB="0" distL="0" distR="0">
             <wp:extent cx="5943600" cy="2895600"/>
             <wp:effectExtent t="0" r="0" b="0" l="0"/>
-            <wp:docPr id="1" name="f1_lifetime_families.png" descr="Figure 25 — Lifetime of the best version of every family." title="Figure 25 — Lifetime of the best version of every family."/>
+            <wp:docPr id="1" name="f1_lifetime_families.png" descr="Figure 26 — Lifetime of the best version of every family." title="Figure 26 — Lifetime of the best version of every family."/>
             <wp:cNvGraphicFramePr>
               <a:graphicFrameLocks xmlns:a="http://schemas.openxmlformats.org/drawingml/2006/main" noChangeAspect="1"/>
             </wp:cNvGraphicFramePr>
@@ -19751,7 +19814,7 @@
                     </pic:cNvPicPr>
                   </pic:nvPicPr>
                   <pic:blipFill>
-                    <a:blip r:embed="rId43" cstate="none"/>
+                    <a:blip r:embed="rId44" cstate="none"/>
                     <a:srcRect/>
                     <a:stretch>
                       <a:fillRect/>
@@ -19786,7 +19849,7 @@
           <w:sz w:val="18"/>
           <w:szCs w:val="18"/>
         </w:rPr>
-        <w:t xml:space="preserve">Figure 25 — Lifetime of the best version of every family.</w:t>
+        <w:t xml:space="preserve">Figure 26 — Lifetime of the best version of every family.</w:t>
       </w:r>
     </w:p>
     <w:p>
@@ -19800,7 +19863,7 @@
           <wp:inline distT="0" distB="0" distL="0" distR="0">
             <wp:extent cx="5305425" cy="2390775"/>
             <wp:effectExtent t="0" r="0" b="0" l="0"/>
-            <wp:docPr id="1" name="c1_fnd_rank.png" descr="Figure 26 — First node death ranking and the v8 gain." title="Figure 26 — First node death ranking and the v8 gain."/>
+            <wp:docPr id="1" name="c1_fnd_rank.png" descr="Figure 27 — First node death ranking and the v8 gain." title="Figure 27 — First node death ranking and the v8 gain."/>
             <wp:cNvGraphicFramePr>
               <a:graphicFrameLocks xmlns:a="http://schemas.openxmlformats.org/drawingml/2006/main" noChangeAspect="1"/>
             </wp:cNvGraphicFramePr>
@@ -19814,7 +19877,7 @@
                     </pic:cNvPicPr>
                   </pic:nvPicPr>
                   <pic:blipFill>
-                    <a:blip r:embed="rId44" cstate="none"/>
+                    <a:blip r:embed="rId45" cstate="none"/>
                     <a:srcRect/>
                     <a:stretch>
                       <a:fillRect/>
@@ -19849,7 +19912,7 @@
           <w:sz w:val="18"/>
           <w:szCs w:val="18"/>
         </w:rPr>
-        <w:t xml:space="preserve">Figure 26 — First node death ranking and the v8 gain.</w:t>
+        <w:t xml:space="preserve">Figure 27 — First node death ranking and the v8 gain.</w:t>
       </w:r>
     </w:p>
     <w:p>
@@ -19863,7 +19926,7 @@
           <wp:inline distT="0" distB="0" distL="0" distR="0">
             <wp:extent cx="5486400" cy="2838450"/>
             <wp:effectExtent t="0" r="0" b="0" l="0"/>
-            <wp:docPr id="1" name="f3_alive_curves.png" descr="Figure 27 — Alive nodes per round." title="Figure 27 — Alive nodes per round."/>
+            <wp:docPr id="1" name="f3_alive_curves.png" descr="Figure 28 — Alive nodes per round." title="Figure 28 — Alive nodes per round."/>
             <wp:cNvGraphicFramePr>
               <a:graphicFrameLocks xmlns:a="http://schemas.openxmlformats.org/drawingml/2006/main" noChangeAspect="1"/>
             </wp:cNvGraphicFramePr>
@@ -19877,7 +19940,7 @@
                     </pic:cNvPicPr>
                   </pic:nvPicPr>
                   <pic:blipFill>
-                    <a:blip r:embed="rId45" cstate="none"/>
+                    <a:blip r:embed="rId46" cstate="none"/>
                     <a:srcRect/>
                     <a:stretch>
                       <a:fillRect/>
@@ -19912,7 +19975,7 @@
           <w:sz w:val="18"/>
           <w:szCs w:val="18"/>
         </w:rPr>
-        <w:t xml:space="preserve">Figure 27 — Alive nodes per round.</w:t>
+        <w:t xml:space="preserve">Figure 28 — Alive nodes per round.</w:t>
       </w:r>
     </w:p>
     <w:p>
@@ -19926,7 +19989,7 @@
           <wp:inline distT="0" distB="0" distL="0" distR="0">
             <wp:extent cx="5305425" cy="2400300"/>
             <wp:effectExtent t="0" r="0" b="0" l="0"/>
-            <wp:docPr id="1" name="f7_robustness.png" descr="Figure 28 — 8 random topologies: v8 FND 2401 – 2481." title="Figure 28 — 8 random topologies: v8 FND 2401 – 2481."/>
+            <wp:docPr id="1" name="f7_robustness.png" descr="Figure 29 — 8 random topologies: v8 FND 2401 – 2481." title="Figure 29 — 8 random topologies: v8 FND 2401 – 2481."/>
             <wp:cNvGraphicFramePr>
               <a:graphicFrameLocks xmlns:a="http://schemas.openxmlformats.org/drawingml/2006/main" noChangeAspect="1"/>
             </wp:cNvGraphicFramePr>
@@ -19940,7 +20003,7 @@
                     </pic:cNvPicPr>
                   </pic:nvPicPr>
                   <pic:blipFill>
-                    <a:blip r:embed="rId46" cstate="none"/>
+                    <a:blip r:embed="rId47" cstate="none"/>
                     <a:srcRect/>
                     <a:stretch>
                       <a:fillRect/>
@@ -19975,7 +20038,7 @@
           <w:sz w:val="18"/>
           <w:szCs w:val="18"/>
         </w:rPr>
-        <w:t xml:space="preserve">Figure 28 — 8 random topologies: v8 FND 2401 – 2481.</w:t>
+        <w:t xml:space="preserve">Figure 29 — 8 random topologies: v8 FND 2401 – 2481.</w:t>
       </w:r>
     </w:p>
     <w:p>
@@ -21846,7 +21909,7 @@
           <wp:inline distT="0" distB="0" distL="0" distR="0">
             <wp:extent cx="5943600" cy="2324100"/>
             <wp:effectExtent t="0" r="0" b="0" l="0"/>
-            <wp:docPr id="1" name="far_fnd.png" descr="Figure 29 — FND with the BS at the centre (grey) and far away (colour)." title="Figure 29 — FND with the BS at the centre (grey) and far away (colour)."/>
+            <wp:docPr id="1" name="far_fnd.png" descr="Figure 30 — FND with the BS at the centre (grey) and far away (colour)." title="Figure 30 — FND with the BS at the centre (grey) and far away (colour)."/>
             <wp:cNvGraphicFramePr>
               <a:graphicFrameLocks xmlns:a="http://schemas.openxmlformats.org/drawingml/2006/main" noChangeAspect="1"/>
             </wp:cNvGraphicFramePr>
@@ -21860,7 +21923,7 @@
                     </pic:cNvPicPr>
                   </pic:nvPicPr>
                   <pic:blipFill>
-                    <a:blip r:embed="rId47" cstate="none"/>
+                    <a:blip r:embed="rId48" cstate="none"/>
                     <a:srcRect/>
                     <a:stretch>
                       <a:fillRect/>
@@ -21895,7 +21958,7 @@
           <w:sz w:val="18"/>
           <w:szCs w:val="18"/>
         </w:rPr>
-        <w:t xml:space="preserve">Figure 29 — FND with the BS at the centre (grey) and far away (colour).</w:t>
+        <w:t xml:space="preserve">Figure 30 — FND with the BS at the centre (grey) and far away (colour).</w:t>
       </w:r>
     </w:p>
     <w:p>
@@ -21909,7 +21972,7 @@
           <wp:inline distT="0" distB="0" distL="0" distR="0">
             <wp:extent cx="5305425" cy="2390775"/>
             <wp:effectExtent t="0" r="0" b="0" l="0"/>
-            <wp:docPr id="1" name="far_rank.png" descr="Figure 30 — FND ranking with the BS far away." title="Figure 30 — FND ranking with the BS far away."/>
+            <wp:docPr id="1" name="far_rank.png" descr="Figure 31 — FND ranking with the BS far away." title="Figure 31 — FND ranking with the BS far away."/>
             <wp:cNvGraphicFramePr>
               <a:graphicFrameLocks xmlns:a="http://schemas.openxmlformats.org/drawingml/2006/main" noChangeAspect="1"/>
             </wp:cNvGraphicFramePr>
@@ -21923,7 +21986,7 @@
                     </pic:cNvPicPr>
                   </pic:nvPicPr>
                   <pic:blipFill>
-                    <a:blip r:embed="rId48" cstate="none"/>
+                    <a:blip r:embed="rId49" cstate="none"/>
                     <a:srcRect/>
                     <a:stretch>
                       <a:fillRect/>
@@ -21958,7 +22021,7 @@
           <w:sz w:val="18"/>
           <w:szCs w:val="18"/>
         </w:rPr>
-        <w:t xml:space="preserve">Figure 30 — FND ranking with the BS far away.</w:t>
+        <w:t xml:space="preserve">Figure 31 — FND ranking with the BS far away.</w:t>
       </w:r>
     </w:p>
     <w:p>

</xml_diff>